<commit_message>
Expand Kecacatan notes with full per-organ/per-bidang applicable detail
Poin 5 (Interpretasi + Grading) was too condensed for exam use - added AMA per-chapter (Bab 4-17) quick-reference with key factors, class tables, and worked examples, plus the complete Permenaker per-bidang (9 bidang) diagnostic/grading tables that were previously only cross-referenced to the archive files.

Co-Authored-By: Claude Sonnet 5 <noreply@anthropic.com>
Claude-Session: https://claude.ai/code/session_016TPfA8nc6cEpZ7VJgPVf39
</commit_message>
<xml_diff>
--- a/PPDS Okupasi Board Notes/Catatan Kecacatan (AMA + Permenaker) Gabungan.docx
+++ b/PPDS Okupasi Board Notes/Catatan Kecacatan (AMA + Permenaker) Gabungan.docx
@@ -1396,7 +1396,7 @@
         <w:pStyle w:val="Heading2"/>
       </w:pPr>
       <w:r>
-        <w:t>AMA — Metodologi Diagnosis-Based Impairment (DBI)</w:t>
+        <w:t>5.1 AMA — Mekanisme Umum Diagnosis-Based Impairment (DBI)</w:t>
       </w:r>
     </w:p>
     <w:p>
@@ -1415,7 +1415,16 @@
         <w:t>Key Factor</w:t>
       </w:r>
       <w:r>
-        <w:t xml:space="preserve"> (diagnosis spesifik) → menentukan </w:t>
+        <w:t xml:space="preserve"> (diagnosis spesifik, atau </w:t>
+      </w:r>
+      <w:r>
+        <w:rPr>
+          <w:i/>
+        </w:rPr>
+        <w:t>Objective Test Results</w:t>
+      </w:r>
+      <w:r>
+        <w:t xml:space="preserve"> untuk organ dengan alat ukur tervalidasi kuat — jantung/paru/ginjal) → menentukan </w:t>
       </w:r>
       <w:r>
         <w:rPr>
@@ -1582,10 +1591,43 @@
     </w:p>
     <w:p>
       <w:pPr>
-        <w:pStyle w:val="Heading2"/>
-      </w:pPr>
-      <w:r>
-        <w:t>Permenaker — Sistem Grading per Bidang (masing-masing organ punya sistemnya sendiri)</w:t>
+        <w:pStyle w:val="ListNumber"/>
+      </w:pPr>
+      <w:r>
+        <w:rPr>
+          <w:b/>
+        </w:rPr>
+        <w:t>Burden of Treatment Compliance (BOTC)</w:t>
+      </w:r>
+      <w:r>
+        <w:t xml:space="preserve">: kepatuhan regimen terapi kompleks itu sendiri membebani ADL. Di bab lain = grade modifier tambahan opsional (ditambahkan </w:t>
+      </w:r>
+      <w:r>
+        <w:rPr>
+          <w:b/>
+        </w:rPr>
+        <w:t>setelah</w:t>
+      </w:r>
+      <w:r>
+        <w:t xml:space="preserve"> Net Adjustment selesai, +0-10%, umumnya +2-3%); di </w:t>
+      </w:r>
+      <w:r>
+        <w:rPr>
+          <w:b/>
+        </w:rPr>
+        <w:t>Bab 10 (Endokrin)</w:t>
+      </w:r>
+      <w:r>
+        <w:t xml:space="preserve"> BOTC naik level jadi </w:t>
+      </w:r>
+      <w:r>
+        <w:rPr>
+          <w:b/>
+        </w:rPr>
+        <w:t>key factor pengganti Physical Exam</w:t>
+      </w:r>
+      <w:r>
+        <w:t>.</w:t>
       </w:r>
     </w:p>
     <w:p>
@@ -1593,7 +1635,2551 @@
         <w:rPr>
           <w:b/>
         </w:rPr>
-        <w:t>Neurologi — Manual Muscle Test (MMT):</w:t>
+        <w:t>Poin ujian lintas-bab</w:t>
+      </w:r>
+      <w:r>
+        <w:t xml:space="preserve">: key factor </w:t>
+      </w:r>
+      <w:r>
+        <w:rPr>
+          <w:b/>
+        </w:rPr>
+        <w:t>tidak seragam</w:t>
+      </w:r>
+      <w:r>
+        <w:t xml:space="preserve"> antar bab — Objective Test (Bab 4 Jantung, 5 Paru) vs History (Bab 6 Digestif, 7 Urinaria, 8 Kulit, 9 Hematopoietik sebagian). Rentang persentase kelas </w:t>
+      </w:r>
+      <w:r>
+        <w:rPr>
+          <w:b/>
+        </w:rPr>
+        <w:t>juga tidak universal</w:t>
+      </w:r>
+      <w:r>
+        <w:t xml:space="preserve"> — selalu cek grid spesifik tiap bab, jangan menghafal satu pola untuk semua organ.</w:t>
+      </w:r>
+    </w:p>
+    <w:p>
+      <w:pPr>
+        <w:pStyle w:val="Heading2"/>
+      </w:pPr>
+      <w:r>
+        <w:t>5.2 AMA — Aplikasi per Bab Organ (Bab 4–17), Ringkas &amp; Siap Pakai</w:t>
+      </w:r>
+    </w:p>
+    <w:p>
+      <w:r>
+        <w:rPr>
+          <w:b/>
+        </w:rPr>
+        <w:t>Bab 4 — Kardiovaskular</w:t>
+      </w:r>
+      <w:r>
+        <w:t xml:space="preserve"> (key factor = </w:t>
+      </w:r>
+      <w:r>
+        <w:rPr>
+          <w:i/>
+        </w:rPr>
+        <w:t>Objective Test Results</w:t>
+      </w:r>
+      <w:r>
+        <w:t xml:space="preserve">): 8 subkategori (Valvular, PJK, Kardiomiopati, Perikardial, Disritmia, Hipertensi, Vaskuler perifer, Arteri pulmonal) memakai grid </w:t>
+      </w:r>
+      <w:r>
+        <w:rPr>
+          <w:b/>
+        </w:rPr>
+        <w:t>hampir identik</w:t>
+      </w:r>
+      <w:r>
+        <w:t>:</w:t>
+      </w:r>
+    </w:p>
+    <w:tbl>
+      <w:tblPr>
+        <w:tblStyle w:val="TableGrid"/>
+        <w:tblW w:type="auto" w:w="0"/>
+        <w:tblLayout w:type="autofit"/>
+        <w:tblLook w:firstColumn="1" w:firstRow="1" w:lastColumn="0" w:lastRow="0" w:noHBand="0" w:noVBand="1" w:val="04A0"/>
+      </w:tblPr>
+      <w:tblGrid>
+        <w:gridCol w:w="2880"/>
+        <w:gridCol w:w="2880"/>
+        <w:gridCol w:w="2880"/>
+      </w:tblGrid>
+      <w:tr>
+        <w:tc>
+          <w:tcPr>
+            <w:tcW w:type="dxa" w:w="2880"/>
+            <w:shd w:val="clear" w:color="auto" w:fill="1F4E5F"/>
+          </w:tcPr>
+          <w:p>
+            <w:r>
+              <w:rPr>
+                <w:b/>
+                <w:color w:val="FFFFFF"/>
+                <w:sz w:val="18"/>
+              </w:rPr>
+              <w:t>Kelas</w:t>
+            </w:r>
+          </w:p>
+        </w:tc>
+        <w:tc>
+          <w:tcPr>
+            <w:tcW w:type="dxa" w:w="2880"/>
+            <w:shd w:val="clear" w:color="auto" w:fill="1F4E5F"/>
+          </w:tcPr>
+          <w:p>
+            <w:r>
+              <w:rPr>
+                <w:b/>
+                <w:color w:val="FFFFFF"/>
+                <w:sz w:val="18"/>
+              </w:rPr>
+              <w:t>Rentang WPI</w:t>
+            </w:r>
+          </w:p>
+        </w:tc>
+        <w:tc>
+          <w:tcPr>
+            <w:tcW w:type="dxa" w:w="2880"/>
+            <w:shd w:val="clear" w:color="auto" w:fill="1F4E5F"/>
+          </w:tcPr>
+          <w:p>
+            <w:r>
+              <w:rPr>
+                <w:b/>
+                <w:color w:val="FFFFFF"/>
+                <w:sz w:val="18"/>
+              </w:rPr>
+              <w:t>Grade A–E</w:t>
+            </w:r>
+          </w:p>
+        </w:tc>
+      </w:tr>
+      <w:tr>
+        <w:tc>
+          <w:tcPr>
+            <w:tcW w:type="dxa" w:w="2880"/>
+          </w:tcPr>
+          <w:p>
+            <w:r>
+              <w:rPr>
+                <w:sz w:val="18"/>
+              </w:rPr>
+              <w:t>0</w:t>
+            </w:r>
+          </w:p>
+        </w:tc>
+        <w:tc>
+          <w:tcPr>
+            <w:tcW w:type="dxa" w:w="2880"/>
+          </w:tcPr>
+          <w:p>
+            <w:r>
+              <w:rPr>
+                <w:sz w:val="18"/>
+              </w:rPr>
+              <w:t>0%</w:t>
+            </w:r>
+          </w:p>
+        </w:tc>
+        <w:tc>
+          <w:tcPr>
+            <w:tcW w:type="dxa" w:w="2880"/>
+          </w:tcPr>
+          <w:p>
+            <w:r>
+              <w:rPr>
+                <w:sz w:val="18"/>
+              </w:rPr>
+              <w:t>—</w:t>
+            </w:r>
+          </w:p>
+        </w:tc>
+      </w:tr>
+      <w:tr>
+        <w:tc>
+          <w:tcPr>
+            <w:tcW w:type="dxa" w:w="2880"/>
+          </w:tcPr>
+          <w:p>
+            <w:r>
+              <w:rPr>
+                <w:sz w:val="18"/>
+              </w:rPr>
+              <w:t>1 (Minimal)</w:t>
+            </w:r>
+          </w:p>
+        </w:tc>
+        <w:tc>
+          <w:tcPr>
+            <w:tcW w:type="dxa" w:w="2880"/>
+          </w:tcPr>
+          <w:p>
+            <w:r>
+              <w:rPr>
+                <w:sz w:val="18"/>
+              </w:rPr>
+              <w:t>2–10%</w:t>
+            </w:r>
+          </w:p>
+        </w:tc>
+        <w:tc>
+          <w:tcPr>
+            <w:tcW w:type="dxa" w:w="2880"/>
+          </w:tcPr>
+          <w:p>
+            <w:r>
+              <w:rPr>
+                <w:sz w:val="18"/>
+              </w:rPr>
+              <w:t>2, 4, 6, 8, 10</w:t>
+            </w:r>
+          </w:p>
+        </w:tc>
+      </w:tr>
+      <w:tr>
+        <w:tc>
+          <w:tcPr>
+            <w:tcW w:type="dxa" w:w="2880"/>
+          </w:tcPr>
+          <w:p>
+            <w:r>
+              <w:rPr>
+                <w:sz w:val="18"/>
+              </w:rPr>
+              <w:t>2 (Mild)</w:t>
+            </w:r>
+          </w:p>
+        </w:tc>
+        <w:tc>
+          <w:tcPr>
+            <w:tcW w:type="dxa" w:w="2880"/>
+          </w:tcPr>
+          <w:p>
+            <w:r>
+              <w:rPr>
+                <w:sz w:val="18"/>
+              </w:rPr>
+              <w:t>11–23%</w:t>
+            </w:r>
+          </w:p>
+        </w:tc>
+        <w:tc>
+          <w:tcPr>
+            <w:tcW w:type="dxa" w:w="2880"/>
+          </w:tcPr>
+          <w:p>
+            <w:r>
+              <w:rPr>
+                <w:sz w:val="18"/>
+              </w:rPr>
+              <w:t>11, 14, 17, 20, 23</w:t>
+            </w:r>
+          </w:p>
+        </w:tc>
+      </w:tr>
+      <w:tr>
+        <w:tc>
+          <w:tcPr>
+            <w:tcW w:type="dxa" w:w="2880"/>
+          </w:tcPr>
+          <w:p>
+            <w:r>
+              <w:rPr>
+                <w:sz w:val="18"/>
+              </w:rPr>
+              <w:t>3 (Moderate)</w:t>
+            </w:r>
+          </w:p>
+        </w:tc>
+        <w:tc>
+          <w:tcPr>
+            <w:tcW w:type="dxa" w:w="2880"/>
+          </w:tcPr>
+          <w:p>
+            <w:r>
+              <w:rPr>
+                <w:sz w:val="18"/>
+              </w:rPr>
+              <w:t>24–40%</w:t>
+            </w:r>
+          </w:p>
+        </w:tc>
+        <w:tc>
+          <w:tcPr>
+            <w:tcW w:type="dxa" w:w="2880"/>
+          </w:tcPr>
+          <w:p>
+            <w:r>
+              <w:rPr>
+                <w:sz w:val="18"/>
+              </w:rPr>
+              <w:t>24, 28, 32, 36, 40</w:t>
+            </w:r>
+          </w:p>
+        </w:tc>
+      </w:tr>
+      <w:tr>
+        <w:tc>
+          <w:tcPr>
+            <w:tcW w:type="dxa" w:w="2880"/>
+          </w:tcPr>
+          <w:p>
+            <w:r>
+              <w:rPr>
+                <w:sz w:val="18"/>
+              </w:rPr>
+              <w:t>4 (Severe)</w:t>
+            </w:r>
+          </w:p>
+        </w:tc>
+        <w:tc>
+          <w:tcPr>
+            <w:tcW w:type="dxa" w:w="2880"/>
+          </w:tcPr>
+          <w:p>
+            <w:r>
+              <w:rPr>
+                <w:sz w:val="18"/>
+              </w:rPr>
+              <w:t>45–65%</w:t>
+            </w:r>
+          </w:p>
+        </w:tc>
+        <w:tc>
+          <w:tcPr>
+            <w:tcW w:type="dxa" w:w="2880"/>
+          </w:tcPr>
+          <w:p>
+            <w:r>
+              <w:rPr>
+                <w:sz w:val="18"/>
+              </w:rPr>
+              <w:t>45, 50, 55, 60, 65</w:t>
+            </w:r>
+          </w:p>
+        </w:tc>
+      </w:tr>
+    </w:tbl>
+    <w:p/>
+    <w:p>
+      <w:r>
+        <w:t xml:space="preserve">Alat ukur objektif wajib: </w:t>
+      </w:r>
+      <w:r>
+        <w:rPr>
+          <w:b/>
+        </w:rPr>
+        <w:t>NYHA Class I-IV</w:t>
+      </w:r>
+      <w:r>
+        <w:t xml:space="preserve"> (fungsional), </w:t>
+      </w:r>
+      <w:r>
+        <w:rPr>
+          <w:b/>
+        </w:rPr>
+        <w:t>METs</w:t>
+      </w:r>
+      <w:r>
+        <w:t xml:space="preserve"> (≥7 = Kelas I/Normal; &lt;2 = Kelas IV), </w:t>
+      </w:r>
+      <w:r>
+        <w:rPr>
+          <w:b/>
+        </w:rPr>
+        <w:t>LVEF</w:t>
+      </w:r>
+      <w:r>
+        <w:t xml:space="preserve"> (normal &gt;50%; ringan 41-50%; sedang 30-40%; berat &lt;30%), </w:t>
+      </w:r>
+      <w:r>
+        <w:rPr>
+          <w:b/>
+        </w:rPr>
+        <w:t>BNP</w:t>
+      </w:r>
+      <w:r>
+        <w:t xml:space="preserve">. Klasifikasi TD </w:t>
+      </w:r>
+      <w:r>
+        <w:rPr>
+          <w:b/>
+        </w:rPr>
+        <w:t>JNC 7</w:t>
+      </w:r>
+      <w:r>
+        <w:t xml:space="preserve"> (wajib hafal, dipakai lintas bidang): Normal &lt;120/&lt;80 · Pre-hipertensi 120-139/80-89 · Stage 1 140-159/90-99 · Stage 2 ≥160/≥100. </w:t>
+      </w:r>
+      <w:r>
+        <w:rPr>
+          <w:b/>
+        </w:rPr>
+        <w:t>Hipertensi murni tidak dinilai</w:t>
+      </w:r>
+      <w:r>
+        <w:t xml:space="preserve"> — harus ada bukti kerusakan end-organ (LVH, proteinuria, penurunan klirens kreatinin, funduskopi, ensefalopati); jika end-organ di sistem lain, nilai terpisah di bab tersebut lalu gabung via CVC. </w:t>
+      </w:r>
+      <w:r>
+        <w:rPr>
+          <w:b/>
+        </w:rPr>
+        <w:t>Vaskuler perifer ekstremitas (4.8)</w:t>
+      </w:r>
+      <w:r>
+        <w:t xml:space="preserve"> dinilai per-ekstremitas dulu (sampai 65% </w:t>
+      </w:r>
+      <w:r>
+        <w:rPr>
+          <w:i/>
+        </w:rPr>
+        <w:t>Lower/Upper Extremity Impairment</w:t>
+      </w:r>
+      <w:r>
+        <w:t xml:space="preserve">), baru dikonversi WPI — beda dari subkategori jantung lain. </w:t>
+      </w:r>
+      <w:r>
+        <w:rPr>
+          <w:i/>
+        </w:rPr>
+        <w:t>Contoh</w:t>
+      </w:r>
+      <w:r>
+        <w:t xml:space="preserve">: PAD bilateral berat (ABI &lt;0,3, ulserasi iskemik) → Kelas 4E = 65% LEI tiap tungkai → 26% WPI per tungkai → digabung CVC → </w:t>
+      </w:r>
+      <w:r>
+        <w:rPr>
+          <w:b/>
+        </w:rPr>
+        <w:t>45% WPI</w:t>
+      </w:r>
+      <w:r>
+        <w:t>.</w:t>
+      </w:r>
+    </w:p>
+    <w:p>
+      <w:r>
+        <w:rPr>
+          <w:b/>
+        </w:rPr>
+        <w:t>Bab 5 — Paru</w:t>
+      </w:r>
+      <w:r>
+        <w:t xml:space="preserve"> (key factor = </w:t>
+      </w:r>
+      <w:r>
+        <w:rPr>
+          <w:i/>
+        </w:rPr>
+        <w:t>Objective Test Results</w:t>
+      </w:r>
+      <w:r>
+        <w:t xml:space="preserve">, struktur kelas identik Bab 4: 2-10/11-23/24-40/45-65%). Kriteria objektif — </w:t>
+      </w:r>
+      <w:r>
+        <w:rPr>
+          <w:b/>
+        </w:rPr>
+        <w:t>cukup satu dari empat parameter terpenuhi</w:t>
+      </w:r>
+      <w:r>
+        <w:t xml:space="preserve"> (kecuali Kelas 0 yang butuh semua normal):</w:t>
+      </w:r>
+    </w:p>
+    <w:tbl>
+      <w:tblPr>
+        <w:tblStyle w:val="TableGrid"/>
+        <w:tblW w:type="auto" w:w="0"/>
+        <w:tblLayout w:type="autofit"/>
+        <w:tblLook w:firstColumn="1" w:firstRow="1" w:lastColumn="0" w:lastRow="0" w:noHBand="0" w:noVBand="1" w:val="04A0"/>
+      </w:tblPr>
+      <w:tblGrid>
+        <w:gridCol w:w="1728"/>
+        <w:gridCol w:w="1728"/>
+        <w:gridCol w:w="1728"/>
+        <w:gridCol w:w="1728"/>
+        <w:gridCol w:w="1728"/>
+      </w:tblGrid>
+      <w:tr>
+        <w:tc>
+          <w:tcPr>
+            <w:tcW w:type="dxa" w:w="1728"/>
+            <w:shd w:val="clear" w:color="auto" w:fill="1F4E5F"/>
+          </w:tcPr>
+          <w:p>
+            <w:r>
+              <w:rPr>
+                <w:b/>
+                <w:color w:val="FFFFFF"/>
+                <w:sz w:val="18"/>
+              </w:rPr>
+              <w:t>Kelas</w:t>
+            </w:r>
+          </w:p>
+        </w:tc>
+        <w:tc>
+          <w:tcPr>
+            <w:tcW w:type="dxa" w:w="1728"/>
+            <w:shd w:val="clear" w:color="auto" w:fill="1F4E5F"/>
+          </w:tcPr>
+          <w:p>
+            <w:r>
+              <w:rPr>
+                <w:b/>
+                <w:color w:val="FFFFFF"/>
+                <w:sz w:val="18"/>
+              </w:rPr>
+              <w:t>FVC (%prediksi)</w:t>
+            </w:r>
+          </w:p>
+        </w:tc>
+        <w:tc>
+          <w:tcPr>
+            <w:tcW w:type="dxa" w:w="1728"/>
+            <w:shd w:val="clear" w:color="auto" w:fill="1F4E5F"/>
+          </w:tcPr>
+          <w:p>
+            <w:r>
+              <w:rPr>
+                <w:b/>
+                <w:color w:val="FFFFFF"/>
+                <w:sz w:val="18"/>
+              </w:rPr>
+              <w:t>FEV1 (%prediksi)</w:t>
+            </w:r>
+          </w:p>
+        </w:tc>
+        <w:tc>
+          <w:tcPr>
+            <w:tcW w:type="dxa" w:w="1728"/>
+            <w:shd w:val="clear" w:color="auto" w:fill="1F4E5F"/>
+          </w:tcPr>
+          <w:p>
+            <w:r>
+              <w:rPr>
+                <w:b/>
+                <w:color w:val="FFFFFF"/>
+                <w:sz w:val="18"/>
+              </w:rPr>
+              <w:t>DLco (%prediksi)</w:t>
+            </w:r>
+          </w:p>
+        </w:tc>
+        <w:tc>
+          <w:tcPr>
+            <w:tcW w:type="dxa" w:w="1728"/>
+            <w:shd w:val="clear" w:color="auto" w:fill="1F4E5F"/>
+          </w:tcPr>
+          <w:p>
+            <w:r>
+              <w:rPr>
+                <w:b/>
+                <w:color w:val="FFFFFF"/>
+                <w:sz w:val="18"/>
+              </w:rPr>
+              <w:t>VO2 max</w:t>
+            </w:r>
+          </w:p>
+        </w:tc>
+      </w:tr>
+      <w:tr>
+        <w:tc>
+          <w:tcPr>
+            <w:tcW w:type="dxa" w:w="1728"/>
+          </w:tcPr>
+          <w:p>
+            <w:r>
+              <w:rPr>
+                <w:sz w:val="18"/>
+              </w:rPr>
+              <w:t>0</w:t>
+            </w:r>
+          </w:p>
+        </w:tc>
+        <w:tc>
+          <w:tcPr>
+            <w:tcW w:type="dxa" w:w="1728"/>
+          </w:tcPr>
+          <w:p>
+            <w:r>
+              <w:rPr>
+                <w:sz w:val="18"/>
+              </w:rPr>
+              <w:t>≥80%</w:t>
+            </w:r>
+          </w:p>
+        </w:tc>
+        <w:tc>
+          <w:tcPr>
+            <w:tcW w:type="dxa" w:w="1728"/>
+          </w:tcPr>
+          <w:p>
+            <w:r>
+              <w:rPr>
+                <w:sz w:val="18"/>
+              </w:rPr>
+              <w:t>≥80%</w:t>
+            </w:r>
+          </w:p>
+        </w:tc>
+        <w:tc>
+          <w:tcPr>
+            <w:tcW w:type="dxa" w:w="1728"/>
+          </w:tcPr>
+          <w:p>
+            <w:r>
+              <w:rPr>
+                <w:sz w:val="18"/>
+              </w:rPr>
+              <w:t>≥75%</w:t>
+            </w:r>
+          </w:p>
+        </w:tc>
+        <w:tc>
+          <w:tcPr>
+            <w:tcW w:type="dxa" w:w="1728"/>
+          </w:tcPr>
+          <w:p>
+            <w:r>
+              <w:rPr>
+                <w:sz w:val="18"/>
+              </w:rPr>
+              <w:t>≥25 mL/kg/min (7,1 METs)</w:t>
+            </w:r>
+          </w:p>
+        </w:tc>
+      </w:tr>
+      <w:tr>
+        <w:tc>
+          <w:tcPr>
+            <w:tcW w:type="dxa" w:w="1728"/>
+          </w:tcPr>
+          <w:p>
+            <w:r>
+              <w:rPr>
+                <w:sz w:val="18"/>
+              </w:rPr>
+              <w:t>1</w:t>
+            </w:r>
+          </w:p>
+        </w:tc>
+        <w:tc>
+          <w:tcPr>
+            <w:tcW w:type="dxa" w:w="1728"/>
+          </w:tcPr>
+          <w:p>
+            <w:r>
+              <w:rPr>
+                <w:sz w:val="18"/>
+              </w:rPr>
+              <w:t>70-79%</w:t>
+            </w:r>
+          </w:p>
+        </w:tc>
+        <w:tc>
+          <w:tcPr>
+            <w:tcW w:type="dxa" w:w="1728"/>
+          </w:tcPr>
+          <w:p>
+            <w:r>
+              <w:rPr>
+                <w:sz w:val="18"/>
+              </w:rPr>
+              <w:t>65-79%</w:t>
+            </w:r>
+          </w:p>
+        </w:tc>
+        <w:tc>
+          <w:tcPr>
+            <w:tcW w:type="dxa" w:w="1728"/>
+          </w:tcPr>
+          <w:p>
+            <w:r>
+              <w:rPr>
+                <w:sz w:val="18"/>
+              </w:rPr>
+              <w:t>65-74%</w:t>
+            </w:r>
+          </w:p>
+        </w:tc>
+        <w:tc>
+          <w:tcPr>
+            <w:tcW w:type="dxa" w:w="1728"/>
+          </w:tcPr>
+          <w:p>
+            <w:r>
+              <w:rPr>
+                <w:sz w:val="18"/>
+              </w:rPr>
+              <w:t>22-25</w:t>
+            </w:r>
+          </w:p>
+        </w:tc>
+      </w:tr>
+      <w:tr>
+        <w:tc>
+          <w:tcPr>
+            <w:tcW w:type="dxa" w:w="1728"/>
+          </w:tcPr>
+          <w:p>
+            <w:r>
+              <w:rPr>
+                <w:sz w:val="18"/>
+              </w:rPr>
+              <w:t>2</w:t>
+            </w:r>
+          </w:p>
+        </w:tc>
+        <w:tc>
+          <w:tcPr>
+            <w:tcW w:type="dxa" w:w="1728"/>
+          </w:tcPr>
+          <w:p>
+            <w:r>
+              <w:rPr>
+                <w:sz w:val="18"/>
+              </w:rPr>
+              <w:t>60-69%</w:t>
+            </w:r>
+          </w:p>
+        </w:tc>
+        <w:tc>
+          <w:tcPr>
+            <w:tcW w:type="dxa" w:w="1728"/>
+          </w:tcPr>
+          <w:p>
+            <w:r>
+              <w:rPr>
+                <w:sz w:val="18"/>
+              </w:rPr>
+              <w:t>55-64%</w:t>
+            </w:r>
+          </w:p>
+        </w:tc>
+        <w:tc>
+          <w:tcPr>
+            <w:tcW w:type="dxa" w:w="1728"/>
+          </w:tcPr>
+          <w:p>
+            <w:r>
+              <w:rPr>
+                <w:sz w:val="18"/>
+              </w:rPr>
+              <w:t>55-64%</w:t>
+            </w:r>
+          </w:p>
+        </w:tc>
+        <w:tc>
+          <w:tcPr>
+            <w:tcW w:type="dxa" w:w="1728"/>
+          </w:tcPr>
+          <w:p>
+            <w:r>
+              <w:rPr>
+                <w:sz w:val="18"/>
+              </w:rPr>
+              <w:t>18-21</w:t>
+            </w:r>
+          </w:p>
+        </w:tc>
+      </w:tr>
+      <w:tr>
+        <w:tc>
+          <w:tcPr>
+            <w:tcW w:type="dxa" w:w="1728"/>
+          </w:tcPr>
+          <w:p>
+            <w:r>
+              <w:rPr>
+                <w:sz w:val="18"/>
+              </w:rPr>
+              <w:t>3</w:t>
+            </w:r>
+          </w:p>
+        </w:tc>
+        <w:tc>
+          <w:tcPr>
+            <w:tcW w:type="dxa" w:w="1728"/>
+          </w:tcPr>
+          <w:p>
+            <w:r>
+              <w:rPr>
+                <w:sz w:val="18"/>
+              </w:rPr>
+              <w:t>50-59%</w:t>
+            </w:r>
+          </w:p>
+        </w:tc>
+        <w:tc>
+          <w:tcPr>
+            <w:tcW w:type="dxa" w:w="1728"/>
+          </w:tcPr>
+          <w:p>
+            <w:r>
+              <w:rPr>
+                <w:sz w:val="18"/>
+              </w:rPr>
+              <w:t>45-54%</w:t>
+            </w:r>
+          </w:p>
+        </w:tc>
+        <w:tc>
+          <w:tcPr>
+            <w:tcW w:type="dxa" w:w="1728"/>
+          </w:tcPr>
+          <w:p>
+            <w:r>
+              <w:rPr>
+                <w:sz w:val="18"/>
+              </w:rPr>
+              <w:t>45-54%</w:t>
+            </w:r>
+          </w:p>
+        </w:tc>
+        <w:tc>
+          <w:tcPr>
+            <w:tcW w:type="dxa" w:w="1728"/>
+          </w:tcPr>
+          <w:p>
+            <w:r>
+              <w:rPr>
+                <w:sz w:val="18"/>
+              </w:rPr>
+              <w:t>15-17</w:t>
+            </w:r>
+          </w:p>
+        </w:tc>
+      </w:tr>
+      <w:tr>
+        <w:tc>
+          <w:tcPr>
+            <w:tcW w:type="dxa" w:w="1728"/>
+          </w:tcPr>
+          <w:p>
+            <w:r>
+              <w:rPr>
+                <w:sz w:val="18"/>
+              </w:rPr>
+              <w:t>4</w:t>
+            </w:r>
+          </w:p>
+        </w:tc>
+        <w:tc>
+          <w:tcPr>
+            <w:tcW w:type="dxa" w:w="1728"/>
+          </w:tcPr>
+          <w:p>
+            <w:r>
+              <w:rPr>
+                <w:sz w:val="18"/>
+              </w:rPr>
+              <w:t>&lt;50%</w:t>
+            </w:r>
+          </w:p>
+        </w:tc>
+        <w:tc>
+          <w:tcPr>
+            <w:tcW w:type="dxa" w:w="1728"/>
+          </w:tcPr>
+          <w:p>
+            <w:r>
+              <w:rPr>
+                <w:sz w:val="18"/>
+              </w:rPr>
+              <w:t>&lt;45%</w:t>
+            </w:r>
+          </w:p>
+        </w:tc>
+        <w:tc>
+          <w:tcPr>
+            <w:tcW w:type="dxa" w:w="1728"/>
+          </w:tcPr>
+          <w:p>
+            <w:r>
+              <w:rPr>
+                <w:sz w:val="18"/>
+              </w:rPr>
+              <w:t>&lt;45%</w:t>
+            </w:r>
+          </w:p>
+        </w:tc>
+        <w:tc>
+          <w:tcPr>
+            <w:tcW w:type="dxa" w:w="1728"/>
+          </w:tcPr>
+          <w:p>
+            <w:r>
+              <w:rPr>
+                <w:sz w:val="18"/>
+              </w:rPr>
+              <w:t>&lt;15 (&lt;4,3 METs)</w:t>
+            </w:r>
+          </w:p>
+        </w:tc>
+      </w:tr>
+    </w:tbl>
+    <w:p/>
+    <w:p>
+      <w:r>
+        <w:t xml:space="preserve">Waspada faktor ekstrapulmoner (kelemahan otot dinding dada/obesitas menurunkan FVC; anemia menurunkan DLco) sebelum menyimpulkan penyakit paru primer. </w:t>
+      </w:r>
+      <w:r>
+        <w:rPr>
+          <w:i/>
+        </w:rPr>
+        <w:t>Contoh</w:t>
+      </w:r>
+      <w:r>
+        <w:t xml:space="preserve"> (asbestosis): FVC 55% → Kelas 3 (key factor, default Grade C); History &amp; PF sama-sama Kelas 4 (2 tingkat lebih tinggi) → grade naik ke </w:t>
+      </w:r>
+      <w:r>
+        <w:rPr>
+          <w:b/>
+        </w:rPr>
+        <w:t>E</w:t>
+      </w:r>
+      <w:r>
+        <w:t xml:space="preserve"> → </w:t>
+      </w:r>
+      <w:r>
+        <w:rPr>
+          <w:b/>
+        </w:rPr>
+        <w:t>40% WPI</w:t>
+      </w:r>
+      <w:r>
+        <w:t xml:space="preserve"> (tetap Kelas 3E, kelas ditentukan HANYA dari key factor).</w:t>
+      </w:r>
+    </w:p>
+    <w:p>
+      <w:r>
+        <w:rPr>
+          <w:b/>
+        </w:rPr>
+        <w:t>Bab 6 — Digestif</w:t>
+      </w:r>
+      <w:r>
+        <w:t xml:space="preserve"> (key factor = </w:t>
+      </w:r>
+      <w:r>
+        <w:rPr>
+          <w:b/>
+        </w:rPr>
+        <w:t>HISTORY</w:t>
+      </w:r>
+      <w:r>
+        <w:t xml:space="preserve">, bukan objective test): Kelas 1 = 1-9%, Kelas 2 = 12-20%, Kelas 3 = 22-38%, Kelas 4 = 40-60%. Parameter unik: </w:t>
+      </w:r>
+      <w:r>
+        <w:rPr>
+          <w:b/>
+        </w:rPr>
+        <w:t>% penurunan berat badan dari berat ideal (IBW)</w:t>
+      </w:r>
+      <w:r>
+        <w:t xml:space="preserve"> — &lt;10% Kelas 2, 10-20% Kelas 3, &gt;20% Kelas 4 (baru relevan mulai Kelas 2, tidak dipakai di Kelas 0-1). </w:t>
+      </w:r>
+      <w:r>
+        <w:rPr>
+          <w:i/>
+        </w:rPr>
+        <w:t>Contoh</w:t>
+      </w:r>
+      <w:r>
+        <w:t xml:space="preserve"> (achalasia): History+BB turun+objektif semua sinkron Kelas 3 → </w:t>
+      </w:r>
+      <w:r>
+        <w:rPr>
+          <w:b/>
+        </w:rPr>
+        <w:t>30% WPI</w:t>
+      </w:r>
+      <w:r>
+        <w:t xml:space="preserve">. </w:t>
+      </w:r>
+      <w:r>
+        <w:rPr>
+          <w:i/>
+        </w:rPr>
+        <w:t>Contoh kompleks</w:t>
+      </w:r>
+      <w:r>
+        <w:t xml:space="preserve"> (gastrektomi total + striktur pasca kanker): semua faktor sama-sama Kelas 4 tertinggi → </w:t>
+      </w:r>
+      <w:r>
+        <w:rPr>
+          <w:b/>
+        </w:rPr>
+        <w:t>boleh naik ke grade maksimal kelas (60%)</w:t>
+      </w:r>
+      <w:r>
+        <w:t xml:space="preserve">, bukan default tengah — pengecualian ini berlaku lintas-bab bila key factor &amp; semua faktor non-key ada di kelas tertinggi yang sama. Digabung + gastrostomy (10%) via CVC → </w:t>
+      </w:r>
+      <w:r>
+        <w:rPr>
+          <w:b/>
+        </w:rPr>
+        <w:t>64% WPI</w:t>
+      </w:r>
+      <w:r>
+        <w:t>.</w:t>
+      </w:r>
+    </w:p>
+    <w:p>
+      <w:r>
+        <w:rPr>
+          <w:b/>
+        </w:rPr>
+        <w:t>Bab 7 — Urinaria &amp; Reproduksi</w:t>
+      </w:r>
+      <w:r>
+        <w:t xml:space="preserve"> (key factor = HISTORY): Kelas 1 = 1-13%, Kelas 2 = 16-32%, Kelas 3 = 36-52%, Kelas 4 = 55-75%. Parameter objektif: </w:t>
+      </w:r>
+      <w:r>
+        <w:rPr>
+          <w:b/>
+        </w:rPr>
+        <w:t>Klirens Kreatinin</w:t>
+      </w:r>
+      <w:r>
+        <w:t xml:space="preserve"> (1: 75-90 L/24h · 2: 60-74 · 3: 40-59 · 4: &lt;40), dengan </w:t>
+      </w:r>
+      <w:r>
+        <w:rPr>
+          <w:b/>
+        </w:rPr>
+        <w:t>koreksi usia</w:t>
+      </w:r>
+      <w:r>
+        <w:t xml:space="preserve"> — turun ~6,5 mL/menit tiap dekade setelah usia 40 tahun, wajib ditambahkan kembali sebelum dibandingkan ke tabel. Kelas 4 dialisis: </w:t>
+      </w:r>
+      <w:r>
+        <w:rPr>
+          <w:b/>
+        </w:rPr>
+        <w:t>55%</w:t>
+      </w:r>
+      <w:r>
+        <w:t xml:space="preserve"> peritoneal, </w:t>
+      </w:r>
+      <w:r>
+        <w:rPr>
+          <w:b/>
+        </w:rPr>
+        <w:t>65%</w:t>
+      </w:r>
+      <w:r>
+        <w:t xml:space="preserve"> hemodialisis 2×/minggu, </w:t>
+      </w:r>
+      <w:r>
+        <w:rPr>
+          <w:b/>
+        </w:rPr>
+        <w:t>75%</w:t>
+      </w:r>
+      <w:r>
+        <w:t xml:space="preserve"> hemodialisis 3×/minggu (bukan dipilih bebas). </w:t>
+      </w:r>
+      <w:r>
+        <w:rPr>
+          <w:i/>
+        </w:rPr>
+        <w:t>Contoh</w:t>
+      </w:r>
+      <w:r>
+        <w:t xml:space="preserve"> (pasca transplantasi ginjal): History Kelas 2 (24%) tapi PF &amp; klirens kreatinin normal (turun 2 grade → 16%) + BOTC 3% (obat imunosupresan) = </w:t>
+      </w:r>
+      <w:r>
+        <w:rPr>
+          <w:b/>
+        </w:rPr>
+        <w:t>19%</w:t>
+      </w:r>
+      <w:r>
+        <w:t xml:space="preserve"> — BOTC ditambahkan </w:t>
+      </w:r>
+      <w:r>
+        <w:rPr>
+          <w:b/>
+        </w:rPr>
+        <w:t>setelah</w:t>
+      </w:r>
+      <w:r>
+        <w:t xml:space="preserve"> Net Adjustment selesai, bukan masuk rumus.</w:t>
+      </w:r>
+    </w:p>
+    <w:p>
+      <w:r>
+        <w:rPr>
+          <w:b/>
+        </w:rPr>
+        <w:t>Bab 8 — Kulit</w:t>
+      </w:r>
+      <w:r>
+        <w:t xml:space="preserve"> (key factor = HISTORY, diukur dari </w:t>
+      </w:r>
+      <w:r>
+        <w:rPr>
+          <w:b/>
+        </w:rPr>
+        <w:t>% waktu gejala muncul</w:t>
+      </w:r>
+      <w:r>
+        <w:t xml:space="preserve">, bukan derajat tunggal): Kelas 1 = 1-9% (gejala 1-30% waktu), Kelas 2 = 11-27% (30-60%), Kelas 3 = 30-42% (60-90%), Kelas 4 = 45-58% (≥90% atau perlu isolasi). </w:t>
+      </w:r>
+      <w:r>
+        <w:rPr>
+          <w:b/>
+        </w:rPr>
+        <w:t>Batas maksimal impairment kulit = 58%</w:t>
+      </w:r>
+      <w:r>
+        <w:t xml:space="preserve"> — jika penyakit kulit merusak sistem lain (kontraktur sendi akibat skleroderma dll.) nilai sistem itu terpisah lalu gabung CVC. Kanker kulit (kecuali basal cell) yang belum remisi otomatis </w:t>
+      </w:r>
+      <w:r>
+        <w:rPr>
+          <w:b/>
+        </w:rPr>
+        <w:t>58%</w:t>
+      </w:r>
+      <w:r>
+        <w:t xml:space="preserve">, atau </w:t>
+      </w:r>
+      <w:r>
+        <w:rPr>
+          <w:b/>
+        </w:rPr>
+        <w:t>100% jika terminal</w:t>
+      </w:r>
+      <w:r>
+        <w:t xml:space="preserve">. </w:t>
+      </w:r>
+      <w:r>
+        <w:rPr>
+          <w:i/>
+        </w:rPr>
+        <w:t>Contoh</w:t>
+      </w:r>
+      <w:r>
+        <w:t xml:space="preserve"> (psoriasis): History 100% waktu tapi flare berat hanya 1-2 bulan/tahun → Kelas 3 (36%); PF 60% BSA setara Kelas 4 → naik </w:t>
+      </w:r>
+      <w:r>
+        <w:rPr>
+          <w:b/>
+        </w:rPr>
+        <w:t>39%</w:t>
+      </w:r>
+      <w:r>
+        <w:t>.</w:t>
+      </w:r>
+    </w:p>
+    <w:p>
+      <w:r>
+        <w:rPr>
+          <w:b/>
+        </w:rPr>
+        <w:t>Bab 9 — Hematopoietik</w:t>
+      </w:r>
+      <w:r>
+        <w:t xml:space="preserve">: sebagian kondisi (Anemia) hanya punya </w:t>
+      </w:r>
+      <w:r>
+        <w:rPr>
+          <w:b/>
+        </w:rPr>
+        <w:t>3 grade (A-B-C)</w:t>
+      </w:r>
+      <w:r>
+        <w:t xml:space="preserve">, bukan 5, karena hanya History+Objective Test relevan. Anemia (key factor HISTORY): Kelas 1 1-5% (Hb 10-12 g/dL) · Kelas 2 7-15% (8-10) · Kelas 3 25-45% (6-8) · Kelas 4 55-75% (&lt;6) — </w:t>
+      </w:r>
+      <w:r>
+        <w:rPr>
+          <w:b/>
+        </w:rPr>
+        <w:t>tidak ada nilai Hb tunggal otomatis menentukan derajat</w:t>
+      </w:r>
+      <w:r>
+        <w:t xml:space="preserve">, bergantung respons kompensasi kardiovaskular. BOTC transfusi: +1%/unit darah/bulan; transplantasi sumsum gagal +10%. </w:t>
+      </w:r>
+      <w:r>
+        <w:rPr>
+          <w:b/>
+        </w:rPr>
+        <w:t>HIV/AIDS dinilai di bab ini</w:t>
+      </w:r>
+      <w:r>
+        <w:t xml:space="preserve"> (bukan "infeksi" umum) — key factor CD4 count + beban infeksi oportunistik, sampai Kelas 4 = 60-80% WPI. Limfoma (key factor HISTORY, frekuensi kemoterapi): Kelas 1 3-15% (oral) · Kelas 2 20-30% (IV ≤2×/tahun) · Kelas 3 35-55% (3-6×/tahun) · Kelas 4 65-85% (&gt;6×/tahun atau gagal terapi).</w:t>
+      </w:r>
+    </w:p>
+    <w:p>
+      <w:r>
+        <w:rPr>
+          <w:b/>
+        </w:rPr>
+        <w:t>Bab 10 — Endokrin</w:t>
+      </w:r>
+      <w:r>
+        <w:t xml:space="preserve"> — bab paling berbeda: rentang kelas relatif rendah (1-5/6-10/11-15/16-20%) karena dampak besar komplikasi dinilai di bab organ target (jantung/mata/ginjal), bukan di sini. History = key factor menentukan Kelas; </w:t>
+      </w:r>
+      <w:r>
+        <w:rPr>
+          <w:b/>
+        </w:rPr>
+        <w:t>BOTC menggantikan Physical Exam</w:t>
+      </w:r>
+      <w:r>
+        <w:t xml:space="preserve"> sebagai penentu grade, dihitung manual: </w:t>
+      </w:r>
+      <w:r>
+        <w:rPr>
+          <w:b/>
+        </w:rPr>
+        <w:t>BOTC Total = Poin Obat + Poin Diet + Poin PBI</w:t>
+      </w:r>
+      <w:r>
+        <w:t xml:space="preserve"> (Poin Obat: oral/topikal PRN=1, 1-2×/hari=2, &gt;2×/hari=3; parenteral ≤1×/minggu=2 s.d. &gt;2×/hari=5, pakai frekuensi tertinggi bila &gt;1 obat rute sama; Poin Diet: minimal=2, sedang=5, berat=10; Poin PBI: monitoring gula darah, makin sering makin tinggi). </w:t>
+      </w:r>
+      <w:r>
+        <w:rPr>
+          <w:i/>
+        </w:rPr>
+        <w:t>Contoh</w:t>
+      </w:r>
+      <w:r>
+        <w:t xml:space="preserve"> (DM Tipe 1): insulin subkutan 5×/hari = 5 poin + diet minimal 2 poin + cek gula 4×/hari 4 poin = </w:t>
+      </w:r>
+      <w:r>
+        <w:rPr>
+          <w:b/>
+        </w:rPr>
+        <w:t>BOTC 11 poin</w:t>
+      </w:r>
+      <w:r>
+        <w:t xml:space="preserve"> → dikonversi ke tabel spesifik penyakit untuk menentukan Grade. Prinsip multiglandular: tiap kelenjar dinilai terpisah, digabung via CVC.</w:t>
+      </w:r>
+    </w:p>
+    <w:p>
+      <w:r>
+        <w:rPr>
+          <w:b/>
+        </w:rPr>
+        <w:t>Bab 11 — THT (AMA)</w:t>
+      </w:r>
+      <w:r>
+        <w:t xml:space="preserve"> — </w:t>
+      </w:r>
+      <w:r>
+        <w:rPr>
+          <w:b/>
+        </w:rPr>
+        <w:t>formula ketulian ini diadopsi persis oleh Permenaker 25/2008</w:t>
+      </w:r>
+      <w:r>
+        <w:t xml:space="preserve"> (lihat Poin 5.3 THT untuk perbandingan detail):</w:t>
+      </w:r>
+    </w:p>
+    <w:p>
+      <w:pPr>
+        <w:pStyle w:val="ListNumber"/>
+      </w:pPr>
+      <w:r>
+        <w:t xml:space="preserve">Ukur ambang tiap telinga di </w:t>
+      </w:r>
+      <w:r>
+        <w:rPr>
+          <w:b/>
+        </w:rPr>
+        <w:t>500, 1000, 2000, 3000 Hz</w:t>
+      </w:r>
+      <w:r>
+        <w:t xml:space="preserve"> (AMA pakai 3000 Hz, bukan 4000 Hz seperti Indonesia — jebakan klasik) → jumlahkan = </w:t>
+      </w:r>
+      <w:r>
+        <w:rPr>
+          <w:b/>
+        </w:rPr>
+        <w:t>DSHL</w:t>
+      </w:r>
+      <w:r>
+        <w:t>.</w:t>
+      </w:r>
+    </w:p>
+    <w:p>
+      <w:pPr>
+        <w:pStyle w:val="ListNumber"/>
+      </w:pPr>
+      <w:r>
+        <w:rPr>
+          <w:b/>
+        </w:rPr>
+        <w:t>Monaural</w:t>
+      </w:r>
+      <w:r>
+        <w:t xml:space="preserve">: "Fence" 25 dB (di bawah rata-rata = 0%); setiap dB di atas rata-rata (DSHL÷4) = </w:t>
+      </w:r>
+      <w:r>
+        <w:rPr>
+          <w:b/>
+        </w:rPr>
+        <w:t>1,5% impairment</w:t>
+      </w:r>
+      <w:r>
+        <w:t>; di atas 91,7 dB = 100% monaural.</w:t>
+      </w:r>
+    </w:p>
+    <w:p>
+      <w:pPr>
+        <w:pStyle w:val="ListNumber"/>
+      </w:pPr>
+      <w:r>
+        <w:rPr>
+          <w:b/>
+        </w:rPr>
+        <w:t>Binaural</w:t>
+      </w:r>
+      <w:r>
+        <w:t xml:space="preserve">: `[5 × %monaural telinga lebih baik + 1 × %monaural telinga lebih buruk] ÷ 6` → konversi ke WPI via tabel (bukan rumus langsung). </w:t>
+      </w:r>
+      <w:r>
+        <w:rPr>
+          <w:i/>
+        </w:rPr>
+        <w:t>Contoh</w:t>
+      </w:r>
+      <w:r>
+        <w:t xml:space="preserve">: DSHL kanan (buruk)=225, kiri (baik)=125 → Binaural = 15,6% → </w:t>
+      </w:r>
+      <w:r>
+        <w:rPr>
+          <w:b/>
+        </w:rPr>
+        <w:t>5% WPI</w:t>
+      </w:r>
+      <w:r>
+        <w:t>.</w:t>
+      </w:r>
+    </w:p>
+    <w:p>
+      <w:pPr>
+        <w:pStyle w:val="ListNumber"/>
+      </w:pPr>
+      <w:r>
+        <w:rPr>
+          <w:b/>
+        </w:rPr>
+        <w:t>Tidak ada koreksi usia</w:t>
+      </w:r>
+      <w:r>
+        <w:t xml:space="preserve"> untuk presbikusis (beda dari ginjal). </w:t>
+      </w:r>
+      <w:r>
+        <w:rPr>
+          <w:b/>
+        </w:rPr>
+        <w:t>Tinnitus</w:t>
+      </w:r>
+      <w:r>
+        <w:t xml:space="preserve"> bisa +5% ke Binaural sebelum konversi WPI bila mengganggu ADL signifikan.</w:t>
+      </w:r>
+    </w:p>
+    <w:p>
+      <w:r>
+        <w:t>Wajah/disfigurement (Tabel 11-5) juga dipakai untuk menilai efek nonvisual pada kasus trauma mata (integrasi lintas-bab dengan Bab 12).</w:t>
+      </w:r>
+    </w:p>
+    <w:p>
+      <w:r>
+        <w:rPr>
+          <w:b/>
+        </w:rPr>
+        <w:t>Bab 12 — Visual (AMA)</w:t>
+      </w:r>
+      <w:r>
+        <w:t xml:space="preserve"> — struktur terbalik: hitung angka dulu, baru petakan ke kelas:</w:t>
+      </w:r>
+    </w:p>
+    <w:p>
+      <w:pPr>
+        <w:pStyle w:val="ListNumber"/>
+      </w:pPr>
+      <w:r>
+        <w:rPr>
+          <w:b/>
+        </w:rPr>
+        <w:t>VAS</w:t>
+      </w:r>
+      <w:r>
+        <w:t xml:space="preserve"> (Visual Acuity Score) per mata dari kartu Snellen ETDRS.</w:t>
+      </w:r>
+    </w:p>
+    <w:p>
+      <w:pPr>
+        <w:pStyle w:val="ListNumber"/>
+      </w:pPr>
+      <w:r>
+        <w:rPr>
+          <w:b/>
+        </w:rPr>
+        <w:t>FAS</w:t>
+      </w:r>
+      <w:r>
+        <w:t xml:space="preserve"> (Functional Acuity Score) = `(3×VAS_OU + VAS_OD + VAS_OS) / 5` — bobot </w:t>
+      </w:r>
+      <w:r>
+        <w:rPr>
+          <w:b/>
+        </w:rPr>
+        <w:t>OU 60%, OD 20%, OS 20%</w:t>
+      </w:r>
+      <w:r>
+        <w:t xml:space="preserve"> (wajib hafal). Rating akuitas = 100−FAS.</w:t>
+      </w:r>
+    </w:p>
+    <w:p>
+      <w:pPr>
+        <w:pStyle w:val="ListNumber"/>
+      </w:pPr>
+      <w:r>
+        <w:rPr>
+          <w:b/>
+        </w:rPr>
+        <w:t>VFS</w:t>
+      </w:r>
+      <w:r>
+        <w:t xml:space="preserve"> (Visual Field Score) per mata dari isopter Goldmann </w:t>
+      </w:r>
+      <w:r>
+        <w:rPr>
+          <w:b/>
+        </w:rPr>
+        <w:t>III-4-e</w:t>
+      </w:r>
+      <w:r>
+        <w:t xml:space="preserve"> (standar wajib).</w:t>
+      </w:r>
+    </w:p>
+    <w:p>
+      <w:pPr>
+        <w:pStyle w:val="ListNumber"/>
+      </w:pPr>
+      <w:r>
+        <w:rPr>
+          <w:b/>
+        </w:rPr>
+        <w:t>FFS</w:t>
+      </w:r>
+      <w:r>
+        <w:t xml:space="preserve"> = `(3×VFS_OU + VFS_OD + VFS_OS) / 5` (bobot identik FAS).</w:t>
+      </w:r>
+    </w:p>
+    <w:p>
+      <w:pPr>
+        <w:pStyle w:val="ListNumber"/>
+      </w:pPr>
+      <w:r>
+        <w:rPr>
+          <w:b/>
+        </w:rPr>
+        <w:t>FVS</w:t>
+      </w:r>
+      <w:r>
+        <w:t xml:space="preserve"> (Functional Vision Score) = `(FAS × FFS) / 100` — </w:t>
+      </w:r>
+      <w:r>
+        <w:rPr>
+          <w:b/>
+        </w:rPr>
+        <w:t>dikalikan</w:t>
+      </w:r>
+      <w:r>
+        <w:t>, bukan dijumlah/dirata-rata. VSI (Visual System Impairment) = 100−FVS.</w:t>
+      </w:r>
+    </w:p>
+    <w:p>
+      <w:pPr>
+        <w:pStyle w:val="ListNumber"/>
+      </w:pPr>
+      <w:r>
+        <w:rPr>
+          <w:b/>
+        </w:rPr>
+        <w:t>Konversi VSI→WPI</w:t>
+      </w:r>
+      <w:r>
+        <w:t xml:space="preserve">: jika VSI ≤50% → WPI=VSI; jika VSI &gt;50% → </w:t>
+      </w:r>
+      <w:r>
+        <w:rPr>
+          <w:b/>
+        </w:rPr>
+        <w:t>WPI = 50 + 0,7×(VSI−50)</w:t>
+      </w:r>
+      <w:r>
+        <w:t xml:space="preserve"> (faktor diskon adaptasi — VSI 100% hanya jadi WPI 85%, bukan 100%). </w:t>
+      </w:r>
+      <w:r>
+        <w:rPr>
+          <w:i/>
+        </w:rPr>
+        <w:t>Contoh</w:t>
+      </w:r>
+      <w:r>
+        <w:t xml:space="preserve">: FAS=80, FFS=75 → FVS=60 → VSI=40% → (≤50%) → </w:t>
+      </w:r>
+      <w:r>
+        <w:rPr>
+          <w:b/>
+        </w:rPr>
+        <w:t>WPI=40%</w:t>
+      </w:r>
+      <w:r>
+        <w:t>.</w:t>
+      </w:r>
+    </w:p>
+    <w:p>
+      <w:r>
+        <w:t xml:space="preserve">Disfigurement wajah akibat trauma mata </w:t>
+      </w:r>
+      <w:r>
+        <w:rPr>
+          <w:b/>
+        </w:rPr>
+        <w:t>tidak dinilai di Bab 12</w:t>
+      </w:r>
+      <w:r>
+        <w:t xml:space="preserve"> — dirujuk ke Tabel 11-5 (Bab 11), digabung via CVC.</w:t>
+      </w:r>
+    </w:p>
+    <w:p>
+      <w:r>
+        <w:rPr>
+          <w:b/>
+        </w:rPr>
+        <w:t>Bab 13 — Saraf Pusat &amp; Perifer</w:t>
+      </w:r>
+      <w:r>
+        <w:t xml:space="preserve"> — bab ini </w:t>
+      </w:r>
+      <w:r>
+        <w:rPr>
+          <w:b/>
+        </w:rPr>
+        <w:t>sengaja tidak menilai semua hal saraf</w:t>
+      </w:r>
+      <w:r>
+        <w:t xml:space="preserve"> untuk menghindari duplikasi:</w:t>
+      </w:r>
+    </w:p>
+    <w:tbl>
+      <w:tblPr>
+        <w:tblStyle w:val="TableGrid"/>
+        <w:tblW w:type="auto" w:w="0"/>
+        <w:tblLayout w:type="autofit"/>
+        <w:tblLook w:firstColumn="1" w:firstRow="1" w:lastColumn="0" w:lastRow="0" w:noHBand="0" w:noVBand="1" w:val="04A0"/>
+      </w:tblPr>
+      <w:tblGrid>
+        <w:gridCol w:w="4320"/>
+        <w:gridCol w:w="4320"/>
+      </w:tblGrid>
+      <w:tr>
+        <w:tc>
+          <w:tcPr>
+            <w:tcW w:type="dxa" w:w="4320"/>
+            <w:shd w:val="clear" w:color="auto" w:fill="1F4E5F"/>
+          </w:tcPr>
+          <w:p>
+            <w:r>
+              <w:rPr>
+                <w:b/>
+                <w:color w:val="FFFFFF"/>
+                <w:sz w:val="18"/>
+              </w:rPr>
+              <w:t>Kondisi</w:t>
+            </w:r>
+          </w:p>
+        </w:tc>
+        <w:tc>
+          <w:tcPr>
+            <w:tcW w:type="dxa" w:w="4320"/>
+            <w:shd w:val="clear" w:color="auto" w:fill="1F4E5F"/>
+          </w:tcPr>
+          <w:p>
+            <w:r>
+              <w:rPr>
+                <w:b/>
+                <w:color w:val="FFFFFF"/>
+                <w:sz w:val="18"/>
+              </w:rPr>
+              <w:t>Dinilai di bab mana</w:t>
+            </w:r>
+          </w:p>
+        </w:tc>
+      </w:tr>
+      <w:tr>
+        <w:tc>
+          <w:tcPr>
+            <w:tcW w:type="dxa" w:w="4320"/>
+          </w:tcPr>
+          <w:p>
+            <w:r>
+              <w:rPr>
+                <w:sz w:val="18"/>
+              </w:rPr>
+              <w:t>N. kranial II, III, IV, VI (visus/gerak mata)</w:t>
+            </w:r>
+          </w:p>
+        </w:tc>
+        <w:tc>
+          <w:tcPr>
+            <w:tcW w:type="dxa" w:w="4320"/>
+          </w:tcPr>
+          <w:p>
+            <w:r>
+              <w:rPr>
+                <w:sz w:val="18"/>
+              </w:rPr>
+              <w:t>Bab 12 (Mata)</w:t>
+            </w:r>
+          </w:p>
+        </w:tc>
+      </w:tr>
+      <w:tr>
+        <w:tc>
+          <w:tcPr>
+            <w:tcW w:type="dxa" w:w="4320"/>
+          </w:tcPr>
+          <w:p>
+            <w:r>
+              <w:rPr>
+                <w:sz w:val="18"/>
+              </w:rPr>
+              <w:t>N. kranial I, V, VII, VIII, IX, X, XI, XII (kecuali neuralgia trigeminal/glossofaringeal)</w:t>
+            </w:r>
+          </w:p>
+        </w:tc>
+        <w:tc>
+          <w:tcPr>
+            <w:tcW w:type="dxa" w:w="4320"/>
+          </w:tcPr>
+          <w:p>
+            <w:r>
+              <w:rPr>
+                <w:sz w:val="18"/>
+              </w:rPr>
+              <w:t>Bab 11 (THT)</w:t>
+            </w:r>
+          </w:p>
+        </w:tc>
+      </w:tr>
+      <w:tr>
+        <w:tc>
+          <w:tcPr>
+            <w:tcW w:type="dxa" w:w="4320"/>
+          </w:tcPr>
+          <w:p>
+            <w:r>
+              <w:rPr>
+                <w:sz w:val="18"/>
+              </w:rPr>
+              <w:t>Radikulopati, pleksopati saraf spinal; neuropati fokal ekstremitas (entrapment)</w:t>
+            </w:r>
+          </w:p>
+        </w:tc>
+        <w:tc>
+          <w:tcPr>
+            <w:tcW w:type="dxa" w:w="4320"/>
+          </w:tcPr>
+          <w:p>
+            <w:r>
+              <w:rPr>
+                <w:sz w:val="18"/>
+              </w:rPr>
+              <w:t>Bab 15/16/17</w:t>
+            </w:r>
+          </w:p>
+        </w:tc>
+      </w:tr>
+      <w:tr>
+        <w:tc>
+          <w:tcPr>
+            <w:tcW w:type="dxa" w:w="4320"/>
+          </w:tcPr>
+          <w:p>
+            <w:r>
+              <w:rPr>
+                <w:sz w:val="18"/>
+              </w:rPr>
+              <w:t>CRPS</w:t>
+            </w:r>
+          </w:p>
+        </w:tc>
+        <w:tc>
+          <w:tcPr>
+            <w:tcW w:type="dxa" w:w="4320"/>
+          </w:tcPr>
+          <w:p>
+            <w:r>
+              <w:rPr>
+                <w:sz w:val="18"/>
+              </w:rPr>
+              <w:t>HANYA Bab 15/16 (tidak ada di Bab 13)</w:t>
+            </w:r>
+          </w:p>
+        </w:tc>
+      </w:tr>
+      <w:tr>
+        <w:tc>
+          <w:tcPr>
+            <w:tcW w:type="dxa" w:w="4320"/>
+          </w:tcPr>
+          <w:p>
+            <w:r>
+              <w:rPr>
+                <w:sz w:val="18"/>
+              </w:rPr>
+              <w:t>Disartria &amp; disfonia</w:t>
+            </w:r>
+          </w:p>
+        </w:tc>
+        <w:tc>
+          <w:tcPr>
+            <w:tcW w:type="dxa" w:w="4320"/>
+          </w:tcPr>
+          <w:p>
+            <w:r>
+              <w:rPr>
+                <w:sz w:val="18"/>
+              </w:rPr>
+              <w:t>Bab 11</w:t>
+            </w:r>
+          </w:p>
+        </w:tc>
+      </w:tr>
+      <w:tr>
+        <w:tc>
+          <w:tcPr>
+            <w:tcW w:type="dxa" w:w="4320"/>
+          </w:tcPr>
+          <w:p>
+            <w:r>
+              <w:rPr>
+                <w:sz w:val="18"/>
+              </w:rPr>
+              <w:t>Disfasia; neuralgia trigeminal/glossofaringeal &amp; nyeri neuropatik kepala-trunkus lain</w:t>
+            </w:r>
+          </w:p>
+        </w:tc>
+        <w:tc>
+          <w:tcPr>
+            <w:tcW w:type="dxa" w:w="4320"/>
+          </w:tcPr>
+          <w:p>
+            <w:r>
+              <w:rPr>
+                <w:sz w:val="18"/>
+              </w:rPr>
+              <w:t>Tetap Bab 13</w:t>
+            </w:r>
+          </w:p>
+        </w:tc>
+      </w:tr>
+    </w:tbl>
+    <w:p/>
+    <w:p>
+      <w:r>
+        <w:t xml:space="preserve">Alur Cerebral Impairment (5 langkah, pilih </w:t>
+      </w:r>
+      <w:r>
+        <w:rPr>
+          <w:b/>
+        </w:rPr>
+        <w:t>satu yang paling berat</w:t>
+      </w:r>
+      <w:r>
+        <w:t xml:space="preserve">, gabung dengan Tabel 13-3 via CVC): (1) gangguan kesadaran/awareness (Kelas 0=0% s.d. Kelas 4=51-100%, koma/vegetative), (2) status mental &amp; fungsi integratif, (3) gangguan bahasa (afasia/disfasia), (4) gangguan emosi/perilaku (skala GAF — sama seperti Bab 14). Episodic LOC (epilepsi/sinkop) dinilai dari </w:t>
+      </w:r>
+      <w:r>
+        <w:rPr>
+          <w:b/>
+        </w:rPr>
+        <w:t>frekuensi &amp; dampak ADL</w:t>
+      </w:r>
+      <w:r>
+        <w:t>, bukan jenis kejang, dan harus sudah MMI dulu.</w:t>
+      </w:r>
+    </w:p>
+    <w:p>
+      <w:r>
+        <w:rPr>
+          <w:b/>
+        </w:rPr>
+        <w:t>Bab 14 — Mental &amp; Perilaku (AMA)</w:t>
+      </w:r>
+      <w:r>
+        <w:t xml:space="preserve"> — metodologi </w:t>
+      </w:r>
+      <w:r>
+        <w:rPr>
+          <w:b/>
+        </w:rPr>
+        <w:t>total berbeda</w:t>
+      </w:r>
+      <w:r>
+        <w:t xml:space="preserve">, tidak pakai grid Kelas-Grade biasa: pakai </w:t>
+      </w:r>
+      <w:r>
+        <w:rPr>
+          <w:b/>
+        </w:rPr>
+        <w:t>3 instrumen independen</w:t>
+      </w:r>
+      <w:r>
+        <w:t xml:space="preserve">, rating final = </w:t>
+      </w:r>
+      <w:r>
+        <w:rPr>
+          <w:b/>
+        </w:rPr>
+        <w:t>median</w:t>
+      </w:r>
+      <w:r>
+        <w:t xml:space="preserve"> (bukan rata-rata/tertinggi) dari ketiganya:</w:t>
+      </w:r>
+    </w:p>
+    <w:p>
+      <w:pPr>
+        <w:pStyle w:val="ListBullet"/>
+      </w:pPr>
+      <w:r>
+        <w:rPr>
+          <w:b/>
+        </w:rPr>
+        <w:t>BPRS</w:t>
+      </w:r>
+      <w:r>
+        <w:t>: 24 item skor 1-7, jumlahkan (24-168) → % impairment (mis. 24-30→0%, 71-168→50%).</w:t>
+      </w:r>
+    </w:p>
+    <w:p>
+      <w:pPr>
+        <w:pStyle w:val="ListBullet"/>
+      </w:pPr>
+      <w:r>
+        <w:rPr>
+          <w:b/>
+        </w:rPr>
+        <w:t>GAF</w:t>
+      </w:r>
+      <w:r>
+        <w:t>: skor standar 0-100 → % impairment (mis. 61-70→5%, 1-10→50%) — hanya menilai fungsi psikologis/sosial/okupasional.</w:t>
+      </w:r>
+    </w:p>
+    <w:p>
+      <w:pPr>
+        <w:pStyle w:val="ListBullet"/>
+      </w:pPr>
+      <w:r>
+        <w:rPr>
+          <w:b/>
+        </w:rPr>
+        <w:t>PIRS</w:t>
+      </w:r>
+      <w:r>
+        <w:t xml:space="preserve">: 6 domain skor 1-5, urutkan, ambil </w:t>
+      </w:r>
+      <w:r>
+        <w:rPr>
+          <w:b/>
+        </w:rPr>
+        <w:t>2 skor tengah</w:t>
+      </w:r>
+      <w:r>
+        <w:t>, jumlahkan, cocokkan tabel.</w:t>
+      </w:r>
+    </w:p>
+    <w:p>
+      <w:r>
+        <w:rPr>
+          <w:i/>
+        </w:rPr>
+        <w:t>Contoh</w:t>
+      </w:r>
+      <w:r>
+        <w:t xml:space="preserve"> (skizofrenia): BPRS=10%, GAF=15%, PIRS=20% → median = </w:t>
+      </w:r>
+      <w:r>
+        <w:rPr>
+          <w:b/>
+        </w:rPr>
+        <w:t>15%</w:t>
+      </w:r>
+      <w:r>
+        <w:t xml:space="preserve"> (final). Bila gangguan mental menyertai impairment fisik yang sudah dinilai (mis. nyeri kronik + adjustment disorder ringan), </w:t>
+      </w:r>
+      <w:r>
+        <w:rPr>
+          <w:b/>
+        </w:rPr>
+        <w:t>Bab 14 umumnya tidak perlu dipakai</w:t>
+      </w:r>
+      <w:r>
+        <w:t xml:space="preserve"> (sudah tercakup dalam rating fisik).</w:t>
+      </w:r>
+    </w:p>
+    <w:p>
+      <w:r>
+        <w:rPr>
+          <w:b/>
+        </w:rPr>
+        <w:t>Bab 15/16/17 — Muskuloskeletal</w:t>
+      </w:r>
+      <w:r>
+        <w:t xml:space="preserve"> (bab paling kompleks, paling sering keluar ujian): tiap regio dibagi </w:t>
+      </w:r>
+      <w:r>
+        <w:rPr>
+          <w:b/>
+        </w:rPr>
+        <w:t>3 kategori diagnosis</w:t>
+      </w:r>
+      <w:r>
+        <w:t xml:space="preserve"> — Soft Tissue (terendah) → Muscle/Tendon → Ligament/Bone/Joint (tertinggi); nyeri di satu regio hanya dinilai sekali. </w:t>
+      </w:r>
+      <w:r>
+        <w:rPr>
+          <w:b/>
+        </w:rPr>
+        <w:t>Operasi tidak otomatis menambah nilai</w:t>
+      </w:r>
+      <w:r>
+        <w:t xml:space="preserve"> — hanya relevan bila mengubah status fungsional saat MMI.</w:t>
+      </w:r>
+    </w:p>
+    <w:p>
+      <w:pPr>
+        <w:pStyle w:val="ListBullet"/>
+      </w:pPr>
+      <w:r>
+        <w:rPr>
+          <w:b/>
+        </w:rPr>
+        <w:t>Bab 15 (Ekstremitas Atas)</w:t>
+      </w:r>
+      <w:r>
+        <w:t xml:space="preserve"> — 4 regio: Digit/Hand, Wrist, Elbow, Shoulder. Konversi berjenjang Digit→Hand→UEI→WPI (Tabel 15-12). </w:t>
+      </w:r>
+      <w:r>
+        <w:rPr>
+          <w:i/>
+        </w:rPr>
+        <w:t>Contoh Kasus A (trigger finger)</w:t>
+      </w:r>
+      <w:r>
+        <w:t xml:space="preserve">: Kelas 1 (default 6% Digit), GMFH=2, GMPE=2, GMCS=n/a → Net Adjustment=+2 → Grade E → </w:t>
+      </w:r>
+      <w:r>
+        <w:rPr>
+          <w:b/>
+        </w:rPr>
+        <w:t>8% Digit</w:t>
+      </w:r>
+      <w:r>
+        <w:t xml:space="preserve"> → 2% Hand → 1% UEI → </w:t>
+      </w:r>
+      <w:r>
+        <w:rPr>
+          <w:b/>
+        </w:rPr>
+        <w:t>1% WPI</w:t>
+      </w:r>
+      <w:r>
+        <w:t xml:space="preserve">. </w:t>
+      </w:r>
+      <w:r>
+        <w:rPr>
+          <w:i/>
+        </w:rPr>
+        <w:t>Kasus B (TFCC tear)</w:t>
+      </w:r>
+      <w:r>
+        <w:t xml:space="preserve">: semua grade modifier = kelas → Net Adjustment=0 → Grade C → tetap </w:t>
+      </w:r>
+      <w:r>
+        <w:rPr>
+          <w:b/>
+        </w:rPr>
+        <w:t>8% UEI</w:t>
+      </w:r>
+      <w:r>
+        <w:t xml:space="preserve">. </w:t>
+      </w:r>
+      <w:r>
+        <w:rPr>
+          <w:i/>
+        </w:rPr>
+        <w:t>Kasus C (instabilitas jari 20°)</w:t>
+      </w:r>
+      <w:r>
+        <w:t xml:space="preserve">: Net Adjustment=−1 → Grade B → </w:t>
+      </w:r>
+      <w:r>
+        <w:rPr>
+          <w:b/>
+        </w:rPr>
+        <w:t>14% Digit</w:t>
+      </w:r>
+      <w:r>
+        <w:t xml:space="preserve"> (bukan 15%). Metode alternatif: ROM (ditandai asterisk di grid, tak boleh digabung DBI diagnosis sama), CRPS (tabel tersendiri di Bab 15, bukan Bab 13), Peripheral Nerve/Entrapment, Amputasi.</w:t>
+      </w:r>
+    </w:p>
+    <w:p>
+      <w:pPr>
+        <w:pStyle w:val="ListBullet"/>
+      </w:pPr>
+      <w:r>
+        <w:rPr>
+          <w:b/>
+        </w:rPr>
+        <w:t>Bab 16 (Ekstremitas Bawah)</w:t>
+      </w:r>
+      <w:r>
+        <w:t xml:space="preserve"> — 3 regio: Foot&amp;Ankle, Knee, Hip. Struktur kelas: 0=0%, 1=1-13% LEI, 2=14-25%, 3=26-49%, 4=50-100% LEI. </w:t>
+      </w:r>
+      <w:r>
+        <w:rPr>
+          <w:b/>
+        </w:rPr>
+        <w:t>Faktor konversi wajib hafal</w:t>
+      </w:r>
+      <w:r>
+        <w:t xml:space="preserve">: LE→WP </w:t>
+      </w:r>
+      <w:r>
+        <w:rPr>
+          <w:b/>
+        </w:rPr>
+        <w:t>40%</w:t>
+      </w:r>
+      <w:r>
+        <w:t xml:space="preserve">, Foot&amp;Ankle→LE </w:t>
+      </w:r>
+      <w:r>
+        <w:rPr>
+          <w:b/>
+        </w:rPr>
+        <w:t>70%</w:t>
+      </w:r>
+      <w:r>
+        <w:t xml:space="preserve">, ibu jari kaki→Foot/Ankle </w:t>
+      </w:r>
+      <w:r>
+        <w:rPr>
+          <w:b/>
+        </w:rPr>
+        <w:t>17%</w:t>
+      </w:r>
+      <w:r>
+        <w:t>, jari kaki lain→</w:t>
+      </w:r>
+      <w:r>
+        <w:rPr>
+          <w:b/>
+        </w:rPr>
+        <w:t>3%</w:t>
+      </w:r>
+      <w:r>
+        <w:t>. Vaskuler ekstremitas bawah tetap dinilai di Bab 4, bukan di sini.</w:t>
+      </w:r>
+    </w:p>
+    <w:p>
+      <w:pPr>
+        <w:pStyle w:val="ListBullet"/>
+      </w:pPr>
+      <w:r>
+        <w:rPr>
+          <w:b/>
+        </w:rPr>
+        <w:t>Bab 17 (Spine &amp; Pelvis)</w:t>
+      </w:r>
+      <w:r>
+        <w:t xml:space="preserve"> — 3 regio dengan rentang kelas </w:t>
+      </w:r>
+      <w:r>
+        <w:rPr>
+          <w:b/>
+        </w:rPr>
+        <w:t>berbeda-beda</w:t>
+      </w:r>
+      <w:r>
+        <w:t>:</w:t>
+      </w:r>
+    </w:p>
+    <w:tbl>
+      <w:tblPr>
+        <w:tblStyle w:val="TableGrid"/>
+        <w:tblW w:type="auto" w:w="0"/>
+        <w:tblLayout w:type="autofit"/>
+        <w:tblLook w:firstColumn="1" w:firstRow="1" w:lastColumn="0" w:lastRow="0" w:noHBand="0" w:noVBand="1" w:val="04A0"/>
+      </w:tblPr>
+      <w:tblGrid>
+        <w:gridCol w:w="1728"/>
+        <w:gridCol w:w="1728"/>
+        <w:gridCol w:w="1728"/>
+        <w:gridCol w:w="1728"/>
+        <w:gridCol w:w="1728"/>
+      </w:tblGrid>
+      <w:tr>
+        <w:tc>
+          <w:tcPr>
+            <w:tcW w:type="dxa" w:w="1728"/>
+            <w:shd w:val="clear" w:color="auto" w:fill="1F4E5F"/>
+          </w:tcPr>
+          <w:p>
+            <w:r>
+              <w:rPr>
+                <w:b/>
+                <w:color w:val="FFFFFF"/>
+                <w:sz w:val="18"/>
+              </w:rPr>
+              <w:t>Regio</w:t>
+            </w:r>
+          </w:p>
+        </w:tc>
+        <w:tc>
+          <w:tcPr>
+            <w:tcW w:type="dxa" w:w="1728"/>
+            <w:shd w:val="clear" w:color="auto" w:fill="1F4E5F"/>
+          </w:tcPr>
+          <w:p>
+            <w:r>
+              <w:rPr>
+                <w:b/>
+                <w:color w:val="FFFFFF"/>
+                <w:sz w:val="18"/>
+              </w:rPr>
+              <w:t>Kelas 1</w:t>
+            </w:r>
+          </w:p>
+        </w:tc>
+        <w:tc>
+          <w:tcPr>
+            <w:tcW w:type="dxa" w:w="1728"/>
+            <w:shd w:val="clear" w:color="auto" w:fill="1F4E5F"/>
+          </w:tcPr>
+          <w:p>
+            <w:r>
+              <w:rPr>
+                <w:b/>
+                <w:color w:val="FFFFFF"/>
+                <w:sz w:val="18"/>
+              </w:rPr>
+              <w:t>Kelas 2</w:t>
+            </w:r>
+          </w:p>
+        </w:tc>
+        <w:tc>
+          <w:tcPr>
+            <w:tcW w:type="dxa" w:w="1728"/>
+            <w:shd w:val="clear" w:color="auto" w:fill="1F4E5F"/>
+          </w:tcPr>
+          <w:p>
+            <w:r>
+              <w:rPr>
+                <w:b/>
+                <w:color w:val="FFFFFF"/>
+                <w:sz w:val="18"/>
+              </w:rPr>
+              <w:t>Kelas 3</w:t>
+            </w:r>
+          </w:p>
+        </w:tc>
+        <w:tc>
+          <w:tcPr>
+            <w:tcW w:type="dxa" w:w="1728"/>
+            <w:shd w:val="clear" w:color="auto" w:fill="1F4E5F"/>
+          </w:tcPr>
+          <w:p>
+            <w:r>
+              <w:rPr>
+                <w:b/>
+                <w:color w:val="FFFFFF"/>
+                <w:sz w:val="18"/>
+              </w:rPr>
+              <w:t>Kelas 4</w:t>
+            </w:r>
+          </w:p>
+        </w:tc>
+      </w:tr>
+      <w:tr>
+        <w:tc>
+          <w:tcPr>
+            <w:tcW w:type="dxa" w:w="1728"/>
+          </w:tcPr>
+          <w:p>
+            <w:r>
+              <w:rPr>
+                <w:sz w:val="18"/>
+              </w:rPr>
+              <w:t>Cervical</w:t>
+            </w:r>
+          </w:p>
+        </w:tc>
+        <w:tc>
+          <w:tcPr>
+            <w:tcW w:type="dxa" w:w="1728"/>
+          </w:tcPr>
+          <w:p>
+            <w:r>
+              <w:rPr>
+                <w:sz w:val="18"/>
+              </w:rPr>
+              <w:t>1-8%</w:t>
+            </w:r>
+          </w:p>
+        </w:tc>
+        <w:tc>
+          <w:tcPr>
+            <w:tcW w:type="dxa" w:w="1728"/>
+          </w:tcPr>
+          <w:p>
+            <w:r>
+              <w:rPr>
+                <w:sz w:val="18"/>
+              </w:rPr>
+              <w:t>9-14%</w:t>
+            </w:r>
+          </w:p>
+        </w:tc>
+        <w:tc>
+          <w:tcPr>
+            <w:tcW w:type="dxa" w:w="1728"/>
+          </w:tcPr>
+          <w:p>
+            <w:r>
+              <w:rPr>
+                <w:sz w:val="18"/>
+              </w:rPr>
+              <w:t>15-24%</w:t>
+            </w:r>
+          </w:p>
+        </w:tc>
+        <w:tc>
+          <w:tcPr>
+            <w:tcW w:type="dxa" w:w="1728"/>
+          </w:tcPr>
+          <w:p>
+            <w:r>
+              <w:rPr>
+                <w:sz w:val="18"/>
+              </w:rPr>
+              <w:t>25-30%</w:t>
+            </w:r>
+          </w:p>
+        </w:tc>
+      </w:tr>
+      <w:tr>
+        <w:tc>
+          <w:tcPr>
+            <w:tcW w:type="dxa" w:w="1728"/>
+          </w:tcPr>
+          <w:p>
+            <w:r>
+              <w:rPr>
+                <w:sz w:val="18"/>
+              </w:rPr>
+              <w:t>Thoracic</w:t>
+            </w:r>
+          </w:p>
+        </w:tc>
+        <w:tc>
+          <w:tcPr>
+            <w:tcW w:type="dxa" w:w="1728"/>
+          </w:tcPr>
+          <w:p>
+            <w:r>
+              <w:rPr>
+                <w:sz w:val="18"/>
+              </w:rPr>
+              <w:t>1-6%</w:t>
+            </w:r>
+          </w:p>
+        </w:tc>
+        <w:tc>
+          <w:tcPr>
+            <w:tcW w:type="dxa" w:w="1728"/>
+          </w:tcPr>
+          <w:p>
+            <w:r>
+              <w:rPr>
+                <w:sz w:val="18"/>
+              </w:rPr>
+              <w:t>7-11%</w:t>
+            </w:r>
+          </w:p>
+        </w:tc>
+        <w:tc>
+          <w:tcPr>
+            <w:tcW w:type="dxa" w:w="1728"/>
+          </w:tcPr>
+          <w:p>
+            <w:r>
+              <w:rPr>
+                <w:sz w:val="18"/>
+              </w:rPr>
+              <w:t>12-16%</w:t>
+            </w:r>
+          </w:p>
+        </w:tc>
+        <w:tc>
+          <w:tcPr>
+            <w:tcW w:type="dxa" w:w="1728"/>
+          </w:tcPr>
+          <w:p>
+            <w:r>
+              <w:rPr>
+                <w:sz w:val="18"/>
+              </w:rPr>
+              <w:t>17-22%</w:t>
+            </w:r>
+          </w:p>
+        </w:tc>
+      </w:tr>
+      <w:tr>
+        <w:tc>
+          <w:tcPr>
+            <w:tcW w:type="dxa" w:w="1728"/>
+          </w:tcPr>
+          <w:p>
+            <w:r>
+              <w:rPr>
+                <w:sz w:val="18"/>
+              </w:rPr>
+              <w:t>Lumbar</w:t>
+            </w:r>
+          </w:p>
+        </w:tc>
+        <w:tc>
+          <w:tcPr>
+            <w:tcW w:type="dxa" w:w="1728"/>
+          </w:tcPr>
+          <w:p>
+            <w:r>
+              <w:rPr>
+                <w:sz w:val="18"/>
+              </w:rPr>
+              <w:t>1-9%</w:t>
+            </w:r>
+          </w:p>
+        </w:tc>
+        <w:tc>
+          <w:tcPr>
+            <w:tcW w:type="dxa" w:w="1728"/>
+          </w:tcPr>
+          <w:p>
+            <w:r>
+              <w:rPr>
+                <w:sz w:val="18"/>
+              </w:rPr>
+              <w:t>10-14%</w:t>
+            </w:r>
+          </w:p>
+        </w:tc>
+        <w:tc>
+          <w:tcPr>
+            <w:tcW w:type="dxa" w:w="1728"/>
+          </w:tcPr>
+          <w:p>
+            <w:r>
+              <w:rPr>
+                <w:sz w:val="18"/>
+              </w:rPr>
+              <w:t>15-24%</w:t>
+            </w:r>
+          </w:p>
+        </w:tc>
+        <w:tc>
+          <w:tcPr>
+            <w:tcW w:type="dxa" w:w="1728"/>
+          </w:tcPr>
+          <w:p>
+            <w:r>
+              <w:rPr>
+                <w:sz w:val="18"/>
+              </w:rPr>
+              <w:t>25-33%</w:t>
+            </w:r>
+          </w:p>
+        </w:tc>
+      </w:tr>
+    </w:tbl>
+    <w:p/>
+    <w:p>
+      <w:r>
+        <w:rPr>
+          <w:b/>
+        </w:rPr>
+        <w:t>AOMSI</w:t>
+      </w:r>
+      <w:r>
+        <w:t xml:space="preserve"> (Alteration of Motion Segment Integrity, dari radiografi fleksi-ekstensi) menentukan kelas — bila dipakai, temuan imaging </w:t>
+      </w:r>
+      <w:r>
+        <w:rPr>
+          <w:b/>
+        </w:rPr>
+        <w:t>tidak dimasukkan lagi</w:t>
+      </w:r>
+      <w:r>
+        <w:t xml:space="preserve"> ke Net Adjustment. </w:t>
+      </w:r>
+      <w:r>
+        <w:rPr>
+          <w:b/>
+        </w:rPr>
+        <w:t>Radikulopati BUKAN nilai tambahan terpisah</w:t>
+      </w:r>
+      <w:r>
+        <w:t xml:space="preserve"> — sudah melebur ke dalam rentang nilai diagnosis via grade adjustment. Konversi regional </w:t>
+      </w:r>
+      <w:r>
+        <w:rPr>
+          <w:b/>
+        </w:rPr>
+        <w:t>dibagi</w:t>
+      </w:r>
+      <w:r>
+        <w:t xml:space="preserve"> (bukan dikalikan seperti ekstremitas): faktor Cervical 0,35; Thoracic 0,20; Lumbar 0,75. Mielopati/cauda equina/cedera medula spinalis dinilai terpisah di Bab 13, digabung via CVC.</w:t>
+      </w:r>
+    </w:p>
+    <w:p>
+      <w:pPr>
+        <w:pStyle w:val="Heading2"/>
+      </w:pPr>
+      <w:r>
+        <w:t>5.3 Permenaker 25/2008 — Pedoman Diagnosis &amp; Penilaian per Bidang (Lengkap, 9 Bidang)</w:t>
+      </w:r>
+    </w:p>
+    <w:p>
+      <w:r>
+        <w:rPr>
+          <w:i/>
+        </w:rPr>
+        <w:t>Menggantikan Kepmenakertrans No. KEP.79/MEN/2003; ditetapkan 18 Desember 2008. Struktur tiap bidang: Batasan → Diagnosis (Anamnesis, PF, Penunjang) → Uraian Penilaian Cacat.</w:t>
+      </w:r>
+    </w:p>
+    <w:p>
+      <w:r>
+        <w:rPr>
+          <w:b/>
+        </w:rPr>
+        <w:t>Bidang 1 — Kulit</w:t>
+      </w:r>
+      <w:r>
+        <w:t xml:space="preserve">: penyakit kulit akibat faktor risiko mekanik/fisik/kimia/biologik/psikologik (dermatitis kontak, acne, infeksi kulit, neoplasia, kelainan pigmentasi). Penunjang kunci: KOH 20% (jamur), VDRL (≤1/4 bukan sifilis, &gt;1/4 curiga), HIV (Western Blot/Elisa 3× metode berbeda), lampu Wood, histopatologi, </w:t>
+      </w:r>
+      <w:r>
+        <w:rPr>
+          <w:b/>
+        </w:rPr>
+        <w:t>uji tempel</w:t>
+      </w:r>
+      <w:r>
+        <w:t xml:space="preserve"> (terbuka: bahan iritan belakang telinga, evaluasi 24 jam; tertutup: alergen standar/nonstandar dilusi 1/1000–1/100, punggung/lengan atas, dibuka 48 jam, evaluasi 15 menit kemudian). </w:t>
+      </w:r>
+      <w:r>
+        <w:rPr>
+          <w:b/>
+        </w:rPr>
+        <w:t>Cara pakai</w:t>
+      </w:r>
+      <w:r>
+        <w:t>: cacat kulit tidak masuk tabel PP 14/1993 — dinilai dari derajat gangguan fungsi sesuai luas &amp; lokasi lesi (kronisitas, rekurensi pasca-RTW).</w:t>
+      </w:r>
+    </w:p>
+    <w:p>
+      <w:r>
+        <w:rPr>
+          <w:b/>
+        </w:rPr>
+        <w:t>Bidang 2 — Neurologi</w:t>
+      </w:r>
+      <w:r>
+        <w:t xml:space="preserve">: sistem saraf pusat &amp; perifer (trauma, vaskuler, infeksi, degenerasi, keganasan, metabolik, intoksikasi). </w:t>
+      </w:r>
+      <w:r>
+        <w:rPr>
+          <w:b/>
+        </w:rPr>
+        <w:t>Motorik — MMT</w:t>
+      </w:r>
+      <w:r>
+        <w:t xml:space="preserve"> (lihat tabel di §5.1 versi ringkas atau tabel identik di bawah). </w:t>
+      </w:r>
+      <w:r>
+        <w:rPr>
+          <w:b/>
+        </w:rPr>
+        <w:t>Otonom</w:t>
+      </w:r>
+      <w:r>
+        <w:t xml:space="preserve">: berkeringat/miksi-defekasi — tak ada 0%, sebagian 50%, total 100%. </w:t>
+      </w:r>
+      <w:r>
+        <w:rPr>
+          <w:b/>
+        </w:rPr>
+        <w:t>Libido</w:t>
+      </w:r>
+      <w:r>
+        <w:t xml:space="preserve">: belum punya anak 40%, sudah punya anak 20%. </w:t>
+      </w:r>
+      <w:r>
+        <w:rPr>
+          <w:b/>
+        </w:rPr>
+        <w:t>Medula spinalis — ASIA/IMSOP</w:t>
+      </w:r>
+      <w:r>
+        <w:t xml:space="preserve"> (A Komplit &gt;75% hilang · B &gt;50-75% · C &gt;25-50% · D 1-25% · E Normal 0%). </w:t>
+      </w:r>
+      <w:r>
+        <w:rPr>
+          <w:b/>
+        </w:rPr>
+        <w:t>GOS</w:t>
+      </w:r>
+      <w:r>
+        <w:t xml:space="preserve"> pasca-trauma kepala, dinilai setelah 6 bulan neurorehabilitasi (1 vegetatif &gt;75% · 2 berat 51-75% · 3 sedang 25-50% · 4 ringan 1-25%). </w:t>
+      </w:r>
+      <w:r>
+        <w:rPr>
+          <w:b/>
+        </w:rPr>
+        <w:t>Ischialgia/Brachialgia &amp; neuritis jebakan</w:t>
+      </w:r>
+      <w:r>
+        <w:t xml:space="preserve">: dinilai setelah terapi 6 bulan — kemampuan kerja 50-75%→santunan 40%; 25-50%→20%. </w:t>
+      </w:r>
+      <w:r>
+        <w:rPr>
+          <w:b/>
+        </w:rPr>
+        <w:t>Stroke kerja</w:t>
+      </w:r>
+      <w:r>
+        <w:t xml:space="preserve">: diakui KK jika terjadi saat bekerja </w:t>
+      </w:r>
+      <w:r>
+        <w:rPr>
+          <w:b/>
+        </w:rPr>
+        <w:t>dan</w:t>
+      </w:r>
+      <w:r>
+        <w:t xml:space="preserve"> meninggal ≤24 jam. Saraf kranial lintas-bidang: N.I→Mata, N.VIII→THT, N.IX-X→Orthopaedi (jebakan soal umum).</w:t>
       </w:r>
     </w:p>
     <w:tbl>
@@ -1911,7 +4497,80 @@
         <w:rPr>
           <w:b/>
         </w:rPr>
-        <w:t>Cedera medula spinalis — Impairment Scale (ASIA/IMSOP):</w:t>
+        <w:t>Bidang 3 — Penyakit Dalam</w:t>
+      </w:r>
+      <w:r>
+        <w:t xml:space="preserve"> (7 subsistem):</w:t>
+      </w:r>
+    </w:p>
+    <w:p>
+      <w:pPr>
+        <w:pStyle w:val="ListBullet"/>
+      </w:pPr>
+      <w:r>
+        <w:rPr>
+          <w:b/>
+        </w:rPr>
+        <w:t>a. Jantung</w:t>
+      </w:r>
+      <w:r>
+        <w:t>: Canadian Cardiovascular Social Function Classification (CCSFC) — ringan = Class I (tak ada angina pada beban ringan).</w:t>
+      </w:r>
+    </w:p>
+    <w:p>
+      <w:pPr>
+        <w:pStyle w:val="ListBullet"/>
+      </w:pPr>
+      <w:r>
+        <w:rPr>
+          <w:b/>
+        </w:rPr>
+        <w:t>b. Ginjal</w:t>
+      </w:r>
+      <w:r>
+        <w:t>: cacat menetap dari klirens kreatinin (mis. 50-75 mL/menit, kreatinin serum 1,5-4 mg%).</w:t>
+      </w:r>
+    </w:p>
+    <w:p>
+      <w:pPr>
+        <w:pStyle w:val="ListBullet"/>
+      </w:pPr>
+      <w:r>
+        <w:rPr>
+          <w:b/>
+        </w:rPr>
+        <w:t>c. Saluran Cerna &amp; Hati</w:t>
+      </w:r>
+      <w:r>
+        <w:t>: hepatitis akut/kronik, sirosis, hepatoma — ringan (nyeri tertoleransi/faal hati sedikit naik) sampai berat (sirosis/hepatoma/fulminan).</w:t>
+      </w:r>
+    </w:p>
+    <w:p>
+      <w:pPr>
+        <w:pStyle w:val="ListBullet"/>
+      </w:pPr>
+      <w:r>
+        <w:rPr>
+          <w:b/>
+        </w:rPr>
+        <w:t>d-e. Endokrin &amp; Darah</w:t>
+      </w:r>
+      <w:r>
+        <w:t>: dari parameter lab (Hb, leukosit) + gejala klinis (mis. anemia aplastik: Hb 10-12 g% ringan; leukosit &lt;100.000).</w:t>
+      </w:r>
+    </w:p>
+    <w:p>
+      <w:pPr>
+        <w:pStyle w:val="ListBullet"/>
+      </w:pPr>
+      <w:r>
+        <w:rPr>
+          <w:b/>
+        </w:rPr>
+        <w:t>f. Otot &amp; Kerangka</w:t>
+      </w:r>
+      <w:r>
+        <w:t xml:space="preserve"> (bagian Penyakit Dalam, BUKAN Orthopaedi — sendi: bahu, siku, pergelangan, MCP, PIP, DIP, coxae, genu, subtarsal, tarso-metatarsal, MTP):</w:t>
       </w:r>
     </w:p>
     <w:tbl>
@@ -1940,7 +4599,7 @@
                 <w:color w:val="FFFFFF"/>
                 <w:sz w:val="18"/>
               </w:rPr>
-              <w:t>Grade</w:t>
+              <w:t>Domain</w:t>
             </w:r>
           </w:p>
         </w:tc>
@@ -1956,7 +4615,7 @@
                 <w:color w:val="FFFFFF"/>
                 <w:sz w:val="18"/>
               </w:rPr>
-              <w:t>Tipe</w:t>
+              <w:t>Ringan</w:t>
             </w:r>
           </w:p>
         </w:tc>
@@ -1972,7 +4631,7 @@
                 <w:color w:val="FFFFFF"/>
                 <w:sz w:val="18"/>
               </w:rPr>
-              <w:t>Deskripsi fungsi</w:t>
+              <w:t>Sedang</w:t>
             </w:r>
           </w:p>
         </w:tc>
@@ -1988,7 +4647,7 @@
                 <w:color w:val="FFFFFF"/>
                 <w:sz w:val="18"/>
               </w:rPr>
-              <w:t>% fungsi hilang</w:t>
+              <w:t>Berat</w:t>
             </w:r>
           </w:p>
         </w:tc>
@@ -2003,7 +4662,7 @@
               <w:rPr>
                 <w:sz w:val="18"/>
               </w:rPr>
-              <w:t>A</w:t>
+              <w:t>Keterbatasan ROM</w:t>
             </w:r>
           </w:p>
         </w:tc>
@@ -2016,7 +4675,7 @@
               <w:rPr>
                 <w:sz w:val="18"/>
               </w:rPr>
-              <w:t>Komplit</w:t>
+              <w:t>30%</w:t>
             </w:r>
           </w:p>
         </w:tc>
@@ -2029,13 +4688,587 @@
               <w:rPr>
                 <w:sz w:val="18"/>
               </w:rPr>
-              <w:t>Tak ada motorik/sensorik S4-S5</w:t>
+              <w:t>30-70%</w:t>
             </w:r>
           </w:p>
         </w:tc>
         <w:tc>
           <w:tcPr>
             <w:tcW w:type="dxa" w:w="2160"/>
+          </w:tcPr>
+          <w:p>
+            <w:r>
+              <w:rPr>
+                <w:sz w:val="18"/>
+              </w:rPr>
+              <w:t>70-100%</w:t>
+            </w:r>
+          </w:p>
+        </w:tc>
+      </w:tr>
+      <w:tr>
+        <w:tc>
+          <w:tcPr>
+            <w:tcW w:type="dxa" w:w="2160"/>
+          </w:tcPr>
+          <w:p>
+            <w:r>
+              <w:rPr>
+                <w:sz w:val="18"/>
+              </w:rPr>
+              <w:t>Stabilitas sendi</w:t>
+            </w:r>
+          </w:p>
+        </w:tc>
+        <w:tc>
+          <w:tcPr>
+            <w:tcW w:type="dxa" w:w="2160"/>
+          </w:tcPr>
+          <w:p>
+            <w:r>
+              <w:rPr>
+                <w:sz w:val="18"/>
+              </w:rPr>
+              <w:t>sedikit terganggu</w:t>
+            </w:r>
+          </w:p>
+        </w:tc>
+        <w:tc>
+          <w:tcPr>
+            <w:tcW w:type="dxa" w:w="2160"/>
+          </w:tcPr>
+          <w:p>
+            <w:r>
+              <w:rPr>
+                <w:sz w:val="18"/>
+              </w:rPr>
+              <w:t>sukar digunakan</w:t>
+            </w:r>
+          </w:p>
+        </w:tc>
+        <w:tc>
+          <w:tcPr>
+            <w:tcW w:type="dxa" w:w="2160"/>
+          </w:tcPr>
+          <w:p>
+            <w:r>
+              <w:rPr>
+                <w:sz w:val="18"/>
+              </w:rPr>
+              <w:t>sangat terbatas</w:t>
+            </w:r>
+          </w:p>
+        </w:tc>
+      </w:tr>
+      <w:tr>
+        <w:tc>
+          <w:tcPr>
+            <w:tcW w:type="dxa" w:w="2160"/>
+          </w:tcPr>
+          <w:p>
+            <w:r>
+              <w:rPr>
+                <w:sz w:val="18"/>
+              </w:rPr>
+              <w:t>Deviasi/malformasi</w:t>
+            </w:r>
+          </w:p>
+        </w:tc>
+        <w:tc>
+          <w:tcPr>
+            <w:tcW w:type="dxa" w:w="2160"/>
+          </w:tcPr>
+          <w:p>
+            <w:r>
+              <w:rPr>
+                <w:sz w:val="18"/>
+              </w:rPr>
+              <w:t>sedikit kesukaran</w:t>
+            </w:r>
+          </w:p>
+        </w:tc>
+        <w:tc>
+          <w:tcPr>
+            <w:tcW w:type="dxa" w:w="2160"/>
+          </w:tcPr>
+          <w:p>
+            <w:r>
+              <w:rPr>
+                <w:sz w:val="18"/>
+              </w:rPr>
+              <w:t>menyukarkan gerak</w:t>
+            </w:r>
+          </w:p>
+        </w:tc>
+        <w:tc>
+          <w:tcPr>
+            <w:tcW w:type="dxa" w:w="2160"/>
+          </w:tcPr>
+          <w:p>
+            <w:r>
+              <w:rPr>
+                <w:sz w:val="18"/>
+              </w:rPr>
+              <w:t>tak dapat digunakan</w:t>
+            </w:r>
+          </w:p>
+        </w:tc>
+      </w:tr>
+      <w:tr>
+        <w:tc>
+          <w:tcPr>
+            <w:tcW w:type="dxa" w:w="2160"/>
+          </w:tcPr>
+          <w:p>
+            <w:r>
+              <w:rPr>
+                <w:sz w:val="18"/>
+              </w:rPr>
+              <w:t>Kelemahan otot</w:t>
+            </w:r>
+          </w:p>
+        </w:tc>
+        <w:tc>
+          <w:tcPr>
+            <w:tcW w:type="dxa" w:w="2160"/>
+          </w:tcPr>
+          <w:p>
+            <w:r>
+              <w:rPr>
+                <w:sz w:val="18"/>
+              </w:rPr>
+              <w:t>kekuatan 4-5</w:t>
+            </w:r>
+          </w:p>
+        </w:tc>
+        <w:tc>
+          <w:tcPr>
+            <w:tcW w:type="dxa" w:w="2160"/>
+          </w:tcPr>
+          <w:p>
+            <w:r>
+              <w:rPr>
+                <w:sz w:val="18"/>
+              </w:rPr>
+              <w:t>kekuatan 2-3</w:t>
+            </w:r>
+          </w:p>
+        </w:tc>
+        <w:tc>
+          <w:tcPr>
+            <w:tcW w:type="dxa" w:w="2160"/>
+          </w:tcPr>
+          <w:p>
+            <w:r>
+              <w:rPr>
+                <w:sz w:val="18"/>
+              </w:rPr>
+              <w:t>kekuatan 0-1</w:t>
+            </w:r>
+          </w:p>
+        </w:tc>
+      </w:tr>
+    </w:tbl>
+    <w:p/>
+    <w:p>
+      <w:r>
+        <w:rPr>
+          <w:b/>
+        </w:rPr>
+        <w:t>Gangguan Fungsi Steinbrocker</w:t>
+      </w:r>
+      <w:r>
+        <w:t xml:space="preserve"> (subjektif, hindari kecuali darurat): 1 aktivitas sehari-hari 25% · 2 beberapa kesukaran 50% · 3 terbatas/perlu dibantu 75% · 4 sangat sukar 100%.</w:t>
+      </w:r>
+    </w:p>
+    <w:p>
+      <w:pPr>
+        <w:pStyle w:val="ListBullet"/>
+      </w:pPr>
+      <w:r>
+        <w:rPr>
+          <w:b/>
+        </w:rPr>
+        <w:t>g. Infeksi</w:t>
+      </w:r>
+      <w:r>
+        <w:t xml:space="preserve">: Hepatitis B/C, TB, HIV — diagnostik dari riwayat kontak + lab konfirmasi; dinilai </w:t>
+      </w:r>
+      <w:r>
+        <w:rPr>
+          <w:b/>
+        </w:rPr>
+        <w:t>setelah terapi</w:t>
+      </w:r>
+      <w:r>
+        <w:t xml:space="preserve">; HIV otomatis kategori </w:t>
+      </w:r>
+      <w:r>
+        <w:rPr>
+          <w:b/>
+        </w:rPr>
+        <w:t>berat</w:t>
+      </w:r>
+      <w:r>
+        <w:t>.</w:t>
+      </w:r>
+    </w:p>
+    <w:p>
+      <w:r>
+        <w:rPr>
+          <w:b/>
+        </w:rPr>
+        <w:t>Bidang 4 — Psikiatri</w:t>
+      </w:r>
+      <w:r>
+        <w:t xml:space="preserve">: gangguan jiwa terkait kerja (anxietas, depresi, burn-out, absenteisme, histeria massal). Klasifikasi ICD-10: paling sering Gangguan Neurotik/Somatoform/Stress; kadang F10-F19, F30-F39. </w:t>
+      </w:r>
+      <w:r>
+        <w:rPr>
+          <w:b/>
+        </w:rPr>
+        <w:t>Prinsip ujian</w:t>
+      </w:r>
+      <w:r>
+        <w:t xml:space="preserve">: gangguan jiwa akibat kerja butuh </w:t>
+      </w:r>
+      <w:r>
+        <w:rPr>
+          <w:b/>
+        </w:rPr>
+        <w:t>minimal 6 bulan</w:t>
+      </w:r>
+      <w:r>
+        <w:t xml:space="preserve"> pajanan (jebakan untuk kasus akut). Penilaian hendaya pakai </w:t>
+      </w:r>
+      <w:r>
+        <w:rPr>
+          <w:b/>
+        </w:rPr>
+        <w:t>Aksis V (GAF)</w:t>
+      </w:r>
+      <w:r>
+        <w:t>, dikaitkan Aktivitas Kehidupan Sehari-hari — hendaya total permanen jarang kecuali penyakit organik.</w:t>
+      </w:r>
+    </w:p>
+    <w:p>
+      <w:r>
+        <w:rPr>
+          <w:b/>
+        </w:rPr>
+        <w:t>Bidang 5 — THT</w:t>
+      </w:r>
+      <w:r>
+        <w:t xml:space="preserve">: Keseimbangan diperiksa dengan Romberg, Stepping, Nudge, Past-pointing. Klasifikasi tuli (ambang rerata): Ringan → Sedang → Sedang-berat (55-70 dB) → Berat (70-90 dB) → Sangat berat (≥90 dB). </w:t>
+      </w:r>
+      <w:r>
+        <w:rPr>
+          <w:b/>
+        </w:rPr>
+        <w:t>Standar AMA yang diadopsi</w:t>
+      </w:r>
+      <w:r>
+        <w:t xml:space="preserve">: cacat total pendengaran jika ambang &gt;92 dB; ambang tertinggi dipakai 93 dB, ambang terendah "tuli" 25 dB. </w:t>
+      </w:r>
+      <w:r>
+        <w:rPr>
+          <w:b/>
+        </w:rPr>
+        <w:t>Formula (identik AMA tapi pakai 4000 Hz, bukan 3000 Hz)</w:t>
+      </w:r>
+      <w:r>
+        <w:t>:</w:t>
+      </w:r>
+    </w:p>
+    <w:p>
+      <w:pPr>
+        <w:pStyle w:val="ListBullet"/>
+      </w:pPr>
+      <w:r>
+        <w:rPr>
+          <w:i/>
+        </w:rPr>
+        <w:t>Monaural</w:t>
+      </w:r>
+      <w:r>
+        <w:t>: ukur ambang 500/1000/2000/</w:t>
+      </w:r>
+      <w:r>
+        <w:rPr>
+          <w:b/>
+        </w:rPr>
+        <w:t>4000 Hz</w:t>
+      </w:r>
+      <w:r>
+        <w:t xml:space="preserve"> → jumlahkan → rata-ratakan → kurangi 25 dB → kalikan sisa ×1,5% = % ketulian monaural.</w:t>
+      </w:r>
+    </w:p>
+    <w:p>
+      <w:pPr>
+        <w:pStyle w:val="ListBullet"/>
+      </w:pPr>
+      <w:r>
+        <w:rPr>
+          <w:i/>
+        </w:rPr>
+        <w:t>Binaural</w:t>
+      </w:r>
+      <w:r>
+        <w:t>: (nilai monaural telinga lebih baik ×5 + nilai monaural telinga lebih buruk ×1) ÷ 6.</w:t>
+      </w:r>
+    </w:p>
+    <w:p>
+      <w:pPr>
+        <w:pStyle w:val="ListBullet"/>
+      </w:pPr>
+      <w:r>
+        <w:rPr>
+          <w:i/>
+        </w:rPr>
+        <w:t>Koreksi usia</w:t>
+      </w:r>
+      <w:r>
+        <w:t>: pekerja &gt;40 tahun dikurangi 0,5 dB/tahun, maksimal 12,5 dB.</w:t>
+      </w:r>
+    </w:p>
+    <w:p>
+      <w:r>
+        <w:rPr>
+          <w:i/>
+        </w:rPr>
+        <w:t>Contoh dari dokumen</w:t>
+      </w:r>
+      <w:r>
+        <w:t>: telinga kanan 500/1000/2000/4000 Hz = 35/40/45/60 dB → jumlah 180 → rerata 45 → −25=20 → ×1,5%=</w:t>
+      </w:r>
+      <w:r>
+        <w:rPr>
+          <w:b/>
+        </w:rPr>
+        <w:t>30%</w:t>
+      </w:r>
+      <w:r>
+        <w:t xml:space="preserve"> (monaural kanan). Telinga kiri 40/50/50/60 → jumlah 200 → rerata 50 → −25=25 → ×1,5%=</w:t>
+      </w:r>
+      <w:r>
+        <w:rPr>
+          <w:b/>
+        </w:rPr>
+        <w:t>37,5%</w:t>
+      </w:r>
+      <w:r>
+        <w:t xml:space="preserve"> (monaural kiri).</w:t>
+      </w:r>
+    </w:p>
+    <w:p>
+      <w:r>
+        <w:t xml:space="preserve">Hidung &amp; penghidu: ganti rugi fungsi penciuman = </w:t>
+      </w:r>
+      <w:r>
+        <w:rPr>
+          <w:b/>
+        </w:rPr>
+        <w:t>10% dari upah</w:t>
+      </w:r>
+      <w:r>
+        <w:t>. Tenggorok: cidera laring/trakea (suara hilang total 40%; parau tapi dimengerti 50%×40%=20%; napas via trakeostomi 40%); esofagitis korosif dengan striktur perlu rekonstruksi = 40%; kelumpuhan N. fasialis perifer dapat sembuh bila operasi &lt;2 minggu sejak trauma.</w:t>
+      </w:r>
+    </w:p>
+    <w:p>
+      <w:r>
+        <w:rPr>
+          <w:b/>
+        </w:rPr>
+        <w:t>Bidang 6 — Orthopaedi</w:t>
+      </w:r>
+      <w:r>
+        <w:t xml:space="preserve">: definisi investigasi/prevensi/restorasi/perkembangan bentuk-fungsi ekstremitas &amp; tulang belakang (AAOS 1960). </w:t>
+      </w:r>
+      <w:r>
+        <w:rPr>
+          <w:b/>
+        </w:rPr>
+        <w:t>Kerangka 3-tingkat WHO-based</w:t>
+      </w:r>
+      <w:r>
+        <w:t xml:space="preserve"> (sering ditanya sebagai definisi): (1) </w:t>
+      </w:r>
+      <w:r>
+        <w:rPr>
+          <w:b/>
+        </w:rPr>
+        <w:t>Impairment</w:t>
+      </w:r>
+      <w:r>
+        <w:t xml:space="preserve"> — kehilangan kemampuan self-care, tak bisa kerja sehari-hari, masih perlu terapi aktif; (2) </w:t>
+      </w:r>
+      <w:r>
+        <w:rPr>
+          <w:b/>
+        </w:rPr>
+        <w:t>Disability</w:t>
+      </w:r>
+      <w:r>
+        <w:t xml:space="preserve"> — keterbatasan dibanding orang sehat, masih bisa membaik/kerja terbatas dengan alat bantu; (3) </w:t>
+      </w:r>
+      <w:r>
+        <w:rPr>
+          <w:b/>
+        </w:rPr>
+        <w:t>Handicapped</w:t>
+      </w:r>
+      <w:r>
+        <w:t xml:space="preserve"> — keadaan akhir menetap, tujuan tatalaksana kemandirian maksimal dengan alat bantu. Diagnosis: anamnesis (trauma, kidal/kinan, lama sakit, status terapi, target RTW) + PF </w:t>
+      </w:r>
+      <w:r>
+        <w:rPr>
+          <w:b/>
+        </w:rPr>
+        <w:t>Look-Feel-Move</w:t>
+      </w:r>
+      <w:r>
+        <w:t xml:space="preserve"> (inspeksi, palpasi, gerak aktif/pasif) — dicari: amputasi, sensorik/motorik, tonus otot, panjang tungkai. </w:t>
+      </w:r>
+      <w:r>
+        <w:rPr>
+          <w:b/>
+        </w:rPr>
+        <w:t>Waktu penilaian: 6 bulan s/d 2 tahun</w:t>
+      </w:r>
+      <w:r>
+        <w:t xml:space="preserve"> setelah usaha medis maksimal. </w:t>
+      </w:r>
+      <w:r>
+        <w:rPr>
+          <w:i/>
+        </w:rPr>
+        <w:t>Contoh</w:t>
+      </w:r>
+      <w:r>
+        <w:t xml:space="preserve">: sendi panggul (nilai terhadap seluruh badan 50%) — non-union tanpa koreksi = </w:t>
+      </w:r>
+      <w:r>
+        <w:rPr>
+          <w:b/>
+        </w:rPr>
+        <w:t>75%</w:t>
+      </w:r>
+      <w:r>
+        <w:t>.</w:t>
+      </w:r>
+    </w:p>
+    <w:p>
+      <w:r>
+        <w:rPr>
+          <w:b/>
+        </w:rPr>
+        <w:t>Bidang 7 — Paru</w:t>
+      </w:r>
+      <w:r>
+        <w:t xml:space="preserve">: kelainan akut (RADS, toxic pneumonitis, edema paru akut, bronkitis akut, hipersensitivitas pneumonitis) dan kronik (pneumokoniosis — asbestosis/silikosis/beriliosis, penyakit pleura, bronkitis kronik, asma kerja, bisinosis, kanker paru). </w:t>
+      </w:r>
+      <w:r>
+        <w:rPr>
+          <w:b/>
+        </w:rPr>
+        <w:t>Klasifikasi Restriksi/Obstruksi (tabel kunci ujian)</w:t>
+      </w:r>
+      <w:r>
+        <w:t>:</w:t>
+      </w:r>
+    </w:p>
+    <w:tbl>
+      <w:tblPr>
+        <w:tblStyle w:val="TableGrid"/>
+        <w:tblW w:type="auto" w:w="0"/>
+        <w:tblLayout w:type="autofit"/>
+        <w:tblLook w:firstColumn="1" w:firstRow="1" w:lastColumn="0" w:lastRow="0" w:noHBand="0" w:noVBand="1" w:val="04A0"/>
+      </w:tblPr>
+      <w:tblGrid>
+        <w:gridCol w:w="2880"/>
+        <w:gridCol w:w="2880"/>
+        <w:gridCol w:w="2880"/>
+      </w:tblGrid>
+      <w:tr>
+        <w:tc>
+          <w:tcPr>
+            <w:tcW w:type="dxa" w:w="2880"/>
+            <w:shd w:val="clear" w:color="auto" w:fill="1F4E5F"/>
+          </w:tcPr>
+          <w:p>
+            <w:r>
+              <w:rPr>
+                <w:b/>
+                <w:color w:val="FFFFFF"/>
+                <w:sz w:val="18"/>
+              </w:rPr>
+              <w:t>Derajat</w:t>
+            </w:r>
+          </w:p>
+        </w:tc>
+        <w:tc>
+          <w:tcPr>
+            <w:tcW w:type="dxa" w:w="2880"/>
+            <w:shd w:val="clear" w:color="auto" w:fill="1F4E5F"/>
+          </w:tcPr>
+          <w:p>
+            <w:r>
+              <w:rPr>
+                <w:b/>
+                <w:color w:val="FFFFFF"/>
+                <w:sz w:val="18"/>
+              </w:rPr>
+              <w:t>Restriksi (KVP %prediksi)</w:t>
+            </w:r>
+          </w:p>
+        </w:tc>
+        <w:tc>
+          <w:tcPr>
+            <w:tcW w:type="dxa" w:w="2880"/>
+            <w:shd w:val="clear" w:color="auto" w:fill="1F4E5F"/>
+          </w:tcPr>
+          <w:p>
+            <w:r>
+              <w:rPr>
+                <w:b/>
+                <w:color w:val="FFFFFF"/>
+                <w:sz w:val="18"/>
+              </w:rPr>
+              <w:t>Obstruksi (VEP1/KVP% atau %prediksi)</w:t>
+            </w:r>
+          </w:p>
+        </w:tc>
+      </w:tr>
+      <w:tr>
+        <w:tc>
+          <w:tcPr>
+            <w:tcW w:type="dxa" w:w="2880"/>
+          </w:tcPr>
+          <w:p>
+            <w:r>
+              <w:rPr>
+                <w:sz w:val="18"/>
+              </w:rPr>
+              <w:t>Normal</w:t>
+            </w:r>
+          </w:p>
+        </w:tc>
+        <w:tc>
+          <w:tcPr>
+            <w:tcW w:type="dxa" w:w="2880"/>
+          </w:tcPr>
+          <w:p>
+            <w:r>
+              <w:rPr>
+                <w:sz w:val="18"/>
+              </w:rPr>
+              <w:t>&gt;80%</w:t>
+            </w:r>
+          </w:p>
+        </w:tc>
+        <w:tc>
+          <w:tcPr>
+            <w:tcW w:type="dxa" w:w="2880"/>
           </w:tcPr>
           <w:p>
             <w:r>
@@ -2050,53 +5283,40 @@
       <w:tr>
         <w:tc>
           <w:tcPr>
-            <w:tcW w:type="dxa" w:w="2160"/>
+            <w:tcW w:type="dxa" w:w="2880"/>
           </w:tcPr>
           <w:p>
             <w:r>
               <w:rPr>
                 <w:sz w:val="18"/>
               </w:rPr>
-              <w:t>B</w:t>
+              <w:t>Ringan</w:t>
             </w:r>
           </w:p>
         </w:tc>
         <w:tc>
           <w:tcPr>
-            <w:tcW w:type="dxa" w:w="2160"/>
+            <w:tcW w:type="dxa" w:w="2880"/>
           </w:tcPr>
           <w:p>
             <w:r>
               <w:rPr>
                 <w:sz w:val="18"/>
               </w:rPr>
-              <w:t>Inkomplit</w:t>
+              <w:t>60-79%</w:t>
             </w:r>
           </w:p>
         </w:tc>
         <w:tc>
           <w:tcPr>
-            <w:tcW w:type="dxa" w:w="2160"/>
+            <w:tcW w:type="dxa" w:w="2880"/>
           </w:tcPr>
           <w:p>
             <w:r>
               <w:rPr>
                 <w:sz w:val="18"/>
               </w:rPr>
-              <w:t>Sensorik baik, motorik terganggu s.d. S4-S5</w:t>
-            </w:r>
-          </w:p>
-        </w:tc>
-        <w:tc>
-          <w:tcPr>
-            <w:tcW w:type="dxa" w:w="2160"/>
-          </w:tcPr>
-          <w:p>
-            <w:r>
-              <w:rPr>
-                <w:sz w:val="18"/>
-              </w:rPr>
-              <w:t>&gt;50-75%</w:t>
+              <w:t>60-74%</w:t>
             </w:r>
           </w:p>
         </w:tc>
@@ -2104,53 +5324,40 @@
       <w:tr>
         <w:tc>
           <w:tcPr>
-            <w:tcW w:type="dxa" w:w="2160"/>
+            <w:tcW w:type="dxa" w:w="2880"/>
           </w:tcPr>
           <w:p>
             <w:r>
               <w:rPr>
                 <w:sz w:val="18"/>
               </w:rPr>
-              <w:t>C</w:t>
+              <w:t>Sedang</w:t>
             </w:r>
           </w:p>
         </w:tc>
         <w:tc>
           <w:tcPr>
-            <w:tcW w:type="dxa" w:w="2160"/>
+            <w:tcW w:type="dxa" w:w="2880"/>
           </w:tcPr>
           <w:p>
             <w:r>
               <w:rPr>
                 <w:sz w:val="18"/>
               </w:rPr>
-              <w:t>Inkomplit</w:t>
+              <w:t>30-59%</w:t>
             </w:r>
           </w:p>
         </w:tc>
         <w:tc>
           <w:tcPr>
-            <w:tcW w:type="dxa" w:w="2160"/>
+            <w:tcW w:type="dxa" w:w="2880"/>
           </w:tcPr>
           <w:p>
             <w:r>
               <w:rPr>
                 <w:sz w:val="18"/>
               </w:rPr>
-              <w:t>Motorik terganggu, kekuatan &lt;3</w:t>
-            </w:r>
-          </w:p>
-        </w:tc>
-        <w:tc>
-          <w:tcPr>
-            <w:tcW w:type="dxa" w:w="2160"/>
-          </w:tcPr>
-          <w:p>
-            <w:r>
-              <w:rPr>
-                <w:sz w:val="18"/>
-              </w:rPr>
-              <w:t>&gt;25-50%</w:t>
+              <w:t>30-59%</w:t>
             </w:r>
           </w:p>
         </w:tc>
@@ -2158,53 +5365,115 @@
       <w:tr>
         <w:tc>
           <w:tcPr>
-            <w:tcW w:type="dxa" w:w="2160"/>
+            <w:tcW w:type="dxa" w:w="2880"/>
           </w:tcPr>
           <w:p>
             <w:r>
               <w:rPr>
                 <w:sz w:val="18"/>
               </w:rPr>
-              <w:t>D</w:t>
+              <w:t>Berat</w:t>
             </w:r>
           </w:p>
         </w:tc>
         <w:tc>
           <w:tcPr>
-            <w:tcW w:type="dxa" w:w="2160"/>
+            <w:tcW w:type="dxa" w:w="2880"/>
           </w:tcPr>
           <w:p>
             <w:r>
               <w:rPr>
                 <w:sz w:val="18"/>
               </w:rPr>
-              <w:t>Inkomplit</w:t>
+              <w:t>&lt;30%</w:t>
             </w:r>
           </w:p>
         </w:tc>
         <w:tc>
           <w:tcPr>
-            <w:tcW w:type="dxa" w:w="2160"/>
+            <w:tcW w:type="dxa" w:w="2880"/>
           </w:tcPr>
           <w:p>
             <w:r>
               <w:rPr>
                 <w:sz w:val="18"/>
               </w:rPr>
-              <w:t>Motorik terganggu, kekuatan &gt;3</w:t>
+              <w:t>&lt;30%</w:t>
+            </w:r>
+          </w:p>
+        </w:tc>
+      </w:tr>
+    </w:tbl>
+    <w:p/>
+    <w:p>
+      <w:r>
+        <w:rPr>
+          <w:b/>
+        </w:rPr>
+        <w:t>Derajat sesak (skala ATS 0-4)</w:t>
+      </w:r>
+      <w:r>
+        <w:t>: 0 tak sesak kecuali exercise berat · 1 ringan (jalan cepat/mendaki) · 2 sedang (jalan lebih lambat) · 3 berat (berhenti setelah 100m) · 4 sangat berat (sesak saat pakai baju).</w:t>
+      </w:r>
+    </w:p>
+    <w:tbl>
+      <w:tblPr>
+        <w:tblStyle w:val="TableGrid"/>
+        <w:tblW w:type="auto" w:w="0"/>
+        <w:tblLayout w:type="autofit"/>
+        <w:tblLook w:firstColumn="1" w:firstRow="1" w:lastColumn="0" w:lastRow="0" w:noHBand="0" w:noVBand="1" w:val="04A0"/>
+      </w:tblPr>
+      <w:tblGrid>
+        <w:gridCol w:w="2880"/>
+        <w:gridCol w:w="2880"/>
+        <w:gridCol w:w="2880"/>
+      </w:tblGrid>
+      <w:tr>
+        <w:tc>
+          <w:tcPr>
+            <w:tcW w:type="dxa" w:w="2880"/>
+            <w:shd w:val="clear" w:color="auto" w:fill="1F4E5F"/>
+          </w:tcPr>
+          <w:p>
+            <w:r>
+              <w:rPr>
+                <w:b/>
+                <w:color w:val="FFFFFF"/>
+                <w:sz w:val="18"/>
+              </w:rPr>
+              <w:t>Derajat</w:t>
             </w:r>
           </w:p>
         </w:tc>
         <w:tc>
           <w:tcPr>
-            <w:tcW w:type="dxa" w:w="2160"/>
+            <w:tcW w:type="dxa" w:w="2880"/>
+            <w:shd w:val="clear" w:color="auto" w:fill="1F4E5F"/>
           </w:tcPr>
           <w:p>
             <w:r>
               <w:rPr>
+                <w:b/>
+                <w:color w:val="FFFFFF"/>
                 <w:sz w:val="18"/>
               </w:rPr>
-              <w:t>1-25%</w:t>
+              <w:t>VEP1</w:t>
+            </w:r>
+          </w:p>
+        </w:tc>
+        <w:tc>
+          <w:tcPr>
+            <w:tcW w:type="dxa" w:w="2880"/>
+            <w:shd w:val="clear" w:color="auto" w:fill="1F4E5F"/>
+          </w:tcPr>
+          <w:p>
+            <w:r>
+              <w:rPr>
+                <w:b/>
+                <w:color w:val="FFFFFF"/>
+                <w:sz w:val="18"/>
+              </w:rPr>
+              <w:t>% Cacat Fungsi</w:t>
             </w:r>
           </w:p>
         </w:tc>
@@ -2212,53 +5481,204 @@
       <w:tr>
         <w:tc>
           <w:tcPr>
-            <w:tcW w:type="dxa" w:w="2160"/>
+            <w:tcW w:type="dxa" w:w="2880"/>
           </w:tcPr>
           <w:p>
             <w:r>
               <w:rPr>
                 <w:sz w:val="18"/>
               </w:rPr>
-              <w:t>E</w:t>
+              <w:t>0</w:t>
             </w:r>
           </w:p>
         </w:tc>
         <w:tc>
           <w:tcPr>
-            <w:tcW w:type="dxa" w:w="2160"/>
+            <w:tcW w:type="dxa" w:w="2880"/>
           </w:tcPr>
           <w:p>
             <w:r>
               <w:rPr>
                 <w:sz w:val="18"/>
               </w:rPr>
-              <w:t>Normal</w:t>
+              <w:t>&gt;2,5 L</w:t>
             </w:r>
           </w:p>
         </w:tc>
         <w:tc>
           <w:tcPr>
-            <w:tcW w:type="dxa" w:w="2160"/>
+            <w:tcW w:type="dxa" w:w="2880"/>
           </w:tcPr>
           <w:p>
             <w:r>
               <w:rPr>
                 <w:sz w:val="18"/>
               </w:rPr>
-              <w:t>—</w:t>
+              <w:t>-</w:t>
             </w:r>
           </w:p>
         </w:tc>
+      </w:tr>
+      <w:tr>
         <w:tc>
           <w:tcPr>
-            <w:tcW w:type="dxa" w:w="2160"/>
+            <w:tcW w:type="dxa" w:w="2880"/>
           </w:tcPr>
           <w:p>
             <w:r>
               <w:rPr>
                 <w:sz w:val="18"/>
               </w:rPr>
-              <w:t>0%</w:t>
+              <w:t>1 Ringan</w:t>
+            </w:r>
+          </w:p>
+        </w:tc>
+        <w:tc>
+          <w:tcPr>
+            <w:tcW w:type="dxa" w:w="2880"/>
+          </w:tcPr>
+          <w:p>
+            <w:r>
+              <w:rPr>
+                <w:sz w:val="18"/>
+              </w:rPr>
+              <w:t>1,6-2,5 L</w:t>
+            </w:r>
+          </w:p>
+        </w:tc>
+        <w:tc>
+          <w:tcPr>
+            <w:tcW w:type="dxa" w:w="2880"/>
+          </w:tcPr>
+          <w:p>
+            <w:r>
+              <w:rPr>
+                <w:sz w:val="18"/>
+              </w:rPr>
+              <w:t>25%</w:t>
+            </w:r>
+          </w:p>
+        </w:tc>
+      </w:tr>
+      <w:tr>
+        <w:tc>
+          <w:tcPr>
+            <w:tcW w:type="dxa" w:w="2880"/>
+          </w:tcPr>
+          <w:p>
+            <w:r>
+              <w:rPr>
+                <w:sz w:val="18"/>
+              </w:rPr>
+              <w:t>2 Sedang</w:t>
+            </w:r>
+          </w:p>
+        </w:tc>
+        <w:tc>
+          <w:tcPr>
+            <w:tcW w:type="dxa" w:w="2880"/>
+          </w:tcPr>
+          <w:p>
+            <w:r>
+              <w:rPr>
+                <w:sz w:val="18"/>
+              </w:rPr>
+              <w:t>1,1-1,5 L</w:t>
+            </w:r>
+          </w:p>
+        </w:tc>
+        <w:tc>
+          <w:tcPr>
+            <w:tcW w:type="dxa" w:w="2880"/>
+          </w:tcPr>
+          <w:p>
+            <w:r>
+              <w:rPr>
+                <w:sz w:val="18"/>
+              </w:rPr>
+              <w:t>50%</w:t>
+            </w:r>
+          </w:p>
+        </w:tc>
+      </w:tr>
+      <w:tr>
+        <w:tc>
+          <w:tcPr>
+            <w:tcW w:type="dxa" w:w="2880"/>
+          </w:tcPr>
+          <w:p>
+            <w:r>
+              <w:rPr>
+                <w:sz w:val="18"/>
+              </w:rPr>
+              <w:t>3 Berat</w:t>
+            </w:r>
+          </w:p>
+        </w:tc>
+        <w:tc>
+          <w:tcPr>
+            <w:tcW w:type="dxa" w:w="2880"/>
+          </w:tcPr>
+          <w:p>
+            <w:r>
+              <w:rPr>
+                <w:sz w:val="18"/>
+              </w:rPr>
+              <w:t>0,5-1 L</w:t>
+            </w:r>
+          </w:p>
+        </w:tc>
+        <w:tc>
+          <w:tcPr>
+            <w:tcW w:type="dxa" w:w="2880"/>
+          </w:tcPr>
+          <w:p>
+            <w:r>
+              <w:rPr>
+                <w:sz w:val="18"/>
+              </w:rPr>
+              <w:t>75%</w:t>
+            </w:r>
+          </w:p>
+        </w:tc>
+      </w:tr>
+      <w:tr>
+        <w:tc>
+          <w:tcPr>
+            <w:tcW w:type="dxa" w:w="2880"/>
+          </w:tcPr>
+          <w:p>
+            <w:r>
+              <w:rPr>
+                <w:sz w:val="18"/>
+              </w:rPr>
+              <w:t>4 Sangat berat</w:t>
+            </w:r>
+          </w:p>
+        </w:tc>
+        <w:tc>
+          <w:tcPr>
+            <w:tcW w:type="dxa" w:w="2880"/>
+          </w:tcPr>
+          <w:p>
+            <w:r>
+              <w:rPr>
+                <w:sz w:val="18"/>
+              </w:rPr>
+              <w:t>&lt;0,1 L</w:t>
+            </w:r>
+          </w:p>
+        </w:tc>
+        <w:tc>
+          <w:tcPr>
+            <w:tcW w:type="dxa" w:w="2880"/>
+          </w:tcPr>
+          <w:p>
+            <w:r>
+              <w:rPr>
+                <w:sz w:val="18"/>
+              </w:rPr>
+              <w:t>100%</w:t>
             </w:r>
           </w:p>
         </w:tc>
@@ -2266,62 +5686,319 @@
     </w:tbl>
     <w:p/>
     <w:p>
-      <w:pPr>
-        <w:pStyle w:val="ListBullet"/>
-      </w:pPr>
-      <w:r>
-        <w:rPr>
-          <w:b/>
-        </w:rPr>
-        <w:t>Cedera kepala berat</w:t>
-      </w:r>
-      <w:r>
-        <w:t xml:space="preserve"> — Glasgow Outcome Scale (GOS), dinilai setelah </w:t>
-      </w:r>
-      <w:r>
-        <w:rPr>
-          <w:b/>
-        </w:rPr>
-        <w:t>6 bulan</w:t>
-      </w:r>
-      <w:r>
-        <w:t xml:space="preserve"> neurorehabilitasi: GOS 1 (vegetatif) &gt;75% hilang · GOS 2 (disabilitas berat) 51-75% · GOS 3 (sedang) 25-50% · GOS 4 (ringan) 1-25%.</w:t>
+      <w:r>
+        <w:t xml:space="preserve">Penilaian dilakukan </w:t>
+      </w:r>
+      <w:r>
+        <w:rPr>
+          <w:b/>
+        </w:rPr>
+        <w:t>setelah terapi bronkodilator maksimal 3 bulan</w:t>
+      </w:r>
+      <w:r>
+        <w:t xml:space="preserve"> dengan hasil menetap. Ganti rugi: cacat fungsi 100% = </w:t>
+      </w:r>
+      <w:r>
+        <w:rPr>
+          <w:b/>
+        </w:rPr>
+        <w:t>70% dari upah</w:t>
+      </w:r>
+      <w:r>
+        <w:t>.</w:t>
       </w:r>
     </w:p>
     <w:p>
-      <w:pPr>
-        <w:pStyle w:val="ListBullet"/>
-      </w:pPr>
-      <w:r>
-        <w:rPr>
-          <w:b/>
-        </w:rPr>
-        <w:t>Ischialgia/Brachialgia &amp; neuritis jebakan</w:t>
-      </w:r>
-      <w:r>
-        <w:t>: dinilai setelah terapi 6 bulan — kemampuan kerja 50-75% → santunan 40%; 25-50% → santunan 20%.</w:t>
+      <w:r>
+        <w:rPr>
+          <w:b/>
+        </w:rPr>
+        <w:t>Bidang 8 — Mata</w:t>
+      </w:r>
+      <w:r>
+        <w:t xml:space="preserve">: kelainan adneksa (kelopak, orbita, lakrima, konjungtiva, otot mata) dan bola mata (kornea, sklera, lensa, bilik mata depan, iris, retina, saraf/jaras penglihatan). Visus jauh: jarak baca 6 m (atau 3 m dengan cermin), pencahayaan latar 50 lux, kartu Snellen 500 lux, buta huruf pakai Kartu E/Landolt. </w:t>
+      </w:r>
+      <w:r>
+        <w:rPr>
+          <w:b/>
+        </w:rPr>
+        <w:t>Alur refraksi</w:t>
+      </w:r>
+      <w:r>
+        <w:t xml:space="preserve">: trial lens (step 0,5 dioptri) → jika visus belum 6/6, koreksi bertahap → jika tetap tak membaik, pinhole test (tak membaik = curiga kelainan retina/saraf optik) → uji astigmatisme kipas astigmat. </w:t>
+      </w:r>
+      <w:r>
+        <w:rPr>
+          <w:b/>
+        </w:rPr>
+        <w:t>Perimetri</w:t>
+      </w:r>
+      <w:r>
+        <w:t xml:space="preserve"> untuk menilai lapang pandang di luar fovea. </w:t>
+      </w:r>
+      <w:r>
+        <w:rPr>
+          <w:b/>
+        </w:rPr>
+        <w:t>Formula</w:t>
+      </w:r>
+      <w:r>
+        <w:t xml:space="preserve">: % kehilangan tajam penglihatan = (%kehilangan visus jauh + %kehilangan visus dekat) ÷ 2, dinilai per mata lalu digabung sesuai bobot komponen (visus, lapang pandang, motilitas otot/fusi binokular — dicek dengan uji 4 sinar). </w:t>
+      </w:r>
+      <w:r>
+        <w:rPr>
+          <w:i/>
+        </w:rPr>
+        <w:t>(Bandingkan dengan formula FAS/FFS/FVS→VSI→WPI AMA di §5.2 Bab 12 — filosofi sama, AMA jauh lebih presisi kuantitatif dengan faktor diskon 0,7 yang tak ada padanannya di Permenaker.)</w:t>
       </w:r>
     </w:p>
     <w:p>
-      <w:pPr>
-        <w:pStyle w:val="ListBullet"/>
-      </w:pPr>
-      <w:r>
-        <w:rPr>
-          <w:b/>
-        </w:rPr>
-        <w:t>Gangguan Fungsi Steinbrocker</w:t>
-      </w:r>
-      <w:r>
-        <w:t xml:space="preserve"> (skala fungsional umum, subjektif — hindari kecuali darurat tanpa panduan objektif lain): 1 → aktivitas sehari-hari 25% · 2 → beberapa kesukaran 50% · 3 → terbatas/perlu dibantu 75% · 4 → sangat sukar 100%.</w:t>
+      <w:r>
+        <w:rPr>
+          <w:b/>
+        </w:rPr>
+        <w:t>Bidang 9 — Radiasi Mengion</w:t>
+      </w:r>
+      <w:r>
+        <w:t>:</w:t>
+      </w:r>
+    </w:p>
+    <w:tbl>
+      <w:tblPr>
+        <w:tblStyle w:val="TableGrid"/>
+        <w:tblW w:type="auto" w:w="0"/>
+        <w:tblLayout w:type="autofit"/>
+        <w:tblLook w:firstColumn="1" w:firstRow="1" w:lastColumn="0" w:lastRow="0" w:noHBand="0" w:noVBand="1" w:val="04A0"/>
+      </w:tblPr>
+      <w:tblGrid>
+        <w:gridCol w:w="2880"/>
+        <w:gridCol w:w="2880"/>
+        <w:gridCol w:w="2880"/>
+      </w:tblGrid>
+      <w:tr>
+        <w:tc>
+          <w:tcPr>
+            <w:tcW w:type="dxa" w:w="2880"/>
+            <w:shd w:val="clear" w:color="auto" w:fill="1F4E5F"/>
+          </w:tcPr>
+          <w:p>
+            <w:r>
+              <w:rPr>
+                <w:b/>
+                <w:color w:val="FFFFFF"/>
+                <w:sz w:val="18"/>
+              </w:rPr>
+              <w:t>Kategori</w:t>
+            </w:r>
+          </w:p>
+        </w:tc>
+        <w:tc>
+          <w:tcPr>
+            <w:tcW w:type="dxa" w:w="2880"/>
+            <w:shd w:val="clear" w:color="auto" w:fill="1F4E5F"/>
+          </w:tcPr>
+          <w:p>
+            <w:r>
+              <w:rPr>
+                <w:b/>
+                <w:color w:val="FFFFFF"/>
+                <w:sz w:val="18"/>
+              </w:rPr>
+              <w:t>Karakteristik</w:t>
+            </w:r>
+          </w:p>
+        </w:tc>
+        <w:tc>
+          <w:tcPr>
+            <w:tcW w:type="dxa" w:w="2880"/>
+            <w:shd w:val="clear" w:color="auto" w:fill="1F4E5F"/>
+          </w:tcPr>
+          <w:p>
+            <w:r>
+              <w:rPr>
+                <w:b/>
+                <w:color w:val="FFFFFF"/>
+                <w:sz w:val="18"/>
+              </w:rPr>
+              <w:t>Contoh</w:t>
+            </w:r>
+          </w:p>
+        </w:tc>
+      </w:tr>
+      <w:tr>
+        <w:tc>
+          <w:tcPr>
+            <w:tcW w:type="dxa" w:w="2880"/>
+          </w:tcPr>
+          <w:p>
+            <w:r>
+              <w:rPr>
+                <w:sz w:val="18"/>
+              </w:rPr>
+              <w:t>Stokastik</w:t>
+            </w:r>
+          </w:p>
+        </w:tc>
+        <w:tc>
+          <w:tcPr>
+            <w:tcW w:type="dxa" w:w="2880"/>
+          </w:tcPr>
+          <w:p>
+            <w:r>
+              <w:rPr>
+                <w:sz w:val="18"/>
+              </w:rPr>
+              <w:t>Perubahan sel arah teratogenik/karsinogenik, tak tergantung Nilai Boleh Diterima, pajanan lama</w:t>
+            </w:r>
+          </w:p>
+        </w:tc>
+        <w:tc>
+          <w:tcPr>
+            <w:tcW w:type="dxa" w:w="2880"/>
+          </w:tcPr>
+          <w:p>
+            <w:r>
+              <w:rPr>
+                <w:sz w:val="18"/>
+              </w:rPr>
+              <w:t>Kanker (tulang, paru, tiroid, payudara), Leukemia</w:t>
+            </w:r>
+          </w:p>
+        </w:tc>
+      </w:tr>
+      <w:tr>
+        <w:tc>
+          <w:tcPr>
+            <w:tcW w:type="dxa" w:w="2880"/>
+          </w:tcPr>
+          <w:p>
+            <w:r>
+              <w:rPr>
+                <w:sz w:val="18"/>
+              </w:rPr>
+              <w:t>Non-stokastik</w:t>
+            </w:r>
+          </w:p>
+        </w:tc>
+        <w:tc>
+          <w:tcPr>
+            <w:tcW w:type="dxa" w:w="2880"/>
+          </w:tcPr>
+          <w:p>
+            <w:r>
+              <w:rPr>
+                <w:sz w:val="18"/>
+              </w:rPr>
+              <w:t>Akut-kronik, kerusakan sel/jaringan di atas Nilai Batas Dosis</w:t>
+            </w:r>
+          </w:p>
+        </w:tc>
+        <w:tc>
+          <w:tcPr>
+            <w:tcW w:type="dxa" w:w="2880"/>
+          </w:tcPr>
+          <w:p>
+            <w:r>
+              <w:rPr>
+                <w:sz w:val="18"/>
+              </w:rPr>
+              <w:t>Luka bakar, radiodermatitis, sindroma radiasi akut, katarak, infertilitas</w:t>
+            </w:r>
+          </w:p>
+        </w:tc>
+      </w:tr>
+    </w:tbl>
+    <w:p/>
+    <w:p>
+      <w:r>
+        <w:t>Anamnesis khusus: riwayat kerja di lingkungan radiasi + kepatuhan APD + hasil pemantauan dosis (film badge) + riwayat pernah melebihi dosis.</w:t>
       </w:r>
     </w:p>
     <w:p>
-      <w:r>
-        <w:rPr>
-          <w:i/>
-        </w:rPr>
-        <w:t>(Grading detail per bidang lain — Kulit, Penyakit Dalam, Psikiatri, THT, Orthopaedi, Paru, Mata, Radiasi Mengion — tetap diarsipkan lengkap di `Catatan_Kecacatan_Permenaker.docx`/`.md` sebagai referensi; tidak diduplikasi di sini.)</w:t>
+      <w:pPr>
+        <w:pStyle w:val="Heading2"/>
+      </w:pPr>
+      <w:r>
+        <w:t>5.4 Alur Kerja Klinis Sp.Ok (Cara Pakai Pedoman Bidang di Atas)</w:t>
+      </w:r>
+    </w:p>
+    <w:p>
+      <w:pPr>
+        <w:pStyle w:val="ListNumber"/>
+      </w:pPr>
+      <w:r>
+        <w:rPr>
+          <w:b/>
+        </w:rPr>
+        <w:t>Identifikasi bidang</w:t>
+      </w:r>
+      <w:r>
+        <w:t xml:space="preserve"> sesuai organ/sistem terkena — perhatikan bidang </w:t>
+      </w:r>
+      <w:r>
+        <w:rPr>
+          <w:b/>
+        </w:rPr>
+        <w:t>lintas-sistem</w:t>
+      </w:r>
+      <w:r>
+        <w:t xml:space="preserve"> (N.VIII dinilai di THT meski dibahas juga di Neurologi; Otot &amp; Kerangka muncul di Penyakit Dalam untuk kasus metabolik/reumatologik vs. Orthopaedi untuk trauma/amputasi/fraktur).</w:t>
+      </w:r>
+    </w:p>
+    <w:p>
+      <w:pPr>
+        <w:pStyle w:val="ListNumber"/>
+      </w:pPr>
+      <w:r>
+        <w:rPr>
+          <w:b/>
+        </w:rPr>
+        <w:t>Tegakkan diagnosis</w:t>
+      </w:r>
+      <w:r>
+        <w:t>: Anamnesis → Pemeriksaan Fisik → Pemeriksaan Penunjang sesuai bidang.</w:t>
+      </w:r>
+    </w:p>
+    <w:p>
+      <w:pPr>
+        <w:pStyle w:val="ListNumber"/>
+      </w:pPr>
+      <w:r>
+        <w:rPr>
+          <w:b/>
+        </w:rPr>
+        <w:t>Pastikan MMI tercapai</w:t>
+      </w:r>
+      <w:r>
+        <w:t xml:space="preserve"> — mayoritas bidang mensyaratkan penilaian setelah terapi optimal (Orthopaedi 6 bulan–2 tahun; Paru 3 bulan bronkodilator; Neurologi GOS 6 bulan; Psikiatri minimal 6 bulan pajanan untuk diagnosis awal).</w:t>
+      </w:r>
+    </w:p>
+    <w:p>
+      <w:pPr>
+        <w:pStyle w:val="ListNumber"/>
+      </w:pPr>
+      <w:r>
+        <w:rPr>
+          <w:b/>
+        </w:rPr>
+        <w:t>Tentukan derajat/persentase</w:t>
+      </w:r>
+      <w:r>
+        <w:t xml:space="preserve"> memakai tabel/skala baku bidang terkait (MMT, ASIA, CCSFC, Steinbrocker, ATS, formula AMA hearing, dll.).</w:t>
+      </w:r>
+    </w:p>
+    <w:p>
+      <w:pPr>
+        <w:pStyle w:val="ListNumber"/>
+      </w:pPr>
+      <w:r>
+        <w:rPr>
+          <w:b/>
+        </w:rPr>
+        <w:t>Hitung kompensasi</w:t>
+      </w:r>
+      <w:r>
+        <w:t xml:space="preserve"> — Permenaker 25/2008 hanya alat diagnosis &amp; penilaian derajat cacat; nilai rupiah tetap merujuk PP 44/2015 (lihat Poin 6). Beberapa bidang eksplisit menyebut konversi ke rupiah (Paru &amp; Neurologi: cacat fungsi 100% = 70% dari upah).</w:t>
       </w:r>
     </w:p>
     <w:p>

</xml_diff>

<commit_message>
Remove internal cross-references from Kecacatan notes, inline everything
Every "lihat Poin X" pointer (Combined Values Chart, causality syarat, WPI vs % cacat upah, goniometry 10 rule, capping formula, lafaz strategy) is now written out in full at each place it's mentioned, so no section requires flipping elsewhere in the document to be usable standalone.

Co-Authored-By: Claude Sonnet 5 <noreply@anthropic.com>
Claude-Session: https://claude.ai/code/session_016TPfA8nc6cEpZ7VJgPVf39
</commit_message>
<xml_diff>
--- a/PPDS Okupasi Board Notes/Catatan Kecacatan (AMA + Permenaker) Gabungan.docx
+++ b/PPDS Okupasi Board Notes/Catatan Kecacatan (AMA + Permenaker) Gabungan.docx
@@ -32,7 +32,7 @@
           <w:color w:val="606060"/>
           <w:sz w:val="19"/>
         </w:rPr>
-        <w:t>Menggabungkan dua catatan lama — Catatan_AMA.docx dan Catatan_Kecacatan_Permenaker.docx (folder PPDS Okupasi\Materi Board) — disusun ulang mengikuti outline 15 poin baru. Poin 9 (Perbandingan Longitudinal) dan Poin 12 (Lafaz) adalah gap yang tidak ada di catatan lama, diisi dari NotebookLM (notebook “Kecacatan”) pada 30 Agustus 2026 — ditandai [BARU — NotebookLM] di teks. Bagian lain diringkas/disusun ulang dari catatan lama; detail lengkap per-bidang Permenaker dan per-bab AMA tetap tersimpan di dua file arsip aslinya.</w:t>
+        <w:t>Menggabungkan dua catatan lama — Catatan_AMA.docx dan Catatan_Kecacatan_Permenaker.docx (folder PPDS Okupasi\Materi Board) — disusun ulang mengikuti outline 15 poin baru, dengan seluruh detail per-bab AMA (Bab 4–17) dan per-bidang Permenaker (9 Bidang) dituliskan penuh di tempatnya (Poin 5), bukan dirujuk ke file lain. Poin 9 (Perbandingan Longitudinal) dan Poin 12 (Lafaz) adalah gap yang tidak ada di catatan lama, diisi dari NotebookLM (notebook “Kecacatan”) pada 30 Agustus 2026 — ditandai [BARU — NotebookLM] di teks.</w:t>
       </w:r>
     </w:p>
     <w:p>
@@ -2878,7 +2878,25 @@
         <w:t>formula ketulian ini diadopsi persis oleh Permenaker 25/2008</w:t>
       </w:r>
       <w:r>
-        <w:t xml:space="preserve"> (lihat Poin 5.3 THT untuk perbandingan detail):</w:t>
+        <w:t>, dengan satu perbedaan numerik: AMA memakai 500/1000/2000/</w:t>
+      </w:r>
+      <w:r>
+        <w:rPr>
+          <w:b/>
+        </w:rPr>
+        <w:t>3000 Hz</w:t>
+      </w:r>
+      <w:r>
+        <w:t xml:space="preserve"> sebagai 4 frekuensi ukur, sedangkan Permenaker memakai 500/1000/2000/</w:t>
+      </w:r>
+      <w:r>
+        <w:rPr>
+          <w:b/>
+        </w:rPr>
+        <w:t>4000 Hz</w:t>
+      </w:r>
+      <w:r>
+        <w:t xml:space="preserve"> (langkah dan struktur formulanya identik, hanya beda frekuensi ke-4 ini — jebakan klasik ujian):</w:t>
       </w:r>
     </w:p>
     <w:p>
@@ -4116,7 +4134,7 @@
         <w:t>Motorik — MMT</w:t>
       </w:r>
       <w:r>
-        <w:t xml:space="preserve"> (lihat tabel di §5.1 versi ringkas atau tabel identik di bawah). </w:t>
+        <w:t xml:space="preserve"> (tabel di bawah). </w:t>
       </w:r>
       <w:r>
         <w:rPr>
@@ -5998,7 +6016,16 @@
         <w:t>Hitung kompensasi</w:t>
       </w:r>
       <w:r>
-        <w:t xml:space="preserve"> — Permenaker 25/2008 hanya alat diagnosis &amp; penilaian derajat cacat; nilai rupiah tetap merujuk PP 44/2015 (lihat Poin 6). Beberapa bidang eksplisit menyebut konversi ke rupiah (Paru &amp; Neurologi: cacat fungsi 100% = 70% dari upah).</w:t>
+        <w:t xml:space="preserve"> — Permenaker 25/2008 hanya alat diagnosis &amp; penilaian derajat cacat; nilai rupiah tetap merujuk </w:t>
+      </w:r>
+      <w:r>
+        <w:rPr>
+          <w:b/>
+        </w:rPr>
+        <w:t>PP 44/2015</w:t>
+      </w:r>
+      <w:r>
+        <w:t>: Cacat Sebagian Anatomis = % Tabel × 80 × Upah Sebulan; Cacat Sebagian Fungsi = % berkurangnya fungsi × % tabel × 80 × Upah Sebulan; Cacat Total Tetap = 70% × 80 × Upah Sebulan. Beberapa bidang eksplisit menyebut konversi ke rupiah (Paru &amp; Neurologi: cacat fungsi 100% = 70% dari upah).</w:t>
       </w:r>
     </w:p>
     <w:p>
@@ -6391,16 +6418,16 @@
         <w:t>Capping</w:t>
       </w:r>
       <w:r>
-        <w:t xml:space="preserve">: hasil AMA &gt;70% → dilaporkan dipatok </w:t>
-      </w:r>
-      <w:r>
-        <w:rPr>
-          <w:b/>
-        </w:rPr>
-        <w:t>70%</w:t>
-      </w:r>
-      <w:r>
-        <w:t xml:space="preserve"> (Prinsip Harmonisasi, lihat Poin 2).</w:t>
+        <w:t xml:space="preserve">: jika dokter terpaksa memakai AMA Guides untuk kasus yang tidak diatur Permenaker 25/2008 dan hasilnya &gt;70%, kalkulasi AMA tetap dilakukan penuh secara klinis untuk akurasi diagnostik, tapi angka yang </w:t>
+      </w:r>
+      <w:r>
+        <w:rPr>
+          <w:b/>
+        </w:rPr>
+        <w:t>dilaporkan ke penjamin dipatok maksimal 70%</w:t>
+      </w:r>
+      <w:r>
+        <w:t xml:space="preserve"> (Prinsip Harmonisasi, Permenaker 5/2021 Pasal 84).</w:t>
       </w:r>
     </w:p>
     <w:p>
@@ -6454,7 +6481,7 @@
         <w:t>Combined Values Chart (CVC)</w:t>
       </w:r>
       <w:r>
-        <w:t xml:space="preserve"> — berbasis logika "sisa kapasitas yang belum terpakai" (lihat Poin 6).</w:t>
+        <w:t xml:space="preserve"> — berbasis logika "sisa kapasitas yang belum terpakai": urutkan nilai besar→kecil, gabungkan 2 nilai terbesar dulu, hasilnya digabung lagi dengan nilai berikutnya, dst. Hasil selalu ≤ jumlah aritmetik individual (contoh: 35% digabung 20% = 48%, bukan 55%, karena 20% dihitung dari sisa 65% yang belum cacat: 65%×20%=13%; 35%+13%=48%).</w:t>
       </w:r>
     </w:p>
     <w:p>
@@ -6919,7 +6946,52 @@
         <w:t>Akurasi goniometri</w:t>
       </w:r>
       <w:r>
-        <w:t xml:space="preserve"> (lihat juga Poin 4): prioritaskan gerak aktif; Aturan 10° antara ROM aktif vs pasif; pengulangan minimal 3×, ambil nilai maksimal yang konsisten; pembulatan ke angka terdekat berakhiran 0.</w:t>
+        <w:t>: prioritaskan gerak aktif (</w:t>
+      </w:r>
+      <w:r>
+        <w:rPr>
+          <w:i/>
+        </w:rPr>
+        <w:t>voluntary motion</w:t>
+      </w:r>
+      <w:r>
+        <w:t xml:space="preserve">) — ROM pasif hanya diukur bila ROM aktif tidak lengkap. </w:t>
+      </w:r>
+      <w:r>
+        <w:rPr>
+          <w:b/>
+        </w:rPr>
+        <w:t>Aturan 10°</w:t>
+      </w:r>
+      <w:r>
+        <w:t>: ROM aktif dinyatakan sah hanya jika selisihnya maksimal 10° dari ROM pasif; jika lebih lebar, dicurigai usaha suboptimal/</w:t>
+      </w:r>
+      <w:r>
+        <w:rPr>
+          <w:i/>
+        </w:rPr>
+        <w:t>symptom magnification</w:t>
+      </w:r>
+      <w:r>
+        <w:t xml:space="preserve"> dan rating harus ditangguhkan. Pengukuran wajib </w:t>
+      </w:r>
+      <w:r>
+        <w:rPr>
+          <w:b/>
+        </w:rPr>
+        <w:t>diulang minimal 3 kali</w:t>
+      </w:r>
+      <w:r>
+        <w:t xml:space="preserve">, hasil harus konsisten (selisih antar-pemeriksaan ≤10°), gunakan nilai maksimal yang terobservasi. Pembacaan sudut goniometer </w:t>
+      </w:r>
+      <w:r>
+        <w:rPr>
+          <w:b/>
+        </w:rPr>
+        <w:t>dibulatkan ke angka terdekat berakhiran 0</w:t>
+      </w:r>
+      <w:r>
+        <w:t xml:space="preserve"> (mis. 24°→20°, 25°→30°).</w:t>
       </w:r>
     </w:p>
     <w:p>
@@ -6938,10 +7010,28 @@
         <w:rPr>
           <w:b/>
         </w:rPr>
-        <w:t>AMA</w:t>
-      </w:r>
-      <w:r>
-        <w:t>: 4 syarat causality (lihat Poin 1).</w:t>
+        <w:t>AMA — 4 syarat causality</w:t>
+      </w:r>
+      <w:r>
+        <w:t xml:space="preserve">: (1) ada kejadian penyebab, (2) pasien memang mengalami kondisi tersebut, (3) kejadian tersebut </w:t>
+      </w:r>
+      <w:r>
+        <w:rPr>
+          <w:i/>
+        </w:rPr>
+        <w:t>dapat</w:t>
+      </w:r>
+      <w:r>
+        <w:t xml:space="preserve"> menyebabkan kondisi tersebut, (4) kejadian tersebut </w:t>
+      </w:r>
+      <w:r>
+        <w:rPr>
+          <w:i/>
+        </w:rPr>
+        <w:t>memang</w:t>
+      </w:r>
+      <w:r>
+        <w:t xml:space="preserve"> menyebabkan/berkontribusi material terhadap kondisi (dalam derajat probabilitas medis — standar legal &gt;50%, bukan standar sains &gt;95%).</w:t>
       </w:r>
     </w:p>
     <w:p>
@@ -7637,7 +7727,7 @@
         <w:t>deterrent</w:t>
       </w:r>
       <w:r>
-        <w:t xml:space="preserve"> terhadap malingering (lihat aturan 10° di Poin 4/9).</w:t>
+        <w:t xml:space="preserve"> terhadap malingering — pasien tahu Aturan 10° antara ROM aktif vs pasif akan mendeteksi usaha suboptimal, dan pengukuran diulang 3× untuk memastikan konsistensi.</w:t>
       </w:r>
     </w:p>
     <w:p>
@@ -7723,7 +7813,7 @@
         <w:t>Combined Values Chart ≠ penjumlahan aritmetik</w:t>
       </w:r>
       <w:r>
-        <w:t xml:space="preserve"> — selalu dihitung dari sisa kapasitas yang belum terpakai (lihat Poin 6).</w:t>
+        <w:t xml:space="preserve"> — selalu dihitung dari sisa kapasitas yang belum terpakai (urutkan besar→kecil, gabungkan 2 terbesar dulu, hasil digabung lagi dengan nilai berikutnya; contoh 35%+20%=48%, bukan 55%).</w:t>
       </w:r>
     </w:p>
     <w:p>
@@ -7737,7 +7827,16 @@
         <w:t>WPI (AMA) ≠ % cacat upah (Indonesia)</w:t>
       </w:r>
       <w:r>
-        <w:t xml:space="preserve"> — skala dan basis perhitungan berbeda (lihat Poin 2).</w:t>
+        <w:t xml:space="preserve"> — WPI adalah skala 0-100% representasi utuh kondisi tubuh, sedangkan % cacat fungsi Indonesia adalah skala </w:t>
+      </w:r>
+      <w:r>
+        <w:rPr>
+          <w:b/>
+        </w:rPr>
+        <w:t>upah</w:t>
+      </w:r>
+      <w:r>
+        <w:t xml:space="preserve"> untuk santunan yang dibatasi maksimal 70% (Permenaker 5/2021 Pasal 84) — dua basis perhitungan yang berbeda, tidak bisa dipertukarkan langsung.</w:t>
       </w:r>
     </w:p>
     <w:p>
@@ -7866,7 +7965,7 @@
         <w:t>Strategi "Informed Consent" defensif</w:t>
       </w:r>
       <w:r>
-        <w:t>: hadapi pasien agresif yang menuntut persentase kecacatan sebesar-besarnya dengan kontrak komunikasi tegas di awal pemeriksaan (lihat Poin 12/Lafaz).</w:t>
+        <w:t>: hadapi pasien agresif yang menuntut persentase kecacatan sebesar-besarnya dengan kontrak komunikasi tegas di awal pemeriksaan — tegaskan peran sebagai pemeriksa independen (bukan penentu santunan), sampaikan bahwa rekayasa/symptom magnification akan gugur saat diuji alat objektif, dan minta persetujuan eksplisit pasien untuk diperiksa jujur sebelum pemeriksaan fisik dimulai, dan edukasi konsep MMI di awal agar pasien tidak menekan dokter untuk "cepat-cepat tutup kasus".</w:t>
       </w:r>
     </w:p>
     <w:p>

</xml_diff>

<commit_message>
Integrate new clarification points into Catatan Kecacatan notes
Adds 11 clarifications across existing sections (ICIDH/WHO origin,
impairment-vs-disability philosophy, Anatomis/Fungsi/HKKF decision rule,
DBI-to-HKKF harmonization with CTS worked example, Ischialgia HKKF-final
vs Paru ceiling-70% distinction with VEP1 worked example, Kalkulasi
formula table, Mata 3-component structure with corrected combining
rules, ASN/TNI-Polri linear-cap-100% contrast, KK3B form authority,
and a new No-Fault Liability/APD negligence subsection) rather than
appending a new section, per each point's natural fit in the outline.

Co-Authored-By: Claude Sonnet 5 <noreply@anthropic.com>
Claude-Session: https://claude.ai/code/session_0188Jk5YW9RwgMp58noMst3d
</commit_message>
<xml_diff>
--- a/PPDS Okupasi Board Notes/Catatan Kecacatan (AMA + Permenaker) Gabungan.docx
+++ b/PPDS Okupasi Board Notes/Catatan Kecacatan (AMA + Permenaker) Gabungan.docx
@@ -260,6 +260,43 @@
       </w:r>
       <w:r>
         <w:t xml:space="preserve"> (istilah "handicap" tak dipakai eksplisit dalam regulasi Indonesia tapi logikanya dipakai).</w:t>
+      </w:r>
+    </w:p>
+    <w:p>
+      <w:pPr>
+        <w:pStyle w:val="ListBullet"/>
+      </w:pPr>
+      <w:r>
+        <w:rPr>
+          <w:b/>
+        </w:rPr>
+        <w:t xml:space="preserve">ICIDH (International Classification of Impairments, Disabilities, and Handicaps): </w:t>
+      </w:r>
+      <w:r>
+        <w:t xml:space="preserve">kerangka WHO 1980 yang linear-medis — Penyakit → Impairment → Disability → Handicap. Sudah digantikan oleh </w:t>
+      </w:r>
+      <w:r>
+        <w:rPr>
+          <w:b/>
+        </w:rPr>
+        <w:t>ICF (2001)</w:t>
+      </w:r>
+      <w:r>
+        <w:t xml:space="preserve"> yang biopsikososial, tapi logika ICIDH masih dipakai dalam regulasi Indonesia.</w:t>
+      </w:r>
+    </w:p>
+    <w:p>
+      <w:pPr>
+        <w:pStyle w:val="ListBullet"/>
+      </w:pPr>
+      <w:r>
+        <w:rPr>
+          <w:b/>
+        </w:rPr>
+        <w:t xml:space="preserve">Jebakan istilah lintas-domain: </w:t>
+      </w:r>
+      <w:r>
+        <w:t>makna "disability"/"handicap" di kerangka WHO bersifat deskriptif-fungsional universal untuk semua kondisi kesehatan (bukan spesifik kerja). Di ranah okupasi/kompensasi kerja, istilah yang sama dipakai dengan makna hukum-administratif berbeda: disability dikaitkan dengan kemampuan kerja pada pekerjaan tertentu (bukan kemampuan hidup umum), dan penentuannya bukan wewenang dokter (dokter hanya menilai impairment) melainkan badan penjamin/Dokter Penasehat berdasarkan konteks pekerjaan spesifik pasien. Kerangka konseptualnya sama (WHO), tapi aplikasi &amp; otoritas penentu berbeda antara ranah kesehatan umum vs ranah kompensasi kerja.</w:t>
       </w:r>
     </w:p>
     <w:p>
@@ -722,6 +759,20 @@
         <w:rPr>
           <w:b/>
         </w:rPr>
+        <w:t xml:space="preserve">Bukan sekadar konvensi Indonesia: </w:t>
+      </w:r>
+      <w:r>
+        <w:t>pembagian peran impairment (dokter) vs disability (badan penjamin/Dokter Penasehat) melekat pada filosofi dasar AMA Guides sendiri; Permenaker 25/2008 mewarisi pembagian peran yang sama dari sistem internasional tersebut, bukan aturan yang dibuat sendiri oleh regulasi nasional.</w:t>
+      </w:r>
+    </w:p>
+    <w:p>
+      <w:pPr>
+        <w:pStyle w:val="ListBullet"/>
+      </w:pPr>
+      <w:r>
+        <w:rPr>
+          <w:b/>
+        </w:rPr>
         <w:t>WPI (AMA)</w:t>
       </w:r>
       <w:r>
@@ -1019,19 +1070,37 @@
         <w:rPr>
           <w:b/>
         </w:rPr>
-        <w:t>Batas proksimal jari (PIP)</w:t>
-      </w:r>
-      <w:r>
-        <w:t xml:space="preserve">: amputasi melewati sendi </w:t>
-      </w:r>
-      <w:r>
-        <w:rPr>
-          <w:i/>
-        </w:rPr>
-        <w:t>proximal interphalangeal</w:t>
-      </w:r>
-      <w:r>
-        <w:t xml:space="preserve"> (PIP) → cacat anatomis satu jari penuh. Amputasi distal dari PIP → umumnya cacat sebagian fungsi.</w:t>
+        <w:t xml:space="preserve">Aturan penentuan Anatomis vs Fungsi vs HKKF: </w:t>
+      </w:r>
+      <w:r>
+        <w:t xml:space="preserve">kerusakan organ/segmen masuk </w:t>
+      </w:r>
+      <w:r>
+        <w:rPr>
+          <w:b/>
+        </w:rPr>
+        <w:t>Cacat Sebagian Anatomis</w:t>
+      </w:r>
+      <w:r>
+        <w:t xml:space="preserve"> hanya jika (a) organ/segmen tercantum di tabel anatomis (Lampiran III PP 44/2015 — jari, tangan, kaki, dll.) DAN (b) hilang total secara fisik. Jika organ tidak tercantum di tabel ATAU fungsinya berkurang tanpa kehilangan fisik, kasus masuk </w:t>
+      </w:r>
+      <w:r>
+        <w:rPr>
+          <w:b/>
+        </w:rPr>
+        <w:t>Cacat Sebagian Fungsi</w:t>
+      </w:r>
+      <w:r>
+        <w:t xml:space="preserve">; bila organ tersebut sama sekali tidak punya baris di tabel anatomis, penilaiannya dialihkan ke kategori sistemik </w:t>
+      </w:r>
+      <w:r>
+        <w:rPr>
+          <w:b/>
+        </w:rPr>
+        <w:t>Hilangnya Kemampuan Kerja Fisik (HKKF)</w:t>
+      </w:r>
+      <w:r>
+        <w:t>.</w:t>
       </w:r>
     </w:p>
     <w:p>
@@ -1042,41 +1111,41 @@
         <w:rPr>
           <w:b/>
         </w:rPr>
-        <w:t>Aturan 5 jari</w:t>
-      </w:r>
-      <w:r>
-        <w:t xml:space="preserve"> untuk klaim "tangan" (BPJS-TK): seluruh 5 jari harus cacat agar dapat diklaim sebagai satu segmen "pergelangan tangan ke bawah"; jika kurang dari 5 jari, wajib dilaporkan segmental per jari.</w:t>
+        <w:t>Batas proksimal jari (PIP)</w:t>
+      </w:r>
+      <w:r>
+        <w:t xml:space="preserve">: amputasi melewati sendi </w:t>
+      </w:r>
+      <w:r>
+        <w:rPr>
+          <w:i/>
+        </w:rPr>
+        <w:t>proximal interphalangeal</w:t>
+      </w:r>
+      <w:r>
+        <w:t xml:space="preserve"> (PIP) → cacat anatomis satu jari penuh. Amputasi distal dari PIP → umumnya cacat sebagian fungsi.</w:t>
       </w:r>
     </w:p>
     <w:p>
       <w:pPr>
-        <w:pStyle w:val="Heading1"/>
-      </w:pPr>
-      <w:r>
-        <w:t>3. Kapan Dilakukan, Tujuan Okupasi</w:t>
+        <w:pStyle w:val="ListBullet"/>
+      </w:pPr>
+      <w:r>
+        <w:rPr>
+          <w:b/>
+        </w:rPr>
+        <w:t>Aturan 5 jari</w:t>
+      </w:r>
+      <w:r>
+        <w:t xml:space="preserve"> untuk klaim "tangan" (BPJS-TK): seluruh 5 jari harus cacat agar dapat diklaim sebagai satu segmen "pergelangan tangan ke bawah"; jika kurang dari 5 jari, wajib dilaporkan segmental per jari.</w:t>
       </w:r>
     </w:p>
     <w:p>
       <w:pPr>
-        <w:pStyle w:val="ListBullet"/>
-      </w:pPr>
-      <w:r>
-        <w:rPr>
-          <w:b/>
-        </w:rPr>
-        <w:t>Trigger</w:t>
-      </w:r>
-      <w:r>
-        <w:t xml:space="preserve">: pasca-KK/PAK, saat </w:t>
-      </w:r>
-      <w:r>
-        <w:rPr>
-          <w:b/>
-        </w:rPr>
-        <w:t>MMI (Maximum Medical Improvement)</w:t>
-      </w:r>
-      <w:r>
-        <w:t xml:space="preserve"> tercapai — bukan sebelum. Penilaian kecacatan tidak boleh dilakukan tergesa-gesa dalam satu kali pertemuan.</w:t>
+        <w:pStyle w:val="Heading1"/>
+      </w:pPr>
+      <w:r>
+        <w:t>3. Kapan Dilakukan, Tujuan Okupasi</w:t>
       </w:r>
     </w:p>
     <w:p>
@@ -1087,10 +1156,19 @@
         <w:rPr>
           <w:b/>
         </w:rPr>
-        <w:t>Tujuan</w:t>
-      </w:r>
-      <w:r>
-        <w:t>: menentukan hak santunan, status Return to Work (RTW), kelaikan kerja lanjutan, dasar Form KK3B.</w:t>
+        <w:t>Trigger</w:t>
+      </w:r>
+      <w:r>
+        <w:t xml:space="preserve">: pasca-KK/PAK, saat </w:t>
+      </w:r>
+      <w:r>
+        <w:rPr>
+          <w:b/>
+        </w:rPr>
+        <w:t>MMI (Maximum Medical Improvement)</w:t>
+      </w:r>
+      <w:r>
+        <w:t xml:space="preserve"> tercapai — bukan sebelum. Penilaian kecacatan tidak boleh dilakukan tergesa-gesa dalam satu kali pertemuan.</w:t>
       </w:r>
     </w:p>
     <w:p>
@@ -1098,16 +1176,13 @@
         <w:pStyle w:val="ListBullet"/>
       </w:pPr>
       <w:r>
-        <w:t xml:space="preserve">AMA: MMI juga konsep sentral di </w:t>
-      </w:r>
-      <w:r>
-        <w:rPr>
-          <w:b/>
-        </w:rPr>
-        <w:t>Bab 14 (Psikiatri)</w:t>
-      </w:r>
-      <w:r>
-        <w:t xml:space="preserve"> — kondisi jiwa perlu MMI eksplisit sebelum rating.</w:t>
+        <w:rPr>
+          <w:b/>
+        </w:rPr>
+        <w:t>Tujuan</w:t>
+      </w:r>
+      <w:r>
+        <w:t>: menentukan hak santunan, status Return to Work (RTW), kelaikan kerja lanjutan, dasar Form KK3B.</w:t>
       </w:r>
     </w:p>
     <w:p>
@@ -1115,26 +1190,43 @@
         <w:pStyle w:val="ListBullet"/>
       </w:pPr>
       <w:r>
-        <w:rPr>
-          <w:b/>
-        </w:rPr>
-        <w:t>Kapan tunda penilaian</w:t>
-      </w:r>
-      <w:r>
-        <w:t xml:space="preserve"> — contoh neuroma stump: wajib observasi fisioterapi </w:t>
-      </w:r>
-      <w:r>
-        <w:rPr>
-          <w:b/>
-        </w:rPr>
-        <w:t>minimal 1 bulan</w:t>
-      </w:r>
-      <w:r>
-        <w:t xml:space="preserve"> tanpa perbaikan klinis sebelum MMI dinyatakan; pasien tidak boleh ditutup kasusnya selagi masih nyeri hebat.</w:t>
+        <w:t xml:space="preserve">AMA: MMI juga konsep sentral di </w:t>
+      </w:r>
+      <w:r>
+        <w:rPr>
+          <w:b/>
+        </w:rPr>
+        <w:t>Bab 14 (Psikiatri)</w:t>
+      </w:r>
+      <w:r>
+        <w:t xml:space="preserve"> — kondisi jiwa perlu MMI eksplisit sebelum rating.</w:t>
       </w:r>
     </w:p>
     <w:p>
       <w:pPr>
+        <w:pStyle w:val="ListBullet"/>
+      </w:pPr>
+      <w:r>
+        <w:rPr>
+          <w:b/>
+        </w:rPr>
+        <w:t>Kapan tunda penilaian</w:t>
+      </w:r>
+      <w:r>
+        <w:t xml:space="preserve"> — contoh neuroma stump: wajib observasi fisioterapi </w:t>
+      </w:r>
+      <w:r>
+        <w:rPr>
+          <w:b/>
+        </w:rPr>
+        <w:t>minimal 1 bulan</w:t>
+      </w:r>
+      <w:r>
+        <w:t xml:space="preserve"> tanpa perbaikan klinis sebelum MMI dinyatakan; pasien tidak boleh ditutup kasusnya selagi masih nyeri hebat.</w:t>
+      </w:r>
+    </w:p>
+    <w:p>
+      <w:pPr>
         <w:ind w:left="340"/>
       </w:pPr>
       <w:r>
@@ -1628,6 +1720,57 @@
       </w:r>
       <w:r>
         <w:t>.</w:t>
+      </w:r>
+    </w:p>
+    <w:p>
+      <w:pPr/>
+      <w:r>
+        <w:rPr>
+          <w:b/>
+        </w:rPr>
+        <w:t xml:space="preserve">Harmonisasi DBI ke pita HKKF: </w:t>
+      </w:r>
+      <w:r>
+        <w:t xml:space="preserve">penggolongan awal ke pita Hilangnya Kemampuan Kerja Fisik (HKKF) Indonesia didasarkan murni pada derajat keparahan klinis biologis (impairment) hasil DBI di atas. Ini bukan kontradiksi terhadap prinsip impairment vs disability, melainkan bentuk </w:t>
+      </w:r>
+      <w:r>
+        <w:rPr>
+          <w:b/>
+        </w:rPr>
+        <w:t>harmonisasi paksa (bridging)</w:t>
+      </w:r>
+      <w:r>
+        <w:t xml:space="preserve"> antara sistem internasional (AMA Guides, murni mengukur impairment) dan sistem hukum Indonesia (PP 44/2015, memakai istilah HKKF). Dokter Sp.Ok tetap hanya mengukur keparahan klinis secara konstan; dalam praktik, dokter berwenang memberi justifikasi kenaikan persentase di dalam rentang pita HKKF (atau menaikkan kelas kelaikan kerja di Form KK3B nomor 11) apabila evaluasi kelaikan kerja menunjukkan pasien Fit with Note atau Unfit terhadap tuntutan pekerjaan spesifiknya — tetap berbasis temuan klinis-fungsional, bukan penilaian disability tersendiri.</w:t>
+      </w:r>
+    </w:p>
+    <w:p>
+      <w:pPr/>
+      <w:r>
+        <w:rPr>
+          <w:b/>
+        </w:rPr>
+        <w:t xml:space="preserve">Contoh (CTS akibat kerja, operator perakitan elektronik tangan kanan dominan, bilateral): </w:t>
+      </w:r>
+      <w:r>
+        <w:t xml:space="preserve">Table 15-23 (Entrapment Neuropathy) → Kelas 1 (Ringan), default 6% UEI. GMCS (EMG: prolongasi latensi sensorik-motorik) = +2; GMPE (atrofi tenar ringan) = +1; GMFH (hambatan menulis/menggenggam) = +1. Net Adjustment = (1−1)+(2−1) = +1 → </w:t>
+      </w:r>
+      <w:r>
+        <w:rPr>
+          <w:b/>
+        </w:rPr>
+        <w:t>Grade D → 8% UEI → dikonversi 5% WPI</w:t>
+      </w:r>
+      <w:r>
+        <w:t xml:space="preserve">. Nilai 5% WPI dipetakan ke pita HKKF nasional: pita 10–25% HKKF = santunan 5% dari upah → pasien ditetapkan </w:t>
+      </w:r>
+      <w:r>
+        <w:rPr>
+          <w:b/>
+        </w:rPr>
+        <w:t>HKKF 20%</w:t>
+      </w:r>
+      <w:r>
+        <w:t xml:space="preserve"> (di dalam pita 10–25%), memberi hak santunan 5% dari upah. Penilaian ini murni objektif-klinis; jika tuntutan kerja pasien sangat tinggi (mis. presisi mikro-elektronik) dan dokter menyatakan Unfit, dokter dapat menambahkan catatan medikolegal untuk mendukung Return to Work atau penyesuaian kerja — bukan mengubah angka impairment.</w:t>
       </w:r>
     </w:p>
     <w:p>
@@ -4200,6 +4343,36 @@
         <w:t xml:space="preserve"> meninggal ≤24 jam. Saraf kranial lintas-bidang: N.I→Mata, N.VIII→THT, N.IX-X→Orthopaedi (jebakan soal umum).</w:t>
       </w:r>
     </w:p>
+    <w:p>
+      <w:pPr/>
+      <w:r>
+        <w:rPr>
+          <w:b/>
+        </w:rPr>
+        <w:t xml:space="preserve">Catatan HKKF final (Ischialgia/Brachialgia): </w:t>
+      </w:r>
+      <w:r>
+        <w:t xml:space="preserve">nilai santunan 40% (atau 20%) di atas diambil langsung dari kolom "% X Upah" pada baris tabel resmi Lampiran III PP 44/2015, sehingga sudah bersifat </w:t>
+      </w:r>
+      <w:r>
+        <w:rPr>
+          <w:b/>
+        </w:rPr>
+        <w:t>FINAL</w:t>
+      </w:r>
+      <w:r>
+        <w:t xml:space="preserve"> — tidak boleh dikalikan lagi dengan ceiling organ dalam/sistemik 70%. Ini berbeda dari organ sistemik yang tidak punya baris tabel sendiri (mis. Paru), yang wajib dikali ceiling 70% dahulu sebelum masuk rumus 80×Upah karena nilai impairment klinisnya belum berupa angka santunan final. Mengalikan nilai HKKF yang sudah final dengan ceiling 70% adalah kesalahan </w:t>
+      </w:r>
+      <w:r>
+        <w:rPr>
+          <w:b/>
+        </w:rPr>
+        <w:t>pemotongan ganda (double discounting)</w:t>
+      </w:r>
+      <w:r>
+        <w:t xml:space="preserve"> terhadap ketentuan yang sudah tertulis tegas di lembaran negara.</w:t>
+      </w:r>
+    </w:p>
     <w:tbl>
       <w:tblPr>
         <w:tblStyle w:val="TableGrid"/>
@@ -5727,6 +5900,27 @@
       </w:r>
     </w:p>
     <w:p>
+      <w:pPr/>
+      <w:r>
+        <w:rPr>
+          <w:b/>
+        </w:rPr>
+        <w:t xml:space="preserve">Wajib dikali ceiling sebelum masuk formula santunan: </w:t>
+      </w:r>
+      <w:r>
+        <w:t xml:space="preserve">karena Paru (dan organ sistemik dalam lainnya) tidak memiliki baris persentase segmental tersendiri di tabel santunan, persentase cacat fungsi klinis harus dikalikan dulu dengan ceiling maksimal 70% sebelum dikalikan konstanta 80×Upah Sebulan — jika tidak, nilai santunan Cacat Fungsi Paru Derajat 3 (75% impairment) bisa melebihi santunan Derajat 4 (100% impairment) yang dibatasi maksimal 70% upah, kesalahan logika matematika jaminan sosial yang fatal. Contoh (VEP1 = 0,8 L, Upah = Rp5.000.000): VEP1 0,8 L masuk Derajat 3 (Berat) → 75% cacat fungsi klinis (dinilai setelah terapi bronkodilator maksimal 3 bulan, hasil menetap). Rupiah Santunan = 75% × 70% (ceiling sistemik) × 80 × Rp5.000.000 = 0,525 × 80 × Rp5.000.000 = 42 × Rp5.000.000 = </w:t>
+      </w:r>
+      <w:r>
+        <w:rPr>
+          <w:b/>
+        </w:rPr>
+        <w:t>Rp210.000.000</w:t>
+      </w:r>
+      <w:r>
+        <w:t>.</w:t>
+      </w:r>
+    </w:p>
+    <w:p>
       <w:r>
         <w:rPr>
           <w:b/>
@@ -5761,13 +5955,76 @@
         <w:t>Formula</w:t>
       </w:r>
       <w:r>
-        <w:t xml:space="preserve">: % kehilangan tajam penglihatan = (%kehilangan visus jauh + %kehilangan visus dekat) ÷ 2, dinilai per mata lalu digabung sesuai bobot komponen (visus, lapang pandang, motilitas otot/fusi binokular — dicek dengan uji 4 sinar). </w:t>
+        <w:t xml:space="preserve">: % kehilangan tajam penglihatan = (%kehilangan visus jauh + %kehilangan visus dekat) ÷ 2, dinilai per mata sebagai 3 komponen terpisah: visus, lapang pandang, dan motilitas otot/fusi binokular (dicek dengan uji 4 sinar/Worth 4-dot). </w:t>
       </w:r>
       <w:r>
         <w:rPr>
           <w:i/>
         </w:rPr>
         <w:t>(Bandingkan dengan formula FAS/FFS/FVS→VSI→WPI AMA di §5.2 Bab 12 — filosofi sama, AMA jauh lebih presisi kuantitatif dengan faktor diskon 0,7 yang tak ada padanannya di Permenaker.)</w:t>
+      </w:r>
+    </w:p>
+    <w:p>
+      <w:pPr/>
+      <w:r>
+        <w:rPr>
+          <w:b/>
+        </w:rPr>
+        <w:t xml:space="preserve">Struktur 3 komponen: </w:t>
+      </w:r>
+      <w:r>
+        <w:t>(1) Visus (ketajaman penglihatan) — jauh &amp; dekat, per mata; (2) Lapang pandang (perimetri) — area penglihatan di luar titik fokus; (3) Motilitas otot/fusi binokular — kemampuan kedua mata bekerja sama, diperiksa dengan uji 4 sinar (Worth 4-dot) untuk menilai fusi.</w:t>
+      </w:r>
+    </w:p>
+    <w:p>
+      <w:pPr/>
+      <w:r>
+        <w:rPr>
+          <w:b/>
+        </w:rPr>
+        <w:t xml:space="preserve">Penggabungan visus + lapang pandang pada mata yang sama: </w:t>
+      </w:r>
+      <w:r>
+        <w:t>naskah asli Permenaker No. 25 Tahun 2008 Bidang Mata TIDAK memuat formula matematika resmi untuk menggabungkan penurunan visus dengan penyempitan lapang pandang pada satu mata yang sama — regulasi hanya mengatur dua formula parsial. Formula tajam penglihatan satu mata (rerata linear): % Kehilangan Visus Akhir = (% Kehilangan Visus Jauh + % Kehilangan Visus Dekat) ÷ 2. Formula efisiensi penglihatan binokular (dua mata, bobot 3:1): % Kehilangan Binokuler = [(3 × % Efisiensi Mata Terbaik) + (1 × % Efisiensi Mata Terburuk)] ÷ 4.</w:t>
+      </w:r>
+    </w:p>
+    <w:p>
+      <w:pPr/>
+      <w:r>
+        <w:rPr>
+          <w:b/>
+        </w:rPr>
+        <w:t>Tiga opsi taktis saat terjadi overlap visus+lapang pandang pada satu mata</w:t>
+      </w:r>
+      <w:r>
+        <w:t xml:space="preserve"> (mis. glaukoma sekunder pasca-trauma), karena tidak ada formula resmi: </w:t>
+      </w:r>
+      <w:r>
+        <w:rPr>
+          <w:b/>
+        </w:rPr>
+        <w:t>(1) Skala Prioritas Okupasi (job demand-based)</w:t>
+      </w:r>
+      <w:r>
+        <w:t xml:space="preserve"> — bila pekerjaan menuntut ketajaman tinggi (mis. operator mikroskop), laporkan murni persentase kehilangan visus, abaikan lapang pandang, agar tidak merugikan pasien secara medikolegal. </w:t>
+      </w:r>
+      <w:r>
+        <w:rPr>
+          <w:b/>
+        </w:rPr>
+        <w:t>(2) Rerata Linear Sederhana (50:50)</w:t>
+      </w:r>
+      <w:r>
+        <w:t xml:space="preserve"> — asumsikan kontribusi visus dan lapang pandang setara: % Cacat Fungsi Akhir = (% Kehilangan Visus + % Kehilangan Lapang Pandang) ÷ 2. </w:t>
+      </w:r>
+      <w:r>
+        <w:rPr>
+          <w:b/>
+        </w:rPr>
+        <w:t>(3) Outsourcing ke AMA Guides dengan capping nasional</w:t>
+      </w:r>
+      <w:r>
+        <w:t xml:space="preserve"> — hitung FAS (sisa fungsi visus = 100 − %impairment visus) dan FFS (sisa fungsi lapang pandang = 100 − %impairment lapang pandang), lalu FVS = (FAS × FFS) ÷ 100 dan % Impairment Visual = 100 − FVS; hasil akhir tetap dibatasi ceiling satu mata Indonesia maksimal 35% upah (Lampiran III PP 44/2015). Contoh: kehilangan visus 20% (FAS=80) dan lapang pandang 25% (FFS=75) → FVS = (80×75)/100 = 60 → Impairment Visual = 40%, dikonversi ke nilai santunan mata lalu dibatasi maksimal 35% upah.</w:t>
       </w:r>
     </w:p>
     <w:p>
@@ -6073,6 +6330,108 @@
       </w:pPr>
       <w:r>
         <w:t>Cacat Sebagian Fungsi = % berkurangnya fungsi × % sesuai tabel × 80 × Upah Sebulan</w:t>
+      </w:r>
+    </w:p>
+    <w:p>
+      <w:pPr>
+        <w:pStyle w:val="ListBullet2"/>
+      </w:pPr>
+      <w:r>
+        <w:rPr>
+          <w:b/>
+        </w:rPr>
+        <w:t>Sumber % tabel berbeda tergantung jenis kasus — jangan tertukar:</w:t>
+      </w:r>
+    </w:p>
+    <w:tbl>
+      <w:tblPr>
+        <w:tblStyle w:val="TableGrid"/>
+        <w:tblW w:type="auto" w:w="0"/>
+        <w:tblLook w:firstColumn="1" w:firstRow="1" w:lastColumn="0" w:lastRow="0" w:noHBand="0" w:noVBand="1" w:val="04A0"/>
+      </w:tblPr>
+      <w:tblGrid>
+        <w:gridCol w:w="4320"/>
+        <w:gridCol w:w="4320"/>
+      </w:tblGrid>
+      <w:tr>
+        <w:tc>
+          <w:tcPr>
+            <w:tcW w:type="dxa" w:w="4320"/>
+          </w:tcPr>
+          <w:p>
+            <w:r>
+              <w:t>Jenis Kasus</w:t>
+            </w:r>
+          </w:p>
+        </w:tc>
+        <w:tc>
+          <w:tcPr>
+            <w:tcW w:type="dxa" w:w="4320"/>
+          </w:tcPr>
+          <w:p>
+            <w:r>
+              <w:t>Formula</w:t>
+            </w:r>
+          </w:p>
+        </w:tc>
+      </w:tr>
+      <w:tr>
+        <w:tc>
+          <w:tcPr>
+            <w:tcW w:type="dxa" w:w="4320"/>
+          </w:tcPr>
+          <w:p>
+            <w:r>
+              <w:t>Segmen anatomis spesifik (ROM jari/sendi tertentu)</w:t>
+            </w:r>
+          </w:p>
+        </w:tc>
+        <w:tc>
+          <w:tcPr>
+            <w:tcW w:type="dxa" w:w="4320"/>
+          </w:tcPr>
+          <w:p>
+            <w:r>
+              <w:t>% fungsi × % tabel Lampiran III segmen × 80 × Upah</w:t>
+            </w:r>
+          </w:p>
+        </w:tc>
+      </w:tr>
+      <w:tr>
+        <w:tc>
+          <w:tcPr>
+            <w:tcW w:type="dxa" w:w="4320"/>
+          </w:tcPr>
+          <w:p>
+            <w:r>
+              <w:t>Kondisi sistemik/fungsional bertabel HKKF (mis. Ischialgia, Brachialgia — tanpa organ fisik bertabel)</w:t>
+            </w:r>
+          </w:p>
+        </w:tc>
+        <w:tc>
+          <w:tcPr>
+            <w:tcW w:type="dxa" w:w="4320"/>
+          </w:tcPr>
+          <w:p>
+            <w:r>
+              <w:t>% santunan (langsung dari tabel HKKF, sudah final) × 80 × Upah — tanpa perkalian ceiling tambahan</w:t>
+            </w:r>
+          </w:p>
+        </w:tc>
+      </w:tr>
+    </w:tbl>
+    <w:p>
+      <w:pPr>
+        <w:pStyle w:val="ListBullet2"/>
+      </w:pPr>
+      <w:r>
+        <w:rPr>
+          <w:b/>
+        </w:rPr>
+        <w:t xml:space="preserve">Kasus ketiga — organ sistemik tanpa baris tabel sama sekali (mis. Paru): </w:t>
+      </w:r>
+      <w:r>
+        <w:t>dikalikan ceiling maksimal 70% terlebih dahulu (prinsip "cacat fungsi 100% = 70% dari upah") sebelum masuk rumus — berbeda dari kondisi HKKF di atas yang sudah punya baris tabel final, organ jenis ini belum punya angka santunan final sampai dikali ceiling.</w:t>
       </w:r>
     </w:p>
     <w:p>
@@ -6509,10 +6868,16 @@
     </w:p>
     <w:p>
       <w:pPr>
-        <w:pStyle w:val="Heading1"/>
-      </w:pPr>
-      <w:r>
-        <w:t>8. Tatalaksana &amp; Rekomendasi</w:t>
+        <w:pStyle w:val="ListBullet"/>
+      </w:pPr>
+      <w:r>
+        <w:rPr>
+          <w:b/>
+        </w:rPr>
+        <w:t xml:space="preserve">BPJS-TK — capping akumulasi multipel: </w:t>
+      </w:r>
+      <w:r>
+        <w:t>berdasarkan Permenaker No. 5/2021 Pasal 84 ayat (1), akumulasi akhir pembayaran santunan untuk kasus Cacat Sebagian (Anatomis/Fungsi) majemuk dibatasi maksimal 70%. Dokter tetap melaporkan tiap segmen secara terpisah dan mandiri di Form KK3B — dilarang menggabungkan sendiri jadi satu angka tunggal (mis. mata katarak + jari putus TIDAK boleh dihitung jadi satu persentase); BPJS-TK yang melakukan verifikasi &amp; capping administratif akhir.</w:t>
       </w:r>
     </w:p>
     <w:p>
@@ -6523,26 +6888,41 @@
         <w:rPr>
           <w:b/>
         </w:rPr>
-        <w:t>Hirarki Return to Work Mehrhoff (DGUV 2013)</w:t>
-      </w:r>
-      <w:r>
-        <w:t>, 6 tingkat dari paling ideal ke alternatif terakhir:</w:t>
+        <w:t xml:space="preserve">Kontras ASN &amp; TNI-Polri: </w:t>
+      </w:r>
+      <w:r>
+        <w:t xml:space="preserve">berbeda dari swasta (BPJS-TK) yang tidak mengenal rumus penggabungan logaritmik/CVC formal, Peraturan BKN No. 4/2020 Pasal 22 ayat (3) memerintahkan penjumlahan aritmetika linear biasa bila terjadi beberapa cacat, dibatasi maksimal 100% dari gaji terakhir. Contoh (Lampiran VIII BKN 4/2020): PNS kehilangan fungsi penglihatan kedua mata (nilai tabel 70%) + kehilangan lengan kanan dari sendi bahu (nilai tabel 50%) → 70%+50%=120%, dibatasi maksimal 100% → tunjangan cacat bulanan ditetapkan </w:t>
+      </w:r>
+      <w:r>
+        <w:rPr>
+          <w:b/>
+        </w:rPr>
+        <w:t>100% dari gaji terakhir, bukan 120%</w:t>
+      </w:r>
+      <w:r>
+        <w:t>. Aturan TNI-Polri (PP 102/2015 jo. PP 54/2020, ASABRI) serupa: santunan cacat majemuk dibatasi tarif maksimal tingkat kepesertaannya (mis. Golongan C maksimal 61,6× Gaji).</w:t>
       </w:r>
     </w:p>
     <w:p>
       <w:pPr>
-        <w:pStyle w:val="ListNumber"/>
-      </w:pPr>
-      <w:r>
-        <w:t>Pekerjaan Sama – Perusahaan Sama</w:t>
+        <w:pStyle w:val="Heading1"/>
+      </w:pPr>
+      <w:r>
+        <w:t>8. Tatalaksana &amp; Rekomendasi</w:t>
       </w:r>
     </w:p>
     <w:p>
       <w:pPr>
-        <w:pStyle w:val="ListNumber"/>
-      </w:pPr>
-      <w:r>
-        <w:t>Pekerjaan Serupa – Perusahaan Sama</w:t>
+        <w:pStyle w:val="ListBullet"/>
+      </w:pPr>
+      <w:r>
+        <w:rPr>
+          <w:b/>
+        </w:rPr>
+        <w:t>Hirarki Return to Work Mehrhoff (DGUV 2013)</w:t>
+      </w:r>
+      <w:r>
+        <w:t>, 6 tingkat dari paling ideal ke alternatif terakhir:</w:t>
       </w:r>
     </w:p>
     <w:p>
@@ -6550,7 +6930,7 @@
         <w:pStyle w:val="ListNumber"/>
       </w:pPr>
       <w:r>
-        <w:t>Pekerjaan Berbeda – Perusahaan Sama</w:t>
+        <w:t>Pekerjaan Sama – Perusahaan Sama</w:t>
       </w:r>
     </w:p>
     <w:p>
@@ -6558,7 +6938,7 @@
         <w:pStyle w:val="ListNumber"/>
       </w:pPr>
       <w:r>
-        <w:t>Pekerjaan Sama – Perusahaan Berbeda</w:t>
+        <w:t>Pekerjaan Serupa – Perusahaan Sama</w:t>
       </w:r>
     </w:p>
     <w:p>
@@ -6566,7 +6946,7 @@
         <w:pStyle w:val="ListNumber"/>
       </w:pPr>
       <w:r>
-        <w:t>Pekerjaan Serupa – Perusahaan Berbeda</w:t>
+        <w:t>Pekerjaan Berbeda – Perusahaan Sama</w:t>
       </w:r>
     </w:p>
     <w:p>
@@ -6574,44 +6954,23 @@
         <w:pStyle w:val="ListNumber"/>
       </w:pPr>
       <w:r>
-        <w:t>Pekerjaan Berbeda – Perusahaan Berbeda (alternatif terakhir)</w:t>
+        <w:t>Pekerjaan Sama – Perusahaan Berbeda</w:t>
       </w:r>
     </w:p>
     <w:p>
       <w:pPr>
-        <w:pStyle w:val="ListBullet"/>
-      </w:pPr>
-      <w:r>
-        <w:rPr>
-          <w:b/>
-        </w:rPr>
-        <w:t>Larangan PHK Absolut</w:t>
-      </w:r>
-      <w:r>
-        <w:t xml:space="preserve"> (UU 13/2003 jo. PP 44/2015): pengusaha dilarang keras PHK pekerja dengan cacat total tetap, atau sakit akibat KK/hubungan kerja yang masa sembuhnya </w:t>
-      </w:r>
-      <w:r>
-        <w:rPr>
-          <w:b/>
-        </w:rPr>
-        <w:t>belum dapat dipastikan</w:t>
-      </w:r>
-      <w:r>
-        <w:t>.</w:t>
+        <w:pStyle w:val="ListNumber"/>
+      </w:pPr>
+      <w:r>
+        <w:t>Pekerjaan Serupa – Perusahaan Berbeda</w:t>
       </w:r>
     </w:p>
     <w:p>
       <w:pPr>
-        <w:pStyle w:val="ListBullet"/>
-      </w:pPr>
-      <w:r>
-        <w:rPr>
-          <w:b/>
-        </w:rPr>
-        <w:t>Kapan "Tutup Pengobatan" administratif</w:t>
-      </w:r>
-      <w:r>
-        <w:t xml:space="preserve"> vs lanjut observasi: bila pasien membesar-besarkan gejala tanpa bukti objektif pendukung (mis. mengaku buta padahal slit lamp normal), dokter tidak perlu berdebat soal persentase — tutup kasus administratif sebagai "Tutup Pengobatan"; laporan medis tetap ditulis objektif (sembuh tanpa cacat).</w:t>
+        <w:pStyle w:val="ListNumber"/>
+      </w:pPr>
+      <w:r>
+        <w:t>Pekerjaan Berbeda – Perusahaan Berbeda (alternatif terakhir)</w:t>
       </w:r>
     </w:p>
     <w:p>
@@ -6622,22 +6981,59 @@
         <w:rPr>
           <w:b/>
         </w:rPr>
-        <w:t>Contoh nyata case manager</w:t>
-      </w:r>
-      <w:r>
-        <w:t xml:space="preserve"> (Ny. E, PT U): cedera terjepit mesin press kerah baju (5 Mei 2014). Setelah pendampingan Case Manager JKK-RTW, berhasil dikembalikan bekerja di unit lain (unit lobang kancing, bukan unit lama) — sesuai tingkatan hirarki Mehrhoff.</w:t>
+        <w:t>Larangan PHK Absolut</w:t>
+      </w:r>
+      <w:r>
+        <w:t xml:space="preserve"> (UU 13/2003 jo. PP 44/2015): pengusaha dilarang keras PHK pekerja dengan cacat total tetap, atau sakit akibat KK/hubungan kerja yang masa sembuhnya </w:t>
+      </w:r>
+      <w:r>
+        <w:rPr>
+          <w:b/>
+        </w:rPr>
+        <w:t>belum dapat dipastikan</w:t>
+      </w:r>
+      <w:r>
+        <w:t>.</w:t>
       </w:r>
     </w:p>
     <w:p>
       <w:pPr>
-        <w:pStyle w:val="Heading1"/>
-      </w:pPr>
-      <w:r>
-        <w:t>9. Perbandingan Longitudinal</w:t>
+        <w:pStyle w:val="ListBullet"/>
+      </w:pPr>
+      <w:r>
+        <w:rPr>
+          <w:b/>
+        </w:rPr>
+        <w:t>Kapan "Tutup Pengobatan" administratif</w:t>
+      </w:r>
+      <w:r>
+        <w:t xml:space="preserve"> vs lanjut observasi: bila pasien membesar-besarkan gejala tanpa bukti objektif pendukung (mis. mengaku buta padahal slit lamp normal), dokter tidak perlu berdebat soal persentase — tutup kasus administratif sebagai "Tutup Pengobatan"; laporan medis tetap ditulis objektif (sembuh tanpa cacat).</w:t>
       </w:r>
     </w:p>
     <w:p>
       <w:pPr>
+        <w:pStyle w:val="ListBullet"/>
+      </w:pPr>
+      <w:r>
+        <w:rPr>
+          <w:b/>
+        </w:rPr>
+        <w:t>Contoh nyata case manager</w:t>
+      </w:r>
+      <w:r>
+        <w:t xml:space="preserve"> (Ny. E, PT U): cedera terjepit mesin press kerah baju (5 Mei 2014). Setelah pendampingan Case Manager JKK-RTW, berhasil dikembalikan bekerja di unit lain (unit lobang kancing, bukan unit lama) — sesuai tingkatan hirarki Mehrhoff.</w:t>
+      </w:r>
+    </w:p>
+    <w:p>
+      <w:pPr>
+        <w:pStyle w:val="Heading1"/>
+      </w:pPr>
+      <w:r>
+        <w:t>9. Perbandingan Longitudinal</w:t>
+      </w:r>
+    </w:p>
+    <w:p>
+      <w:pPr>
         <w:ind w:left="340"/>
       </w:pPr>
       <w:r>
@@ -7410,10 +7806,98 @@
         <w:rPr>
           <w:b/>
         </w:rPr>
+        <w:t xml:space="preserve">Otoritas Form KK3B (nomor 10 vs nomor 11): </w:t>
+      </w:r>
+      <w:r>
+        <w:t>dokter pemeriksa pertama hanya berwenang mencentang kategori Cacat Sebagian Anatomis atau Cacat Sebagian Fungsi di nomor 10 — tidak ada kolom centang "Cacat Total Tetap" di bagian ini. Untuk kerusakan fungsi masif (mis. kebutaan, amputasi ganda), dokter mencentang [ ] Tidak dapat bekerja di nomor 11 (Kelaikan Kerja). Status yuridis "Cacat Total Tetap" baru ditetapkan lewat Surat Keputusan Dokter Penasihat (Permenaker No. 5 Tahun 2021 &amp; Permenaker No. 1 Tahun 2025 Pasal 1), setelah meninjau Form KK3B dan rekam medis dokter pemeriksa.</w:t>
+      </w:r>
+    </w:p>
+    <w:p>
+      <w:pPr>
+        <w:pStyle w:val="ListBullet"/>
+      </w:pPr>
+      <w:r>
+        <w:rPr>
+          <w:b/>
+        </w:rPr>
         <w:t>Kelalaian stempel basah perusahaan</w:t>
       </w:r>
       <w:r>
         <w:t xml:space="preserve"> pada formulir Tahap I sering menunda verifikasi eligibilitas.</w:t>
+      </w:r>
+    </w:p>
+    <w:p>
+      <w:pPr>
+        <w:pStyle w:val="Heading2"/>
+      </w:pPr>
+      <w:r>
+        <w:t>Kelalaian (Negligence) &amp; APD dalam JKK — Prinsip No-Fault Liability</w:t>
+      </w:r>
+    </w:p>
+    <w:p>
+      <w:pPr/>
+      <w:r>
+        <w:t xml:space="preserve">Pertanyaan medikolegal klasik: jika pekerja tuli karena tidak memakai earplug yang disediakan, atau sebaliknya perusahaan tidak menyediakan earplug, apakah JKK tetap menjamin? Jawaban mutlak: tetap ditanggung sepenuhnya oleh BPJS Ketenagakerjaan, dan santunan </w:t>
+      </w:r>
+      <w:r>
+        <w:rPr>
+          <w:b/>
+        </w:rPr>
+        <w:t>TIDAK BOLEH dikurangi atau digugurkan</w:t>
+      </w:r>
+      <w:r>
+        <w:t>.</w:t>
+      </w:r>
+    </w:p>
+    <w:p>
+      <w:pPr>
+        <w:pStyle w:val="ListBullet"/>
+      </w:pPr>
+      <w:r>
+        <w:rPr>
+          <w:b/>
+        </w:rPr>
+        <w:t xml:space="preserve">Prinsip No-Fault Liability (Risque Professionnel): </w:t>
+      </w:r>
+      <w:r>
+        <w:t>ditegaskan Penjelasan Umum PP No. 44 Tahun 2015 — risiko kecelakaan dalam menjalankan pekerjaan adalah tanggung jawab Pemberi Kerja, sehingga pekerja yang tidak mampu bekerja akibat Kecelakaan Kerja harus tetap dijamin memperoleh hak-haknya. Hak manfaat JKK bersifat absolut begitu kasus memenuhi kriteria hubungan kerja (KK atau PAK) — kelalaian pekerja (mis. lupa/menolak memakai APD yang telah disediakan) tidak dapat dijadikan alasan BPJS Ketenagakerjaan untuk menolak klaim, mengurangi persentase, ataupun menggugurkan hak santunan.</w:t>
+      </w:r>
+    </w:p>
+    <w:p>
+      <w:pPr>
+        <w:pStyle w:val="ListBullet"/>
+      </w:pPr>
+      <w:r>
+        <w:rPr>
+          <w:b/>
+        </w:rPr>
+        <w:t xml:space="preserve">Jika perusahaan yang lalai tidak menyediakan APD layak: </w:t>
+      </w:r>
+      <w:r>
+        <w:t>pekerja tetap dijamin 100% tanpa batas biaya (unlimited) untuk pengobatan dan santunan. Perusahaan menghadapi sanksi terpisah berdasarkan UU No. 1 Tahun 1970 (Keselamatan Kerja) dan sistem SMK3 — administratif, denda, hingga pidana kurungan — namun sanksi ini tidak memengaruhi pembayaran manfaat asuransi sosial pekerja.</w:t>
+      </w:r>
+    </w:p>
+    <w:p>
+      <w:pPr>
+        <w:pStyle w:val="ListBullet"/>
+      </w:pPr>
+      <w:r>
+        <w:rPr>
+          <w:b/>
+        </w:rPr>
+        <w:t xml:space="preserve">Kontras sektor ASN/TNI-Polri: </w:t>
+      </w:r>
+      <w:r>
+        <w:t xml:space="preserve">berbeda dari BPJS-TK (PP 44/2015) yang tidak mengenal pengecualian kelalaian pekerja, penjamin ASN (PT Taspen, berdasarkan Lampiran V Peraturan BKN No. 4/2020) punya pengecualian ketat — jika PNS mengalami kecelakaan lalu lintas dalam perjalanan dinas/berangkat kerja namun terbukti melanggar lalu lintas (mis. melawan arus, menerobos lampu merah), kasus tersebut </w:t>
+      </w:r>
+      <w:r>
+        <w:rPr>
+          <w:b/>
+        </w:rPr>
+        <w:t>TIDAK memenuhi kriteria Kecelakaan Kerja dan hak JKK-nya gugur</w:t>
+      </w:r>
+      <w:r>
+        <w:t>.</w:t>
       </w:r>
     </w:p>
     <w:p>

</xml_diff>